<commit_message>
rearrange data file structure
</commit_message>
<xml_diff>
--- a/draft.docx
+++ b/draft.docx
@@ -185,11 +185,14 @@
           <w:rPr>
             <w:rStyle w:val="Hyperlink"/>
           </w:rPr>
-          <w:t>https://www.ausport.gov.au/clearinghouse/research/ausplay</w:t>
+          <w:t>https://www.ausport.gov.au/clearinghouse/research/ausplay/results</w:t>
         </w:r>
       </w:hyperlink>
       <w:r>
-        <w:t xml:space="preserve"> (AusPlay Survey)</w:t>
+        <w:t xml:space="preserve"> </w:t>
+      </w:r>
+      <w:r>
+        <w:t>(AusPlay Survey)</w:t>
       </w:r>
     </w:p>
     <w:p>
@@ -238,4362 +241,10 @@
     </w:p>
     <w:p>
       <w:r>
-        <w:br w:type="page"/>
-      </w:r>
-    </w:p>
-    <w:p>
-      <w:pPr>
-        <w:rPr>
-          <w:rFonts w:ascii="Segoe UI Emoji" w:hAnsi="Segoe UI Emoji" w:cs="Segoe UI Emoji"/>
-          <w:u w:val="single"/>
-        </w:rPr>
-      </w:pPr>
-      <w:r>
-        <w:rPr>
-          <w:rFonts w:ascii="Segoe UI Emoji" w:hAnsi="Segoe UI Emoji" w:cs="Segoe UI Emoji"/>
-          <w:u w:val="single"/>
-        </w:rPr>
-        <w:lastRenderedPageBreak/>
-        <w:t xml:space="preserve">Draft 1 – </w:t>
-      </w:r>
-    </w:p>
-    <w:tbl>
-      <w:tblPr>
-        <w:tblStyle w:val="TableGrid"/>
-        <w:tblW w:w="0" w:type="auto"/>
-        <w:tblLook w:val="04A0" w:firstRow="1" w:lastRow="0" w:firstColumn="1" w:lastColumn="0" w:noHBand="0" w:noVBand="1"/>
-      </w:tblPr>
-      <w:tblGrid>
-        <w:gridCol w:w="1738"/>
-        <w:gridCol w:w="3591"/>
-        <w:gridCol w:w="3687"/>
-      </w:tblGrid>
-      <w:tr>
-        <w:tc>
-          <w:tcPr>
-            <w:tcW w:w="0" w:type="auto"/>
-            <w:hideMark/>
-          </w:tcPr>
-          <w:p>
-            <w:pPr>
-              <w:spacing w:after="160" w:line="278" w:lineRule="auto"/>
-              <w:rPr>
-                <w:b/>
-                <w:bCs/>
-              </w:rPr>
-            </w:pPr>
-            <w:r>
-              <w:rPr>
-                <w:b/>
-                <w:bCs/>
-              </w:rPr>
-              <w:t>Section</w:t>
-            </w:r>
-          </w:p>
-        </w:tc>
-        <w:tc>
-          <w:tcPr>
-            <w:tcW w:w="0" w:type="auto"/>
-            <w:hideMark/>
-          </w:tcPr>
-          <w:p>
-            <w:pPr>
-              <w:spacing w:after="160" w:line="278" w:lineRule="auto"/>
-              <w:rPr>
-                <w:b/>
-                <w:bCs/>
-              </w:rPr>
-            </w:pPr>
-            <w:r>
-              <w:rPr>
-                <w:b/>
-                <w:bCs/>
-              </w:rPr>
-              <w:t>Purpose / Key Question</w:t>
-            </w:r>
-          </w:p>
-        </w:tc>
-        <w:tc>
-          <w:tcPr>
-            <w:tcW w:w="0" w:type="auto"/>
-            <w:hideMark/>
-          </w:tcPr>
-          <w:p>
-            <w:pPr>
-              <w:spacing w:after="160" w:line="278" w:lineRule="auto"/>
-              <w:rPr>
-                <w:b/>
-                <w:bCs/>
-              </w:rPr>
-            </w:pPr>
-            <w:r>
-              <w:rPr>
-                <w:b/>
-                <w:bCs/>
-              </w:rPr>
-              <w:t>Visuals in the Section</w:t>
-            </w:r>
-          </w:p>
-        </w:tc>
-      </w:tr>
-      <w:tr>
-        <w:tc>
-          <w:tcPr>
-            <w:tcW w:w="0" w:type="auto"/>
-            <w:hideMark/>
-          </w:tcPr>
-          <w:p>
-            <w:pPr>
-              <w:spacing w:after="160" w:line="278" w:lineRule="auto"/>
-            </w:pPr>
-            <w:r>
-              <w:rPr>
-                <w:b/>
-                <w:bCs/>
-              </w:rPr>
-              <w:t>01 — How Big Is Australia's Outdoor Recreation Culture?</w:t>
-            </w:r>
-          </w:p>
-        </w:tc>
-        <w:tc>
-          <w:tcPr>
-            <w:tcW w:w="0" w:type="auto"/>
-            <w:hideMark/>
-          </w:tcPr>
-          <w:p>
-            <w:pPr>
-              <w:spacing w:after="160" w:line="278" w:lineRule="auto"/>
-            </w:pPr>
-            <w:r>
-              <w:t>Establish the scale of participation and introduce the major outdoor activities. Show whether the activity landscape has changed over time.</w:t>
-            </w:r>
-          </w:p>
-        </w:tc>
-        <w:tc>
-          <w:tcPr>
-            <w:tcW w:w="0" w:type="auto"/>
-            <w:hideMark/>
-          </w:tcPr>
-          <w:p>
-            <w:pPr>
-              <w:spacing w:after="160" w:line="278" w:lineRule="auto"/>
-            </w:pPr>
-            <w:r>
-              <w:rPr>
-                <w:b/>
-                <w:bCs/>
-              </w:rPr>
-              <w:t>1. Multi-line chart</w:t>
-            </w:r>
-            <w:r>
-              <w:t xml:space="preserve"> — participation trends of selected outdoor activities </w:t>
-            </w:r>
-            <w:r>
-              <w:rPr>
-                <w:b/>
-                <w:bCs/>
-              </w:rPr>
-              <w:t>2. Slopegraph</w:t>
-            </w:r>
-            <w:r>
-              <w:t xml:space="preserve"> — change in activity rankings between selected years</w:t>
-            </w:r>
-          </w:p>
-        </w:tc>
-      </w:tr>
-      <w:tr>
-        <w:tc>
-          <w:tcPr>
-            <w:tcW w:w="0" w:type="auto"/>
-            <w:hideMark/>
-          </w:tcPr>
-          <w:p>
-            <w:pPr>
-              <w:spacing w:after="160" w:line="278" w:lineRule="auto"/>
-            </w:pPr>
-            <w:r>
-              <w:rPr>
-                <w:b/>
-                <w:bCs/>
-              </w:rPr>
-              <w:t>02 — Who Gets Outdoors?</w:t>
-            </w:r>
-          </w:p>
-        </w:tc>
-        <w:tc>
-          <w:tcPr>
-            <w:tcW w:w="0" w:type="auto"/>
-            <w:hideMark/>
-          </w:tcPr>
-          <w:p>
-            <w:pPr>
-              <w:spacing w:after="160" w:line="278" w:lineRule="auto"/>
-            </w:pPr>
-            <w:r>
-              <w:t>Investigate how participation differs by age and sex. Identify whether different activities attract different demographic groups.</w:t>
-            </w:r>
-          </w:p>
-        </w:tc>
-        <w:tc>
-          <w:tcPr>
-            <w:tcW w:w="0" w:type="auto"/>
-            <w:hideMark/>
-          </w:tcPr>
-          <w:p>
-            <w:pPr>
-              <w:spacing w:after="160" w:line="278" w:lineRule="auto"/>
-            </w:pPr>
-            <w:r>
-              <w:rPr>
-                <w:b/>
-                <w:bCs/>
-              </w:rPr>
-              <w:t>3. Grouped bar chart</w:t>
-            </w:r>
-            <w:r>
-              <w:t xml:space="preserve"> — participation by age and sex </w:t>
-            </w:r>
-            <w:r>
-              <w:rPr>
-                <w:b/>
-                <w:bCs/>
-              </w:rPr>
-              <w:t>4. Heatmap</w:t>
-            </w:r>
-            <w:r>
-              <w:t xml:space="preserve"> — activity × age group </w:t>
-            </w:r>
-            <w:r>
-              <w:rPr>
-                <w:b/>
-                <w:bCs/>
-              </w:rPr>
-              <w:t>5. Population pyramid</w:t>
-            </w:r>
-            <w:r>
-              <w:t xml:space="preserve"> — male vs female participation by age</w:t>
-            </w:r>
-          </w:p>
-        </w:tc>
-      </w:tr>
-      <w:tr>
-        <w:tc>
-          <w:tcPr>
-            <w:tcW w:w="0" w:type="auto"/>
-            <w:hideMark/>
-          </w:tcPr>
-          <w:p>
-            <w:pPr>
-              <w:spacing w:after="160" w:line="278" w:lineRule="auto"/>
-            </w:pPr>
-            <w:r>
-              <w:rPr>
-                <w:b/>
-                <w:bCs/>
-              </w:rPr>
-              <w:t>03 — What Do Australians Do Outdoors?</w:t>
-            </w:r>
-          </w:p>
-        </w:tc>
-        <w:tc>
-          <w:tcPr>
-            <w:tcW w:w="0" w:type="auto"/>
-            <w:hideMark/>
-          </w:tcPr>
-          <w:p>
-            <w:pPr>
-              <w:spacing w:after="160" w:line="278" w:lineRule="auto"/>
-            </w:pPr>
-            <w:r>
-              <w:t>Explore the composition of outdoor recreation and compare the demographic/frequency profiles of different activities.</w:t>
-            </w:r>
-          </w:p>
-        </w:tc>
-        <w:tc>
-          <w:tcPr>
-            <w:tcW w:w="0" w:type="auto"/>
-            <w:hideMark/>
-          </w:tcPr>
-          <w:p>
-            <w:pPr>
-              <w:spacing w:after="160" w:line="278" w:lineRule="auto"/>
-            </w:pPr>
-            <w:r>
-              <w:rPr>
-                <w:b/>
-                <w:bCs/>
-              </w:rPr>
-              <w:t>6. Treemap</w:t>
-            </w:r>
-            <w:r>
-              <w:t xml:space="preserve"> — relative contribution of activities </w:t>
-            </w:r>
-          </w:p>
-          <w:p>
-            <w:pPr>
-              <w:spacing w:after="160" w:line="278" w:lineRule="auto"/>
-            </w:pPr>
-            <w:r>
-              <w:rPr>
-                <w:b/>
-                <w:bCs/>
-              </w:rPr>
-              <w:t>7. Parallel coordinates</w:t>
-            </w:r>
-            <w:r>
-              <w:t xml:space="preserve"> — activity profiles across demographic/frequency dimensions </w:t>
-            </w:r>
-            <w:r>
-              <w:rPr>
-                <w:b/>
-                <w:bCs/>
-              </w:rPr>
-              <w:t>8. Small multiples</w:t>
-            </w:r>
-            <w:r>
-              <w:t xml:space="preserve"> — age profiles for selected activities</w:t>
-            </w:r>
-          </w:p>
-        </w:tc>
-      </w:tr>
-      <w:tr>
-        <w:tc>
-          <w:tcPr>
-            <w:tcW w:w="0" w:type="auto"/>
-            <w:hideMark/>
-          </w:tcPr>
-          <w:p>
-            <w:pPr>
-              <w:spacing w:after="160" w:line="278" w:lineRule="auto"/>
-            </w:pPr>
-            <w:r>
-              <w:rPr>
-                <w:b/>
-                <w:bCs/>
-              </w:rPr>
-              <w:t>04 — Where Do Australians Get Outdoors?</w:t>
-            </w:r>
-          </w:p>
-        </w:tc>
-        <w:tc>
-          <w:tcPr>
-            <w:tcW w:w="0" w:type="auto"/>
-            <w:hideMark/>
-          </w:tcPr>
-          <w:p>
-            <w:pPr>
-              <w:spacing w:after="160" w:line="278" w:lineRule="auto"/>
-            </w:pPr>
-            <w:r>
-              <w:t>Examine geographic differences at multiple spatial scales rather than simply showing where overall participation is highest.</w:t>
-            </w:r>
-          </w:p>
-        </w:tc>
-        <w:tc>
-          <w:tcPr>
-            <w:tcW w:w="0" w:type="auto"/>
-            <w:hideMark/>
-          </w:tcPr>
-          <w:p>
-            <w:pPr>
-              <w:spacing w:after="160" w:line="278" w:lineRule="auto"/>
-            </w:pPr>
-            <w:r>
-              <w:rPr>
-                <w:b/>
-                <w:bCs/>
-              </w:rPr>
-              <w:t>9. Map 1 — State/territory overall participation</w:t>
-            </w:r>
-            <w:r>
-              <w:t xml:space="preserve"> </w:t>
-            </w:r>
-          </w:p>
-          <w:p>
-            <w:pPr>
-              <w:spacing w:after="160" w:line="278" w:lineRule="auto"/>
-              <w:rPr>
-                <w:b/>
-                <w:bCs/>
-              </w:rPr>
-            </w:pPr>
-            <w:r>
-              <w:rPr>
-                <w:b/>
-                <w:bCs/>
-              </w:rPr>
-              <w:t>10. Map 2 — State/territory activity-specific participation</w:t>
-            </w:r>
-          </w:p>
-          <w:p>
-            <w:pPr>
-              <w:spacing w:after="160" w:line="278" w:lineRule="auto"/>
-            </w:pPr>
-            <w:r>
-              <w:rPr>
-                <w:b/>
-                <w:bCs/>
-              </w:rPr>
-              <w:t>11. Map 3 — Remoteness-area participation</w:t>
-            </w:r>
-            <w:r>
-              <w:t xml:space="preserve"> </w:t>
-            </w:r>
-          </w:p>
-          <w:p>
-            <w:pPr>
-              <w:spacing w:after="160" w:line="278" w:lineRule="auto"/>
-            </w:pPr>
-            <w:r>
-              <w:rPr>
-                <w:b/>
-                <w:bCs/>
-              </w:rPr>
-              <w:t>12. Box plot</w:t>
-            </w:r>
-            <w:r>
-              <w:t xml:space="preserve"> — variation between states/territories</w:t>
-            </w:r>
-          </w:p>
-        </w:tc>
-      </w:tr>
-      <w:tr>
-        <w:tc>
-          <w:tcPr>
-            <w:tcW w:w="0" w:type="auto"/>
-            <w:hideMark/>
-          </w:tcPr>
-          <w:p>
-            <w:pPr>
-              <w:spacing w:after="160" w:line="278" w:lineRule="auto"/>
-            </w:pPr>
-            <w:r>
-              <w:rPr>
-                <w:b/>
-                <w:bCs/>
-              </w:rPr>
-              <w:t>05 — Is Australia's Outdoor Lifestyle Changing?</w:t>
-            </w:r>
-          </w:p>
-        </w:tc>
-        <w:tc>
-          <w:tcPr>
-            <w:tcW w:w="0" w:type="auto"/>
-            <w:hideMark/>
-          </w:tcPr>
-          <w:p>
-            <w:pPr>
-              <w:spacing w:after="160" w:line="278" w:lineRule="auto"/>
-            </w:pPr>
-            <w:r>
-              <w:t>Investigate whether participation and participation frequency have changed across survey periods.</w:t>
-            </w:r>
-          </w:p>
-        </w:tc>
-        <w:tc>
-          <w:tcPr>
-            <w:tcW w:w="0" w:type="auto"/>
-            <w:hideMark/>
-          </w:tcPr>
-          <w:p>
-            <w:pPr>
-              <w:spacing w:after="160" w:line="278" w:lineRule="auto"/>
-            </w:pPr>
-            <w:r>
-              <w:rPr>
-                <w:b/>
-                <w:bCs/>
-              </w:rPr>
-              <w:t>13. Connected scatterplot</w:t>
-            </w:r>
-            <w:r>
-              <w:t xml:space="preserve"> — participation rate × frequency, earlier vs later period </w:t>
-            </w:r>
-          </w:p>
-          <w:p>
-            <w:pPr>
-              <w:spacing w:after="160" w:line="278" w:lineRule="auto"/>
-            </w:pPr>
-            <w:r>
-              <w:rPr>
-                <w:b/>
-                <w:bCs/>
-              </w:rPr>
-              <w:t>14. Area chart</w:t>
-            </w:r>
-            <w:r>
-              <w:t xml:space="preserve"> — changing activity composition over time</w:t>
-            </w:r>
-          </w:p>
-        </w:tc>
-      </w:tr>
-      <w:tr>
-        <w:tc>
-          <w:tcPr>
-            <w:tcW w:w="0" w:type="auto"/>
-            <w:hideMark/>
-          </w:tcPr>
-          <w:p>
-            <w:pPr>
-              <w:spacing w:after="160" w:line="278" w:lineRule="auto"/>
-            </w:pPr>
-            <w:r>
-              <w:rPr>
-                <w:b/>
-                <w:bCs/>
-              </w:rPr>
-              <w:t xml:space="preserve">06 — What Does Australia's </w:t>
-            </w:r>
-            <w:r>
-              <w:rPr>
-                <w:b/>
-                <w:bCs/>
-              </w:rPr>
-              <w:lastRenderedPageBreak/>
-              <w:t>Outdoor Lifestyle Look Like?</w:t>
-            </w:r>
-          </w:p>
-        </w:tc>
-        <w:tc>
-          <w:tcPr>
-            <w:tcW w:w="0" w:type="auto"/>
-            <w:hideMark/>
-          </w:tcPr>
-          <w:p>
-            <w:pPr>
-              <w:spacing w:after="160" w:line="278" w:lineRule="auto"/>
-            </w:pPr>
-            <w:r>
-              <w:lastRenderedPageBreak/>
-              <w:t xml:space="preserve">Synthesise the demographic, activity, geographic and temporal </w:t>
-            </w:r>
-            <w:r>
-              <w:lastRenderedPageBreak/>
-              <w:t>patterns into a final comparison of outdoor-recreation profiles.</w:t>
-            </w:r>
-          </w:p>
-        </w:tc>
-        <w:tc>
-          <w:tcPr>
-            <w:tcW w:w="0" w:type="auto"/>
-            <w:hideMark/>
-          </w:tcPr>
-          <w:p>
-            <w:pPr>
-              <w:spacing w:after="160" w:line="278" w:lineRule="auto"/>
-            </w:pPr>
-            <w:r>
-              <w:rPr>
-                <w:b/>
-                <w:bCs/>
-              </w:rPr>
-              <w:lastRenderedPageBreak/>
-              <w:t>15. Radar chart</w:t>
-            </w:r>
-            <w:r>
-              <w:t xml:space="preserve"> — multi-dimensional activity profiles </w:t>
-            </w:r>
-          </w:p>
-          <w:p>
-            <w:pPr>
-              <w:spacing w:after="160" w:line="278" w:lineRule="auto"/>
-            </w:pPr>
-            <w:r>
-              <w:rPr>
-                <w:b/>
-                <w:bCs/>
-              </w:rPr>
-              <w:lastRenderedPageBreak/>
-              <w:t>16. Lollipop chart</w:t>
-            </w:r>
-            <w:r>
-              <w:t xml:space="preserve"> — selected activity differences between demographic groups</w:t>
-            </w:r>
-          </w:p>
-        </w:tc>
-      </w:tr>
-    </w:tbl>
-    <w:p/>
-    <w:tbl>
-      <w:tblPr>
-        <w:tblStyle w:val="TableGrid"/>
-        <w:tblW w:w="0" w:type="auto"/>
-        <w:tblLook w:val="04A0" w:firstRow="1" w:lastRow="0" w:firstColumn="1" w:lastColumn="0" w:noHBand="0" w:noVBand="1"/>
-      </w:tblPr>
-      <w:tblGrid>
-        <w:gridCol w:w="460"/>
-        <w:gridCol w:w="1723"/>
-        <w:gridCol w:w="2207"/>
-        <w:gridCol w:w="1701"/>
-        <w:gridCol w:w="2925"/>
-      </w:tblGrid>
-      <w:tr>
-        <w:tc>
-          <w:tcPr>
-            <w:tcW w:w="0" w:type="auto"/>
-            <w:hideMark/>
-          </w:tcPr>
-          <w:p>
-            <w:pPr>
-              <w:spacing w:after="160" w:line="278" w:lineRule="auto"/>
-            </w:pPr>
-            <w:r>
-              <w:t>#</w:t>
-            </w:r>
-          </w:p>
-        </w:tc>
-        <w:tc>
-          <w:tcPr>
-            <w:tcW w:w="0" w:type="auto"/>
-            <w:hideMark/>
-          </w:tcPr>
-          <w:p>
-            <w:pPr>
-              <w:spacing w:after="160" w:line="278" w:lineRule="auto"/>
-            </w:pPr>
-            <w:r>
-              <w:t>Visual</w:t>
-            </w:r>
-          </w:p>
-        </w:tc>
-        <w:tc>
-          <w:tcPr>
-            <w:tcW w:w="2207" w:type="dxa"/>
-            <w:hideMark/>
-          </w:tcPr>
-          <w:p>
-            <w:pPr>
-              <w:spacing w:after="160" w:line="278" w:lineRule="auto"/>
-            </w:pPr>
-            <w:r>
-              <w:t>Details</w:t>
-            </w:r>
-          </w:p>
-        </w:tc>
-        <w:tc>
-          <w:tcPr>
-            <w:tcW w:w="1701" w:type="dxa"/>
-            <w:hideMark/>
-          </w:tcPr>
-          <w:p>
-            <w:pPr>
-              <w:spacing w:after="160" w:line="278" w:lineRule="auto"/>
-            </w:pPr>
-            <w:r>
-              <w:t>Data required</w:t>
-            </w:r>
-          </w:p>
-        </w:tc>
-        <w:tc>
-          <w:tcPr>
-            <w:tcW w:w="2925" w:type="dxa"/>
-            <w:hideMark/>
-          </w:tcPr>
-          <w:p>
-            <w:pPr>
-              <w:spacing w:after="160" w:line="278" w:lineRule="auto"/>
-            </w:pPr>
-            <w:r>
-              <w:t>Where to get it</w:t>
-            </w:r>
-          </w:p>
-        </w:tc>
-      </w:tr>
-      <w:tr>
-        <w:tc>
-          <w:tcPr>
-            <w:tcW w:w="0" w:type="auto"/>
-            <w:hideMark/>
-          </w:tcPr>
-          <w:p>
-            <w:pPr>
-              <w:spacing w:after="160" w:line="278" w:lineRule="auto"/>
-            </w:pPr>
-            <w:r>
-              <w:t>1</w:t>
-            </w:r>
-          </w:p>
-        </w:tc>
-        <w:tc>
-          <w:tcPr>
-            <w:tcW w:w="0" w:type="auto"/>
-            <w:hideMark/>
-          </w:tcPr>
-          <w:p>
-            <w:pPr>
-              <w:spacing w:after="160" w:line="278" w:lineRule="auto"/>
-            </w:pPr>
-            <w:r>
-              <w:t>Multi-line chart — Outdoor participation over time</w:t>
-            </w:r>
-          </w:p>
-          <w:p>
-            <w:pPr>
-              <w:spacing w:after="160" w:line="278" w:lineRule="auto"/>
-              <w:rPr>
-                <w:b/>
-                <w:bCs/>
-              </w:rPr>
-            </w:pPr>
-            <w:r>
-              <w:rPr>
-                <w:b/>
-                <w:bCs/>
-              </w:rPr>
-              <w:t>(</w:t>
-            </w:r>
-            <w:r>
-              <w:t>Basic</w:t>
-            </w:r>
-            <w:r>
-              <w:t xml:space="preserve">) </w:t>
-            </w:r>
-          </w:p>
-        </w:tc>
-        <w:tc>
-          <w:tcPr>
-            <w:tcW w:w="2207" w:type="dxa"/>
-            <w:hideMark/>
-          </w:tcPr>
-          <w:p>
-            <w:pPr>
-              <w:spacing w:after="160" w:line="278" w:lineRule="auto"/>
-            </w:pPr>
-            <w:r>
-              <w:t>X: Survey year</w:t>
-            </w:r>
-          </w:p>
-          <w:p>
-            <w:pPr>
-              <w:spacing w:after="160" w:line="278" w:lineRule="auto"/>
-            </w:pPr>
-            <w:r>
-              <w:t>Y: Participation rate %</w:t>
-            </w:r>
-          </w:p>
-          <w:p>
-            <w:pPr>
-              <w:spacing w:after="160" w:line="278" w:lineRule="auto"/>
-            </w:pPr>
-            <w:r>
-              <w:t>Lines: Selected outdoor activities such as walking, cycling, swimming, running, bushwalking</w:t>
-            </w:r>
-          </w:p>
-        </w:tc>
-        <w:tc>
-          <w:tcPr>
-            <w:tcW w:w="1701" w:type="dxa"/>
-            <w:hideMark/>
-          </w:tcPr>
-          <w:p>
-            <w:pPr>
-              <w:spacing w:after="160" w:line="278" w:lineRule="auto"/>
-            </w:pPr>
-            <w:r>
-              <w:t>Activity × year × participation rate</w:t>
-            </w:r>
-          </w:p>
-        </w:tc>
-        <w:tc>
-          <w:tcPr>
-            <w:tcW w:w="2925" w:type="dxa"/>
-            <w:hideMark/>
-          </w:tcPr>
-          <w:p>
-            <w:pPr>
-              <w:spacing w:after="160" w:line="278" w:lineRule="auto"/>
-            </w:pPr>
-            <w:r>
-              <w:t>ABS Participation in Sport and Physical Recreation historical releases. The ABS provides releases including 2005–06, 2011–12 and 2013–14, with activity-level data. (</w:t>
-            </w:r>
-            <w:hyperlink r:id="rId10" w:tooltip="4177.0 - Participation in Sports and Physical Recreation, Australia, 2005-06" w:history="1">
-              <w:r>
-                <w:rPr>
-                  <w:rStyle w:val="Hyperlink"/>
-                </w:rPr>
-                <w:t>Australian Bureau of Statistics</w:t>
-              </w:r>
-            </w:hyperlink>
-            <w:r>
-              <w:t>)</w:t>
-            </w:r>
-          </w:p>
-        </w:tc>
-      </w:tr>
-      <w:tr>
-        <w:tc>
-          <w:tcPr>
-            <w:tcW w:w="0" w:type="auto"/>
-            <w:hideMark/>
-          </w:tcPr>
-          <w:p>
-            <w:pPr>
-              <w:spacing w:after="160" w:line="278" w:lineRule="auto"/>
-            </w:pPr>
-            <w:r>
-              <w:t>2</w:t>
-            </w:r>
-          </w:p>
-        </w:tc>
-        <w:tc>
-          <w:tcPr>
-            <w:tcW w:w="0" w:type="auto"/>
-            <w:hideMark/>
-          </w:tcPr>
-          <w:p>
-            <w:pPr>
-              <w:spacing w:after="160" w:line="278" w:lineRule="auto"/>
-            </w:pPr>
-            <w:r>
-              <w:t>Slopegraph — Changing activity rankings</w:t>
-            </w:r>
-          </w:p>
-          <w:p>
-            <w:pPr>
-              <w:spacing w:after="160" w:line="278" w:lineRule="auto"/>
-            </w:pPr>
-            <w:r>
-              <w:t>(</w:t>
-            </w:r>
-            <w:r>
-              <w:t>Advanced</w:t>
-            </w:r>
-            <w:r>
-              <w:t>)</w:t>
-            </w:r>
-          </w:p>
-        </w:tc>
-        <w:tc>
-          <w:tcPr>
-            <w:tcW w:w="2207" w:type="dxa"/>
-            <w:hideMark/>
-          </w:tcPr>
-          <w:p>
-            <w:pPr>
-              <w:spacing w:after="160" w:line="278" w:lineRule="auto"/>
-            </w:pPr>
-            <w:r>
-              <w:t xml:space="preserve">X: Earlier vs later year </w:t>
-            </w:r>
-          </w:p>
-          <w:p>
-            <w:pPr>
-              <w:spacing w:after="160" w:line="278" w:lineRule="auto"/>
-            </w:pPr>
-            <w:r>
-              <w:t>Y: Rank Line: Each activity</w:t>
-            </w:r>
-          </w:p>
-        </w:tc>
-        <w:tc>
-          <w:tcPr>
-            <w:tcW w:w="1701" w:type="dxa"/>
-            <w:hideMark/>
-          </w:tcPr>
-          <w:p>
-            <w:pPr>
-              <w:spacing w:after="160" w:line="278" w:lineRule="auto"/>
-            </w:pPr>
-            <w:r>
-              <w:t>Activity × year × participation rate</w:t>
-            </w:r>
-          </w:p>
-        </w:tc>
-        <w:tc>
-          <w:tcPr>
-            <w:tcW w:w="2925" w:type="dxa"/>
-            <w:hideMark/>
-          </w:tcPr>
-          <w:p>
-            <w:pPr>
-              <w:spacing w:after="160" w:line="278" w:lineRule="auto"/>
-            </w:pPr>
-            <w:r>
-              <w:t>ABS historical participation tables. The 2005–06 release includes selected activity participation data, while later releases provide comparable activity data. (</w:t>
-            </w:r>
-            <w:hyperlink r:id="rId11" w:tooltip="4177.0 - Participation in Sports and Physical Recreation, Australia, 2005-06" w:history="1">
-              <w:r>
-                <w:rPr>
-                  <w:rStyle w:val="Hyperlink"/>
-                </w:rPr>
-                <w:t>Australian Bureau of Statistics</w:t>
-              </w:r>
-            </w:hyperlink>
-            <w:r>
-              <w:t>)</w:t>
-            </w:r>
-          </w:p>
-        </w:tc>
-      </w:tr>
-      <w:tr>
-        <w:tc>
-          <w:tcPr>
-            <w:tcW w:w="0" w:type="auto"/>
-            <w:hideMark/>
-          </w:tcPr>
-          <w:p>
-            <w:pPr>
-              <w:spacing w:after="160" w:line="278" w:lineRule="auto"/>
-            </w:pPr>
-            <w:r>
-              <w:t>3</w:t>
-            </w:r>
-          </w:p>
-        </w:tc>
-        <w:tc>
-          <w:tcPr>
-            <w:tcW w:w="0" w:type="auto"/>
-            <w:hideMark/>
-          </w:tcPr>
-          <w:p>
-            <w:pPr>
-              <w:spacing w:after="160" w:line="278" w:lineRule="auto"/>
-            </w:pPr>
-            <w:r>
-              <w:t>Grouped bar chart — Who participates?</w:t>
-            </w:r>
-          </w:p>
-          <w:p>
-            <w:pPr>
-              <w:spacing w:after="160" w:line="278" w:lineRule="auto"/>
-            </w:pPr>
-            <w:r>
-              <w:rPr>
-                <w:b/>
-                <w:bCs/>
-              </w:rPr>
-              <w:t>(</w:t>
-            </w:r>
-            <w:r>
-              <w:t>Basic</w:t>
-            </w:r>
-            <w:r>
-              <w:t xml:space="preserve">) </w:t>
-            </w:r>
-          </w:p>
-        </w:tc>
-        <w:tc>
-          <w:tcPr>
-            <w:tcW w:w="2207" w:type="dxa"/>
-            <w:hideMark/>
-          </w:tcPr>
-          <w:p>
-            <w:pPr>
-              <w:spacing w:after="160" w:line="278" w:lineRule="auto"/>
-            </w:pPr>
-            <w:r>
-              <w:t xml:space="preserve">X: Age group </w:t>
-            </w:r>
-          </w:p>
-          <w:p>
-            <w:pPr>
-              <w:spacing w:after="160" w:line="278" w:lineRule="auto"/>
-            </w:pPr>
-            <w:r>
-              <w:t xml:space="preserve">Y: Participation rate (%) </w:t>
-            </w:r>
-          </w:p>
-          <w:p>
-            <w:pPr>
-              <w:spacing w:after="160" w:line="278" w:lineRule="auto"/>
-            </w:pPr>
-            <w:r>
-              <w:t>Groups: Male / Female</w:t>
-            </w:r>
-          </w:p>
-        </w:tc>
-        <w:tc>
-          <w:tcPr>
-            <w:tcW w:w="1701" w:type="dxa"/>
-            <w:hideMark/>
-          </w:tcPr>
-          <w:p>
-            <w:pPr>
-              <w:spacing w:after="160" w:line="278" w:lineRule="auto"/>
-            </w:pPr>
-            <w:r>
-              <w:t>Age × sex × participation rate</w:t>
-            </w:r>
-          </w:p>
-        </w:tc>
-        <w:tc>
-          <w:tcPr>
-            <w:tcW w:w="2925" w:type="dxa"/>
-            <w:hideMark/>
-          </w:tcPr>
-          <w:p>
-            <w:pPr>
-              <w:spacing w:after="160" w:line="278" w:lineRule="auto"/>
-            </w:pPr>
-            <w:r>
-              <w:t>ABS Participation in Sport and Physical Recreation, particularly 2013–14 tables/TableBuilder. The ABS reports participation by age and sex. (</w:t>
-            </w:r>
-            <w:hyperlink r:id="rId12" w:tooltip="Participation in Sport and Physical Recreation, Australia, 2013-14 financial year | Australian Bureau of Statistics" w:history="1">
-              <w:r>
-                <w:rPr>
-                  <w:rStyle w:val="Hyperlink"/>
-                </w:rPr>
-                <w:t>Australian Bureau of Statistics</w:t>
-              </w:r>
-            </w:hyperlink>
-            <w:r>
-              <w:t>)</w:t>
-            </w:r>
-          </w:p>
-        </w:tc>
-      </w:tr>
-      <w:tr>
-        <w:tc>
-          <w:tcPr>
-            <w:tcW w:w="0" w:type="auto"/>
-            <w:hideMark/>
-          </w:tcPr>
-          <w:p>
-            <w:pPr>
-              <w:spacing w:after="160" w:line="278" w:lineRule="auto"/>
-            </w:pPr>
-            <w:r>
-              <w:t>4</w:t>
-            </w:r>
-          </w:p>
-        </w:tc>
-        <w:tc>
-          <w:tcPr>
-            <w:tcW w:w="0" w:type="auto"/>
-            <w:hideMark/>
-          </w:tcPr>
-          <w:p>
-            <w:pPr>
-              <w:spacing w:after="160" w:line="278" w:lineRule="auto"/>
-            </w:pPr>
-            <w:r>
-              <w:t>Heatmap — Activity × age</w:t>
-            </w:r>
-          </w:p>
-          <w:p>
-            <w:pPr>
-              <w:spacing w:after="160" w:line="278" w:lineRule="auto"/>
-            </w:pPr>
-            <w:r>
-              <w:t>(</w:t>
-            </w:r>
-            <w:r>
-              <w:t>Advanced</w:t>
-            </w:r>
-            <w:r>
-              <w:t>)</w:t>
-            </w:r>
-          </w:p>
-        </w:tc>
-        <w:tc>
-          <w:tcPr>
-            <w:tcW w:w="2207" w:type="dxa"/>
-            <w:hideMark/>
-          </w:tcPr>
-          <w:p>
-            <w:pPr>
-              <w:spacing w:after="160" w:line="278" w:lineRule="auto"/>
-            </w:pPr>
-            <w:r>
-              <w:t xml:space="preserve">X: Age group </w:t>
-            </w:r>
-          </w:p>
-          <w:p>
-            <w:pPr>
-              <w:spacing w:after="160" w:line="278" w:lineRule="auto"/>
-            </w:pPr>
-            <w:r>
-              <w:t xml:space="preserve">Y: Activity </w:t>
-            </w:r>
-          </w:p>
-          <w:p>
-            <w:pPr>
-              <w:spacing w:after="160" w:line="278" w:lineRule="auto"/>
-            </w:pPr>
-            <w:r>
-              <w:t>Colour: Participation rate (%)</w:t>
-            </w:r>
-          </w:p>
-        </w:tc>
-        <w:tc>
-          <w:tcPr>
-            <w:tcW w:w="1701" w:type="dxa"/>
-            <w:hideMark/>
-          </w:tcPr>
-          <w:p>
-            <w:pPr>
-              <w:spacing w:after="160" w:line="278" w:lineRule="auto"/>
-            </w:pPr>
-            <w:r>
-              <w:t>Activity × age × participation</w:t>
-            </w:r>
-          </w:p>
-        </w:tc>
-        <w:tc>
-          <w:tcPr>
-            <w:tcW w:w="2925" w:type="dxa"/>
-            <w:hideMark/>
-          </w:tcPr>
-          <w:p>
-            <w:pPr>
-              <w:spacing w:after="160" w:line="278" w:lineRule="auto"/>
-            </w:pPr>
-            <w:r>
-              <w:t>ABS TableBuilder. The Activity level contains individual activities and can be linked to person-level age characteristics. (</w:t>
-            </w:r>
-            <w:hyperlink r:id="rId13" w:tooltip="TableBuilder: Participation in Sport and Physical Recreation, Australia | Australian Bureau of Statistics" w:history="1">
-              <w:r>
-                <w:rPr>
-                  <w:rStyle w:val="Hyperlink"/>
-                </w:rPr>
-                <w:t>Australian Bureau of Statistics</w:t>
-              </w:r>
-            </w:hyperlink>
-            <w:r>
-              <w:t>)</w:t>
-            </w:r>
-          </w:p>
-        </w:tc>
-      </w:tr>
-      <w:tr>
-        <w:tc>
-          <w:tcPr>
-            <w:tcW w:w="0" w:type="auto"/>
-            <w:hideMark/>
-          </w:tcPr>
-          <w:p>
-            <w:pPr>
-              <w:spacing w:after="160" w:line="278" w:lineRule="auto"/>
-            </w:pPr>
-            <w:r>
-              <w:lastRenderedPageBreak/>
-              <w:t>5</w:t>
-            </w:r>
-          </w:p>
-        </w:tc>
-        <w:tc>
-          <w:tcPr>
-            <w:tcW w:w="0" w:type="auto"/>
-            <w:hideMark/>
-          </w:tcPr>
-          <w:p>
-            <w:pPr>
-              <w:spacing w:after="160" w:line="278" w:lineRule="auto"/>
-            </w:pPr>
-            <w:r>
-              <w:t>Population pyramid — Participation by age and sex</w:t>
-            </w:r>
-          </w:p>
-          <w:p>
-            <w:pPr>
-              <w:spacing w:after="160" w:line="278" w:lineRule="auto"/>
-            </w:pPr>
-            <w:r>
-              <w:t>(</w:t>
-            </w:r>
-            <w:r>
-              <w:t>Advanced</w:t>
-            </w:r>
-            <w:r>
-              <w:t>)</w:t>
-            </w:r>
-          </w:p>
-        </w:tc>
-        <w:tc>
-          <w:tcPr>
-            <w:tcW w:w="2207" w:type="dxa"/>
-            <w:hideMark/>
-          </w:tcPr>
-          <w:p>
-            <w:pPr>
-              <w:spacing w:after="160" w:line="278" w:lineRule="auto"/>
-            </w:pPr>
-            <w:r>
-              <w:t xml:space="preserve">X: Participation rate (%) </w:t>
-            </w:r>
-          </w:p>
-          <w:p>
-            <w:pPr>
-              <w:spacing w:after="160" w:line="278" w:lineRule="auto"/>
-            </w:pPr>
-            <w:r>
-              <w:t>Y: Age group Left/right: Male vs female</w:t>
-            </w:r>
-          </w:p>
-        </w:tc>
-        <w:tc>
-          <w:tcPr>
-            <w:tcW w:w="1701" w:type="dxa"/>
-            <w:hideMark/>
-          </w:tcPr>
-          <w:p>
-            <w:pPr>
-              <w:spacing w:after="160" w:line="278" w:lineRule="auto"/>
-            </w:pPr>
-            <w:r>
-              <w:t>Age × sex × participation</w:t>
-            </w:r>
-          </w:p>
-        </w:tc>
-        <w:tc>
-          <w:tcPr>
-            <w:tcW w:w="2925" w:type="dxa"/>
-            <w:hideMark/>
-          </w:tcPr>
-          <w:p>
-            <w:pPr>
-              <w:spacing w:after="160" w:line="278" w:lineRule="auto"/>
-            </w:pPr>
-            <w:r>
-              <w:t>ABS Participation in Sport and Physical Recreation / TableBuilder. The ABS publishes age and sex participation measures. (</w:t>
-            </w:r>
-            <w:hyperlink r:id="rId14" w:tooltip="Participation in Sport and Physical Recreation, Australia, 2013-14 financial year | Australian Bureau of Statistics" w:history="1">
-              <w:r>
-                <w:rPr>
-                  <w:rStyle w:val="Hyperlink"/>
-                </w:rPr>
-                <w:t>Australian Bureau of Statistics</w:t>
-              </w:r>
-            </w:hyperlink>
-            <w:r>
-              <w:t>)</w:t>
-            </w:r>
-          </w:p>
-        </w:tc>
-      </w:tr>
-      <w:tr>
-        <w:tc>
-          <w:tcPr>
-            <w:tcW w:w="0" w:type="auto"/>
-            <w:hideMark/>
-          </w:tcPr>
-          <w:p>
-            <w:pPr>
-              <w:spacing w:after="160" w:line="278" w:lineRule="auto"/>
-            </w:pPr>
-            <w:r>
-              <w:t>6</w:t>
-            </w:r>
-          </w:p>
-        </w:tc>
-        <w:tc>
-          <w:tcPr>
-            <w:tcW w:w="0" w:type="auto"/>
-            <w:hideMark/>
-          </w:tcPr>
-          <w:p>
-            <w:pPr>
-              <w:spacing w:after="160" w:line="278" w:lineRule="auto"/>
-            </w:pPr>
-            <w:r>
-              <w:t>Treemap — What do Australians do?</w:t>
-            </w:r>
-          </w:p>
-          <w:p>
-            <w:pPr>
-              <w:spacing w:after="160" w:line="278" w:lineRule="auto"/>
-            </w:pPr>
-            <w:r>
-              <w:t>(</w:t>
-            </w:r>
-            <w:r>
-              <w:t>Advanced</w:t>
-            </w:r>
-            <w:r>
-              <w:t>)</w:t>
-            </w:r>
-          </w:p>
-        </w:tc>
-        <w:tc>
-          <w:tcPr>
-            <w:tcW w:w="2207" w:type="dxa"/>
-            <w:hideMark/>
-          </w:tcPr>
-          <w:p>
-            <w:pPr>
-              <w:spacing w:after="160" w:line="278" w:lineRule="auto"/>
-            </w:pPr>
-            <w:r>
-              <w:t xml:space="preserve">Rectangle size: Number/rate of participants </w:t>
-            </w:r>
-          </w:p>
-          <w:p>
-            <w:pPr>
-              <w:spacing w:after="160" w:line="278" w:lineRule="auto"/>
-            </w:pPr>
-            <w:r>
-              <w:t>Colour: Activity/category</w:t>
-            </w:r>
-          </w:p>
-        </w:tc>
-        <w:tc>
-          <w:tcPr>
-            <w:tcW w:w="1701" w:type="dxa"/>
-            <w:hideMark/>
-          </w:tcPr>
-          <w:p>
-            <w:pPr>
-              <w:spacing w:after="160" w:line="278" w:lineRule="auto"/>
-            </w:pPr>
-            <w:r>
-              <w:t>Activity × participants or participation rate</w:t>
-            </w:r>
-          </w:p>
-        </w:tc>
-        <w:tc>
-          <w:tcPr>
-            <w:tcW w:w="2925" w:type="dxa"/>
-            <w:hideMark/>
-          </w:tcPr>
-          <w:p>
-            <w:pPr>
-              <w:spacing w:after="160" w:line="278" w:lineRule="auto"/>
-            </w:pPr>
-            <w:r>
-              <w:t>ABS activity-level data. 2005–06, for example, provides participation measures for individual activities including walking, swimming, cycling, running and bushwalking. (</w:t>
-            </w:r>
-            <w:hyperlink r:id="rId15" w:tooltip="4177.0 - Participation in Sports and Physical Recreation, Australia, 2005-06" w:history="1">
-              <w:r>
-                <w:rPr>
-                  <w:rStyle w:val="Hyperlink"/>
-                </w:rPr>
-                <w:t>Australian Bureau of Statistics</w:t>
-              </w:r>
-            </w:hyperlink>
-            <w:r>
-              <w:t>)</w:t>
-            </w:r>
-          </w:p>
-        </w:tc>
-      </w:tr>
-      <w:tr>
-        <w:tc>
-          <w:tcPr>
-            <w:tcW w:w="0" w:type="auto"/>
-            <w:hideMark/>
-          </w:tcPr>
-          <w:p>
-            <w:pPr>
-              <w:spacing w:after="160" w:line="278" w:lineRule="auto"/>
-            </w:pPr>
-            <w:r>
-              <w:t>7</w:t>
-            </w:r>
-          </w:p>
-        </w:tc>
-        <w:tc>
-          <w:tcPr>
-            <w:tcW w:w="0" w:type="auto"/>
-            <w:hideMark/>
-          </w:tcPr>
-          <w:p>
-            <w:pPr>
-              <w:spacing w:after="160" w:line="278" w:lineRule="auto"/>
-            </w:pPr>
-            <w:r>
-              <w:t>Parallel coordinates — Activity profiles</w:t>
-            </w:r>
-          </w:p>
-          <w:p>
-            <w:pPr>
-              <w:spacing w:after="160" w:line="278" w:lineRule="auto"/>
-            </w:pPr>
-            <w:r>
-              <w:t>(</w:t>
-            </w:r>
-            <w:r>
-              <w:t>Advanced</w:t>
-            </w:r>
-            <w:r>
-              <w:t>)</w:t>
-            </w:r>
-          </w:p>
-        </w:tc>
-        <w:tc>
-          <w:tcPr>
-            <w:tcW w:w="2207" w:type="dxa"/>
-            <w:hideMark/>
-          </w:tcPr>
-          <w:p>
-            <w:pPr>
-              <w:spacing w:after="160" w:line="278" w:lineRule="auto"/>
-            </w:pPr>
-            <w:r>
-              <w:t>Each line: Activity Axes: Overall participation, male participation, female participation, younger participation, older participation, frequency</w:t>
-            </w:r>
-          </w:p>
-        </w:tc>
-        <w:tc>
-          <w:tcPr>
-            <w:tcW w:w="1701" w:type="dxa"/>
-            <w:hideMark/>
-          </w:tcPr>
-          <w:p>
-            <w:pPr>
-              <w:spacing w:after="160" w:line="278" w:lineRule="auto"/>
-            </w:pPr>
-            <w:r>
-              <w:t>Activity × demographic measures × frequency</w:t>
-            </w:r>
-          </w:p>
-        </w:tc>
-        <w:tc>
-          <w:tcPr>
-            <w:tcW w:w="2925" w:type="dxa"/>
-            <w:hideMark/>
-          </w:tcPr>
-          <w:p>
-            <w:pPr>
-              <w:spacing w:after="160" w:line="278" w:lineRule="auto"/>
-            </w:pPr>
-            <w:r>
-              <w:t>ABS TableBuilder. Person, activity and role levels can be combined using the person identifier. (</w:t>
-            </w:r>
-            <w:hyperlink r:id="rId16" w:tooltip="TableBuilder: Participation in Sport and Physical Recreation, Australia | Australian Bureau of Statistics" w:history="1">
-              <w:r>
-                <w:rPr>
-                  <w:rStyle w:val="Hyperlink"/>
-                </w:rPr>
-                <w:t>Australian Bureau of Statistics</w:t>
-              </w:r>
-            </w:hyperlink>
-            <w:r>
-              <w:t>)</w:t>
-            </w:r>
-          </w:p>
-        </w:tc>
-      </w:tr>
-      <w:tr>
-        <w:tc>
-          <w:tcPr>
-            <w:tcW w:w="0" w:type="auto"/>
-            <w:hideMark/>
-          </w:tcPr>
-          <w:p>
-            <w:pPr>
-              <w:spacing w:after="160" w:line="278" w:lineRule="auto"/>
-            </w:pPr>
-            <w:r>
-              <w:t>8</w:t>
-            </w:r>
-          </w:p>
-        </w:tc>
-        <w:tc>
-          <w:tcPr>
-            <w:tcW w:w="0" w:type="auto"/>
-            <w:hideMark/>
-          </w:tcPr>
-          <w:p>
-            <w:pPr>
-              <w:spacing w:after="160" w:line="278" w:lineRule="auto"/>
-            </w:pPr>
-            <w:r>
-              <w:t>Small multiples — Age profile by activity</w:t>
-            </w:r>
-          </w:p>
-          <w:p>
-            <w:pPr>
-              <w:spacing w:after="160" w:line="278" w:lineRule="auto"/>
-            </w:pPr>
-            <w:r>
-              <w:t>(</w:t>
-            </w:r>
-            <w:r>
-              <w:t>Advanced</w:t>
-            </w:r>
-            <w:r>
-              <w:t>)</w:t>
-            </w:r>
-          </w:p>
-        </w:tc>
-        <w:tc>
-          <w:tcPr>
-            <w:tcW w:w="2207" w:type="dxa"/>
-            <w:hideMark/>
-          </w:tcPr>
-          <w:p>
-            <w:pPr>
-              <w:spacing w:after="160" w:line="278" w:lineRule="auto"/>
-            </w:pPr>
-            <w:r>
-              <w:t xml:space="preserve">Each panel: One activity </w:t>
-            </w:r>
-          </w:p>
-          <w:p>
-            <w:pPr>
-              <w:spacing w:after="160" w:line="278" w:lineRule="auto"/>
-            </w:pPr>
-            <w:r>
-              <w:t xml:space="preserve">X: Age group </w:t>
-            </w:r>
-          </w:p>
-          <w:p>
-            <w:pPr>
-              <w:spacing w:after="160" w:line="278" w:lineRule="auto"/>
-            </w:pPr>
-            <w:r>
-              <w:t>Y: Participation rate</w:t>
-            </w:r>
-          </w:p>
-        </w:tc>
-        <w:tc>
-          <w:tcPr>
-            <w:tcW w:w="1701" w:type="dxa"/>
-            <w:hideMark/>
-          </w:tcPr>
-          <w:p>
-            <w:pPr>
-              <w:spacing w:after="160" w:line="278" w:lineRule="auto"/>
-            </w:pPr>
-            <w:r>
-              <w:t>Activity × age × participation rate</w:t>
-            </w:r>
-          </w:p>
-        </w:tc>
-        <w:tc>
-          <w:tcPr>
-            <w:tcW w:w="2925" w:type="dxa"/>
-            <w:hideMark/>
-          </w:tcPr>
-          <w:p>
-            <w:pPr>
-              <w:spacing w:after="160" w:line="278" w:lineRule="auto"/>
-            </w:pPr>
-            <w:r>
-              <w:t>ABS activity and demographic data via TableBuilder / downloadable tables. (</w:t>
-            </w:r>
-            <w:hyperlink r:id="rId17" w:tooltip="Participation in Sport and Physical Recreation, Australia, 2013-14 financial year | Australian Bureau of Statistics" w:history="1">
-              <w:r>
-                <w:rPr>
-                  <w:rStyle w:val="Hyperlink"/>
-                </w:rPr>
-                <w:t>Australian Bureau of Statistics</w:t>
-              </w:r>
-            </w:hyperlink>
-            <w:r>
-              <w:t>)</w:t>
-            </w:r>
-          </w:p>
-        </w:tc>
-      </w:tr>
-      <w:tr>
-        <w:tc>
-          <w:tcPr>
-            <w:tcW w:w="0" w:type="auto"/>
-            <w:hideMark/>
-          </w:tcPr>
-          <w:p>
-            <w:pPr>
-              <w:spacing w:after="160" w:line="278" w:lineRule="auto"/>
-            </w:pPr>
-            <w:r>
-              <w:t>9</w:t>
-            </w:r>
-          </w:p>
-        </w:tc>
-        <w:tc>
-          <w:tcPr>
-            <w:tcW w:w="0" w:type="auto"/>
-            <w:hideMark/>
-          </w:tcPr>
-          <w:p>
-            <w:pPr>
-              <w:spacing w:after="160" w:line="278" w:lineRule="auto"/>
-            </w:pPr>
-            <w:r>
-              <w:t>Map 1 — Overall participation by state/territory</w:t>
-            </w:r>
-          </w:p>
-        </w:tc>
-        <w:tc>
-          <w:tcPr>
-            <w:tcW w:w="2207" w:type="dxa"/>
-            <w:hideMark/>
-          </w:tcPr>
-          <w:p>
-            <w:pPr>
-              <w:spacing w:after="160" w:line="278" w:lineRule="auto"/>
-            </w:pPr>
-            <w:r>
-              <w:t>Geography: Australian states/territories Colour: Overall participation rate</w:t>
-            </w:r>
-          </w:p>
-        </w:tc>
-        <w:tc>
-          <w:tcPr>
-            <w:tcW w:w="1701" w:type="dxa"/>
-            <w:hideMark/>
-          </w:tcPr>
-          <w:p>
-            <w:pPr>
-              <w:spacing w:after="160" w:line="278" w:lineRule="auto"/>
-            </w:pPr>
-            <w:r>
-              <w:t>State/territory × participation rate</w:t>
-            </w:r>
-          </w:p>
-        </w:tc>
-        <w:tc>
-          <w:tcPr>
-            <w:tcW w:w="2925" w:type="dxa"/>
-            <w:hideMark/>
-          </w:tcPr>
-          <w:p>
-            <w:pPr>
-              <w:spacing w:after="160" w:line="278" w:lineRule="auto"/>
-            </w:pPr>
-            <w:r>
-              <w:t xml:space="preserve">ABS Participation in Sport and Physical Recreation state/territory tables. The 2005–06 release explicitly contains a state/territory data cube, and the 2011–12 release provides </w:t>
-            </w:r>
-            <w:r>
-              <w:lastRenderedPageBreak/>
-              <w:t>separate state/territory data. (</w:t>
-            </w:r>
-            <w:hyperlink r:id="rId18" w:tooltip="4177.0 - Participation in Sports and Physical Recreation, Australia, 2005-06" w:history="1">
-              <w:r>
-                <w:rPr>
-                  <w:rStyle w:val="Hyperlink"/>
-                </w:rPr>
-                <w:t>Australian Bureau of Statistics</w:t>
-              </w:r>
-            </w:hyperlink>
-            <w:r>
-              <w:t>)</w:t>
-            </w:r>
-          </w:p>
-        </w:tc>
-      </w:tr>
-      <w:tr>
-        <w:tc>
-          <w:tcPr>
-            <w:tcW w:w="0" w:type="auto"/>
-            <w:hideMark/>
-          </w:tcPr>
-          <w:p>
-            <w:pPr>
-              <w:spacing w:after="160" w:line="278" w:lineRule="auto"/>
-            </w:pPr>
-            <w:r>
-              <w:lastRenderedPageBreak/>
-              <w:t>10</w:t>
-            </w:r>
-          </w:p>
-        </w:tc>
-        <w:tc>
-          <w:tcPr>
-            <w:tcW w:w="0" w:type="auto"/>
-            <w:hideMark/>
-          </w:tcPr>
-          <w:p>
-            <w:pPr>
-              <w:spacing w:after="160" w:line="278" w:lineRule="auto"/>
-            </w:pPr>
-            <w:r>
-              <w:t>Map 2 — Activity participation by state/territory</w:t>
-            </w:r>
-          </w:p>
-        </w:tc>
-        <w:tc>
-          <w:tcPr>
-            <w:tcW w:w="2207" w:type="dxa"/>
-            <w:hideMark/>
-          </w:tcPr>
-          <w:p>
-            <w:pPr>
-              <w:spacing w:after="160" w:line="278" w:lineRule="auto"/>
-            </w:pPr>
-            <w:r>
-              <w:t>Geography: States/territories Colour: Participation rate for one selected outdoor activity, e.g. cycling or walking</w:t>
-            </w:r>
-          </w:p>
-        </w:tc>
-        <w:tc>
-          <w:tcPr>
-            <w:tcW w:w="1701" w:type="dxa"/>
-            <w:hideMark/>
-          </w:tcPr>
-          <w:p>
-            <w:pPr>
-              <w:spacing w:after="160" w:line="278" w:lineRule="auto"/>
-            </w:pPr>
-            <w:r>
-              <w:t>State × activity × participation rate</w:t>
-            </w:r>
-          </w:p>
-        </w:tc>
-        <w:tc>
-          <w:tcPr>
-            <w:tcW w:w="2925" w:type="dxa"/>
-            <w:hideMark/>
-          </w:tcPr>
-          <w:p>
-            <w:pPr>
-              <w:spacing w:after="160" w:line="278" w:lineRule="auto"/>
-            </w:pPr>
-            <w:r>
-              <w:t>ABS state/territory data cubes and TableBuilder. The 2005–06 release contains separate activity tables for NSW, Victoria, Queensland, SA, WA, Tasmania, NT and ACT. (</w:t>
-            </w:r>
-            <w:hyperlink r:id="rId19" w:tooltip="4177.0 - Participation in Sports and Physical Recreation, Australia, 2005-06" w:history="1">
-              <w:r>
-                <w:rPr>
-                  <w:rStyle w:val="Hyperlink"/>
-                </w:rPr>
-                <w:t>Australian Bureau of Statistics</w:t>
-              </w:r>
-            </w:hyperlink>
-            <w:r>
-              <w:t>)</w:t>
-            </w:r>
-          </w:p>
-        </w:tc>
-      </w:tr>
-      <w:tr>
-        <w:tc>
-          <w:tcPr>
-            <w:tcW w:w="0" w:type="auto"/>
-            <w:hideMark/>
-          </w:tcPr>
-          <w:p>
-            <w:pPr>
-              <w:spacing w:after="160" w:line="278" w:lineRule="auto"/>
-            </w:pPr>
-            <w:r>
-              <w:t>11</w:t>
-            </w:r>
-          </w:p>
-        </w:tc>
-        <w:tc>
-          <w:tcPr>
-            <w:tcW w:w="0" w:type="auto"/>
-            <w:hideMark/>
-          </w:tcPr>
-          <w:p>
-            <w:pPr>
-              <w:spacing w:after="160" w:line="278" w:lineRule="auto"/>
-            </w:pPr>
-            <w:r>
-              <w:t>Map 3 — Participation by remoteness area</w:t>
-            </w:r>
-          </w:p>
-        </w:tc>
-        <w:tc>
-          <w:tcPr>
-            <w:tcW w:w="2207" w:type="dxa"/>
-            <w:hideMark/>
-          </w:tcPr>
-          <w:p>
-            <w:pPr>
-              <w:spacing w:after="160" w:line="278" w:lineRule="auto"/>
-            </w:pPr>
-            <w:r>
-              <w:t>Geography: Major Cities → Inner Regional → Outer Regional → Remote → Very Remote Colour: Participation rate</w:t>
-            </w:r>
-          </w:p>
-        </w:tc>
-        <w:tc>
-          <w:tcPr>
-            <w:tcW w:w="1701" w:type="dxa"/>
-            <w:hideMark/>
-          </w:tcPr>
-          <w:p>
-            <w:pPr>
-              <w:spacing w:after="160" w:line="278" w:lineRule="auto"/>
-            </w:pPr>
-            <w:r>
-              <w:t>Remoteness area × participation rate</w:t>
-            </w:r>
-          </w:p>
-        </w:tc>
-        <w:tc>
-          <w:tcPr>
-            <w:tcW w:w="2925" w:type="dxa"/>
-            <w:hideMark/>
-          </w:tcPr>
-          <w:p>
-            <w:pPr>
-              <w:spacing w:after="160" w:line="278" w:lineRule="auto"/>
-            </w:pPr>
-            <w:r>
-              <w:t>ABS TableBuilder person-level geography includes remoteness area. Combine this with ABS ASGS Remoteness Area boundaries for the map geometry. (</w:t>
-            </w:r>
-            <w:hyperlink r:id="rId20" w:tooltip="TableBuilder: Participation in Sport and Physical Recreation, Australia | Australian Bureau of Statistics" w:history="1">
-              <w:r>
-                <w:rPr>
-                  <w:rStyle w:val="Hyperlink"/>
-                </w:rPr>
-                <w:t>Australian Bureau of Statistics</w:t>
-              </w:r>
-            </w:hyperlink>
-            <w:r>
-              <w:t>)</w:t>
-            </w:r>
-          </w:p>
-        </w:tc>
-      </w:tr>
-      <w:tr>
-        <w:tc>
-          <w:tcPr>
-            <w:tcW w:w="0" w:type="auto"/>
-            <w:hideMark/>
-          </w:tcPr>
-          <w:p>
-            <w:pPr>
-              <w:spacing w:after="160" w:line="278" w:lineRule="auto"/>
-            </w:pPr>
-            <w:r>
-              <w:t>12</w:t>
-            </w:r>
-          </w:p>
-        </w:tc>
-        <w:tc>
-          <w:tcPr>
-            <w:tcW w:w="0" w:type="auto"/>
-            <w:hideMark/>
-          </w:tcPr>
-          <w:p>
-            <w:pPr>
-              <w:spacing w:after="160" w:line="278" w:lineRule="auto"/>
-            </w:pPr>
-            <w:r>
-              <w:t>Box plot — Geographic variation</w:t>
-            </w:r>
-          </w:p>
-          <w:p>
-            <w:pPr>
-              <w:spacing w:after="160" w:line="278" w:lineRule="auto"/>
-            </w:pPr>
-            <w:r>
-              <w:t>(</w:t>
-            </w:r>
-            <w:r>
-              <w:t>Advanced</w:t>
-            </w:r>
-            <w:r>
-              <w:t>)</w:t>
-            </w:r>
-          </w:p>
-        </w:tc>
-        <w:tc>
-          <w:tcPr>
-            <w:tcW w:w="2207" w:type="dxa"/>
-            <w:hideMark/>
-          </w:tcPr>
-          <w:p>
-            <w:pPr>
-              <w:spacing w:after="160" w:line="278" w:lineRule="auto"/>
-            </w:pPr>
-            <w:r>
-              <w:t xml:space="preserve">X: Activity </w:t>
-            </w:r>
-          </w:p>
-          <w:p>
-            <w:pPr>
-              <w:spacing w:after="160" w:line="278" w:lineRule="auto"/>
-            </w:pPr>
-            <w:r>
-              <w:t>Y: Participation rate Box: Distribution across states/territories</w:t>
-            </w:r>
-          </w:p>
-        </w:tc>
-        <w:tc>
-          <w:tcPr>
-            <w:tcW w:w="1701" w:type="dxa"/>
-            <w:hideMark/>
-          </w:tcPr>
-          <w:p>
-            <w:pPr>
-              <w:spacing w:after="160" w:line="278" w:lineRule="auto"/>
-            </w:pPr>
-            <w:r>
-              <w:t>State × activity × participation rate</w:t>
-            </w:r>
-          </w:p>
-        </w:tc>
-        <w:tc>
-          <w:tcPr>
-            <w:tcW w:w="2925" w:type="dxa"/>
-            <w:hideMark/>
-          </w:tcPr>
-          <w:p>
-            <w:pPr>
-              <w:spacing w:after="160" w:line="278" w:lineRule="auto"/>
-            </w:pPr>
-            <w:r>
-              <w:t>ABS state/territory data cubes / TableBuilder. The ABS provides state/territory-level activity data. (</w:t>
-            </w:r>
-            <w:hyperlink r:id="rId21" w:tooltip="4177.0 - Participation in Sports and Physical Recreation, Australia, 2005-06" w:history="1">
-              <w:r>
-                <w:rPr>
-                  <w:rStyle w:val="Hyperlink"/>
-                </w:rPr>
-                <w:t>Australian Bureau of Statistics</w:t>
-              </w:r>
-            </w:hyperlink>
-            <w:r>
-              <w:t>)</w:t>
-            </w:r>
-          </w:p>
-        </w:tc>
-      </w:tr>
-      <w:tr>
-        <w:tc>
-          <w:tcPr>
-            <w:tcW w:w="0" w:type="auto"/>
-            <w:hideMark/>
-          </w:tcPr>
-          <w:p>
-            <w:pPr>
-              <w:spacing w:after="160" w:line="278" w:lineRule="auto"/>
-            </w:pPr>
-            <w:r>
-              <w:t>13</w:t>
-            </w:r>
-          </w:p>
-        </w:tc>
-        <w:tc>
-          <w:tcPr>
-            <w:tcW w:w="0" w:type="auto"/>
-            <w:hideMark/>
-          </w:tcPr>
-          <w:p>
-            <w:pPr>
-              <w:spacing w:after="160" w:line="278" w:lineRule="auto"/>
-            </w:pPr>
-            <w:r>
-              <w:t>Connected scatterplot — Participation vs frequency</w:t>
-            </w:r>
-          </w:p>
-          <w:p>
-            <w:pPr>
-              <w:spacing w:after="160" w:line="278" w:lineRule="auto"/>
-            </w:pPr>
-            <w:r>
-              <w:t>(</w:t>
-            </w:r>
-            <w:r>
-              <w:t>Advanced</w:t>
-            </w:r>
-            <w:r>
-              <w:t>)</w:t>
-            </w:r>
-          </w:p>
-        </w:tc>
-        <w:tc>
-          <w:tcPr>
-            <w:tcW w:w="2207" w:type="dxa"/>
-            <w:hideMark/>
-          </w:tcPr>
-          <w:p>
-            <w:pPr>
-              <w:spacing w:after="160" w:line="278" w:lineRule="auto"/>
-            </w:pPr>
-            <w:r>
-              <w:t>X: Participation rate Y: Participation frequency Point: Activity Connection: Earlier → later year</w:t>
-            </w:r>
-          </w:p>
-        </w:tc>
-        <w:tc>
-          <w:tcPr>
-            <w:tcW w:w="1701" w:type="dxa"/>
-            <w:hideMark/>
-          </w:tcPr>
-          <w:p>
-            <w:pPr>
-              <w:spacing w:after="160" w:line="278" w:lineRule="auto"/>
-            </w:pPr>
-            <w:r>
-              <w:t>Activity × participation rate × frequency × year</w:t>
-            </w:r>
-          </w:p>
-        </w:tc>
-        <w:tc>
-          <w:tcPr>
-            <w:tcW w:w="2925" w:type="dxa"/>
-            <w:hideMark/>
-          </w:tcPr>
-          <w:p>
-            <w:pPr>
-              <w:spacing w:after="160" w:line="278" w:lineRule="auto"/>
-            </w:pPr>
-            <w:r>
-              <w:t>ABS activity-level frequency data. The 2005–06 release specifically contains a table for selected activities by frequency, and later releases provide comparable measures where available. (</w:t>
-            </w:r>
-            <w:hyperlink r:id="rId22" w:tooltip="4177.0 - Participation in Sports and Physical Recreation, Australia, 2005-06" w:history="1">
-              <w:r>
-                <w:rPr>
-                  <w:rStyle w:val="Hyperlink"/>
-                </w:rPr>
-                <w:t>Australian Bureau of Statistics</w:t>
-              </w:r>
-            </w:hyperlink>
-            <w:r>
-              <w:t>)</w:t>
-            </w:r>
-          </w:p>
-        </w:tc>
-      </w:tr>
-      <w:tr>
-        <w:tc>
-          <w:tcPr>
-            <w:tcW w:w="0" w:type="auto"/>
-            <w:hideMark/>
-          </w:tcPr>
-          <w:p>
-            <w:pPr>
-              <w:spacing w:after="160" w:line="278" w:lineRule="auto"/>
-            </w:pPr>
-            <w:r>
-              <w:t>14</w:t>
-            </w:r>
-          </w:p>
-        </w:tc>
-        <w:tc>
-          <w:tcPr>
-            <w:tcW w:w="0" w:type="auto"/>
-            <w:hideMark/>
-          </w:tcPr>
-          <w:p>
-            <w:pPr>
-              <w:spacing w:after="160" w:line="278" w:lineRule="auto"/>
-            </w:pPr>
-            <w:r>
-              <w:t>Area chart — Changing activity composition</w:t>
-            </w:r>
-          </w:p>
-          <w:p>
-            <w:pPr>
-              <w:spacing w:after="160" w:line="278" w:lineRule="auto"/>
-            </w:pPr>
-            <w:r>
-              <w:rPr>
-                <w:b/>
-                <w:bCs/>
-              </w:rPr>
-              <w:lastRenderedPageBreak/>
-              <w:t>(</w:t>
-            </w:r>
-            <w:r>
-              <w:t>Basic</w:t>
-            </w:r>
-            <w:r>
-              <w:t xml:space="preserve">) </w:t>
-            </w:r>
-          </w:p>
-        </w:tc>
-        <w:tc>
-          <w:tcPr>
-            <w:tcW w:w="2207" w:type="dxa"/>
-            <w:hideMark/>
-          </w:tcPr>
-          <w:p>
-            <w:pPr>
-              <w:spacing w:after="160" w:line="278" w:lineRule="auto"/>
-            </w:pPr>
-            <w:r>
-              <w:lastRenderedPageBreak/>
-              <w:t xml:space="preserve">X: Survey year </w:t>
-            </w:r>
-          </w:p>
-          <w:p>
-            <w:pPr>
-              <w:spacing w:after="160" w:line="278" w:lineRule="auto"/>
-            </w:pPr>
-            <w:r>
-              <w:lastRenderedPageBreak/>
-              <w:t>Y: Participation rate/share Areas: Selected activities</w:t>
-            </w:r>
-          </w:p>
-        </w:tc>
-        <w:tc>
-          <w:tcPr>
-            <w:tcW w:w="1701" w:type="dxa"/>
-            <w:hideMark/>
-          </w:tcPr>
-          <w:p>
-            <w:pPr>
-              <w:spacing w:after="160" w:line="278" w:lineRule="auto"/>
-            </w:pPr>
-            <w:r>
-              <w:lastRenderedPageBreak/>
-              <w:t>Activity × year × participation rate</w:t>
-            </w:r>
-          </w:p>
-        </w:tc>
-        <w:tc>
-          <w:tcPr>
-            <w:tcW w:w="2925" w:type="dxa"/>
-            <w:hideMark/>
-          </w:tcPr>
-          <w:p>
-            <w:pPr>
-              <w:spacing w:after="160" w:line="278" w:lineRule="auto"/>
-            </w:pPr>
-            <w:r>
-              <w:t xml:space="preserve">ABS historical Participation in Sport and Physical Recreation releases. Use only activities that can be </w:t>
-            </w:r>
-            <w:r>
-              <w:lastRenderedPageBreak/>
-              <w:t>compared consistently across the selected survey years. (</w:t>
-            </w:r>
-            <w:hyperlink r:id="rId23" w:tooltip="4177.0 - Participation in Sports and Physical Recreation, Australia, 2005-06" w:history="1">
-              <w:r>
-                <w:rPr>
-                  <w:rStyle w:val="Hyperlink"/>
-                </w:rPr>
-                <w:t>Australian Bureau of Statistics</w:t>
-              </w:r>
-            </w:hyperlink>
-            <w:r>
-              <w:t>)</w:t>
-            </w:r>
-          </w:p>
-        </w:tc>
-      </w:tr>
-      <w:tr>
-        <w:tc>
-          <w:tcPr>
-            <w:tcW w:w="0" w:type="auto"/>
-            <w:hideMark/>
-          </w:tcPr>
-          <w:p>
-            <w:pPr>
-              <w:spacing w:after="160" w:line="278" w:lineRule="auto"/>
-            </w:pPr>
-            <w:r>
-              <w:lastRenderedPageBreak/>
-              <w:t>15</w:t>
-            </w:r>
-          </w:p>
-        </w:tc>
-        <w:tc>
-          <w:tcPr>
-            <w:tcW w:w="0" w:type="auto"/>
-            <w:hideMark/>
-          </w:tcPr>
-          <w:p>
-            <w:pPr>
-              <w:spacing w:after="160" w:line="278" w:lineRule="auto"/>
-            </w:pPr>
-            <w:r>
-              <w:t>Radar chart — Outdoor activity profiles</w:t>
-            </w:r>
-          </w:p>
-          <w:p>
-            <w:pPr>
-              <w:spacing w:after="160" w:line="278" w:lineRule="auto"/>
-            </w:pPr>
-            <w:r>
-              <w:t>(</w:t>
-            </w:r>
-            <w:r>
-              <w:t>Advanced</w:t>
-            </w:r>
-            <w:r>
-              <w:t>)</w:t>
-            </w:r>
-          </w:p>
-        </w:tc>
-        <w:tc>
-          <w:tcPr>
-            <w:tcW w:w="2207" w:type="dxa"/>
-            <w:hideMark/>
-          </w:tcPr>
-          <w:p>
-            <w:pPr>
-              <w:spacing w:after="160" w:line="278" w:lineRule="auto"/>
-            </w:pPr>
-            <w:r>
-              <w:t>Axes: Overall participation, younger participation, older participation, male participation, female participation, frequent participation Shape: Activity</w:t>
-            </w:r>
-          </w:p>
-        </w:tc>
-        <w:tc>
-          <w:tcPr>
-            <w:tcW w:w="1701" w:type="dxa"/>
-            <w:hideMark/>
-          </w:tcPr>
-          <w:p>
-            <w:pPr>
-              <w:spacing w:after="160" w:line="278" w:lineRule="auto"/>
-            </w:pPr>
-            <w:r>
-              <w:t>Activity × demographic × frequency</w:t>
-            </w:r>
-          </w:p>
-        </w:tc>
-        <w:tc>
-          <w:tcPr>
-            <w:tcW w:w="2925" w:type="dxa"/>
-            <w:hideMark/>
-          </w:tcPr>
-          <w:p>
-            <w:pPr>
-              <w:spacing w:after="160" w:line="278" w:lineRule="auto"/>
-            </w:pPr>
-            <w:r>
-              <w:t>ABS TableBuilder. Person-level demographics can be combined with activity-level information. (</w:t>
-            </w:r>
-            <w:hyperlink r:id="rId24" w:tooltip="TableBuilder: Participation in Sport and Physical Recreation, Australia | Australian Bureau of Statistics" w:history="1">
-              <w:r>
-                <w:rPr>
-                  <w:rStyle w:val="Hyperlink"/>
-                </w:rPr>
-                <w:t>Australian Bureau of Statistics</w:t>
-              </w:r>
-            </w:hyperlink>
-            <w:r>
-              <w:t>)</w:t>
-            </w:r>
-          </w:p>
-        </w:tc>
-      </w:tr>
-      <w:tr>
-        <w:tc>
-          <w:tcPr>
-            <w:tcW w:w="0" w:type="auto"/>
-            <w:hideMark/>
-          </w:tcPr>
-          <w:p>
-            <w:pPr>
-              <w:spacing w:after="160" w:line="278" w:lineRule="auto"/>
-            </w:pPr>
-            <w:r>
-              <w:t>16</w:t>
-            </w:r>
-          </w:p>
-        </w:tc>
-        <w:tc>
-          <w:tcPr>
-            <w:tcW w:w="0" w:type="auto"/>
-            <w:hideMark/>
-          </w:tcPr>
-          <w:p>
-            <w:pPr>
-              <w:spacing w:after="160" w:line="278" w:lineRule="auto"/>
-            </w:pPr>
-            <w:r>
-              <w:t>Lollipop chart — Demographic participation gaps</w:t>
-            </w:r>
-          </w:p>
-          <w:p>
-            <w:pPr>
-              <w:spacing w:after="160" w:line="278" w:lineRule="auto"/>
-            </w:pPr>
-            <w:r>
-              <w:t>(</w:t>
-            </w:r>
-            <w:r>
-              <w:t>Advanced</w:t>
-            </w:r>
-            <w:r>
-              <w:t>)</w:t>
-            </w:r>
-          </w:p>
-        </w:tc>
-        <w:tc>
-          <w:tcPr>
-            <w:tcW w:w="2207" w:type="dxa"/>
-            <w:hideMark/>
-          </w:tcPr>
-          <w:p>
-            <w:pPr>
-              <w:spacing w:after="160" w:line="278" w:lineRule="auto"/>
-            </w:pPr>
-            <w:r>
-              <w:t xml:space="preserve">X: Participation-rate difference </w:t>
-            </w:r>
-          </w:p>
-          <w:p>
-            <w:pPr>
-              <w:spacing w:after="160" w:line="278" w:lineRule="auto"/>
-            </w:pPr>
-            <w:r>
-              <w:t xml:space="preserve">Y: Activity </w:t>
-            </w:r>
-          </w:p>
-          <w:p>
-            <w:pPr>
-              <w:spacing w:after="160" w:line="278" w:lineRule="auto"/>
-            </w:pPr>
-            <w:r>
-              <w:t>Marks: Difference between selected demographic groups, e.g. male − female</w:t>
-            </w:r>
-          </w:p>
-        </w:tc>
-        <w:tc>
-          <w:tcPr>
-            <w:tcW w:w="1701" w:type="dxa"/>
-            <w:hideMark/>
-          </w:tcPr>
-          <w:p>
-            <w:pPr>
-              <w:spacing w:after="160" w:line="278" w:lineRule="auto"/>
-            </w:pPr>
-            <w:r>
-              <w:t>Activity × sex × participation rate</w:t>
-            </w:r>
-          </w:p>
-        </w:tc>
-        <w:tc>
-          <w:tcPr>
-            <w:tcW w:w="2925" w:type="dxa"/>
-            <w:hideMark/>
-          </w:tcPr>
-          <w:p>
-            <w:pPr>
-              <w:spacing w:after="160" w:line="278" w:lineRule="auto"/>
-            </w:pPr>
-            <w:r>
-              <w:t>ABS activity × sex tables / TableBuilder. The ABS provides activity-by-sex data; 2005–06, for example, reports substantial differences for walking, cycling and golf. (</w:t>
-            </w:r>
-            <w:hyperlink r:id="rId25" w:tooltip="4177.0 - Participation in Sports and Physical Recreation, Australia, 2005-06" w:history="1">
-              <w:r>
-                <w:rPr>
-                  <w:rStyle w:val="Hyperlink"/>
-                </w:rPr>
-                <w:t>Australian Bureau of Statistics</w:t>
-              </w:r>
-            </w:hyperlink>
-            <w:r>
-              <w:t>)</w:t>
-            </w:r>
-          </w:p>
-        </w:tc>
-      </w:tr>
-    </w:tbl>
-    <w:p>
-      <w:pPr>
         <w:rPr>
           <w:b/>
           <w:bCs/>
         </w:rPr>
-      </w:pPr>
-      <w:r>
-        <w:rPr>
-          <w:b/>
-          <w:bCs/>
-        </w:rPr>
-        <w:br w:type="page"/>
-      </w:r>
-    </w:p>
-    <w:p>
-      <w:pPr>
-        <w:rPr>
-          <w:b/>
-          <w:bCs/>
-        </w:rPr>
-      </w:pPr>
-      <w:r>
-        <w:rPr>
-          <w:b/>
-          <w:bCs/>
-        </w:rPr>
-        <w:lastRenderedPageBreak/>
-        <w:t>Draft 1 — Australia: "From Backyard to Bushland"</w:t>
-      </w:r>
-    </w:p>
-    <w:p>
-      <w:r>
-        <w:rPr>
-          <w:b/>
-          <w:bCs/>
-        </w:rPr>
-        <w:t>Framing:</w:t>
-      </w:r>
-      <w:r>
-        <w:t xml:space="preserve"> Outdoor recreation participation has shifted since COVID-19 reshaped Australian lifestyles — this draft traces who's going outdoors, where, and how that's changing.</w:t>
-      </w:r>
-    </w:p>
-    <w:p>
-      <w:r>
-        <w:rPr>
-          <w:b/>
-          <w:bCs/>
-        </w:rPr>
-        <w:t>Data sources:</w:t>
-      </w:r>
-      <w:r>
-        <w:t xml:space="preserve"> AusPlay survey (Sport Australia/Clearinghouse for Sport), ABS Time Use Survey, Tourism Research Australia National Visitor Survey, state National Parks visitation reports, Strava Global Heatmap (open data).</w:t>
-      </w:r>
-    </w:p>
-    <w:tbl>
-      <w:tblPr>
-        <w:tblStyle w:val="TableGrid"/>
-        <w:tblW w:w="0" w:type="auto"/>
-        <w:tblLook w:val="04A0" w:firstRow="1" w:lastRow="0" w:firstColumn="1" w:lastColumn="0" w:noHBand="0" w:noVBand="1"/>
-      </w:tblPr>
-      <w:tblGrid>
-        <w:gridCol w:w="1547"/>
-        <w:gridCol w:w="2134"/>
-        <w:gridCol w:w="5335"/>
-      </w:tblGrid>
-      <w:tr>
-        <w:tc>
-          <w:tcPr>
-            <w:tcW w:w="1547" w:type="dxa"/>
-            <w:hideMark/>
-          </w:tcPr>
-          <w:p>
-            <w:pPr>
-              <w:spacing w:after="160" w:line="278" w:lineRule="auto"/>
-              <w:rPr>
-                <w:b/>
-                <w:bCs/>
-              </w:rPr>
-            </w:pPr>
-            <w:r>
-              <w:rPr>
-                <w:b/>
-                <w:bCs/>
-              </w:rPr>
-              <w:t>Section</w:t>
-            </w:r>
-          </w:p>
-        </w:tc>
-        <w:tc>
-          <w:tcPr>
-            <w:tcW w:w="2134" w:type="dxa"/>
-            <w:hideMark/>
-          </w:tcPr>
-          <w:p>
-            <w:pPr>
-              <w:spacing w:after="160" w:line="278" w:lineRule="auto"/>
-              <w:rPr>
-                <w:b/>
-                <w:bCs/>
-              </w:rPr>
-            </w:pPr>
-            <w:r>
-              <w:rPr>
-                <w:b/>
-                <w:bCs/>
-              </w:rPr>
-              <w:t>Purpose</w:t>
-            </w:r>
-          </w:p>
-        </w:tc>
-        <w:tc>
-          <w:tcPr>
-            <w:tcW w:w="5335" w:type="dxa"/>
-            <w:hideMark/>
-          </w:tcPr>
-          <w:p>
-            <w:pPr>
-              <w:spacing w:after="160" w:line="278" w:lineRule="auto"/>
-              <w:rPr>
-                <w:b/>
-                <w:bCs/>
-              </w:rPr>
-            </w:pPr>
-            <w:r>
-              <w:rPr>
-                <w:b/>
-                <w:bCs/>
-              </w:rPr>
-              <w:t>Visual(s)</w:t>
-            </w:r>
-          </w:p>
-        </w:tc>
-      </w:tr>
-      <w:tr>
-        <w:tc>
-          <w:tcPr>
-            <w:tcW w:w="1547" w:type="dxa"/>
-            <w:hideMark/>
-          </w:tcPr>
-          <w:p>
-            <w:pPr>
-              <w:spacing w:after="160" w:line="278" w:lineRule="auto"/>
-            </w:pPr>
-            <w:r>
-              <w:rPr>
-                <w:b/>
-                <w:bCs/>
-              </w:rPr>
-              <w:t>1. Hook</w:t>
-            </w:r>
-          </w:p>
-        </w:tc>
-        <w:tc>
-          <w:tcPr>
-            <w:tcW w:w="2134" w:type="dxa"/>
-            <w:hideMark/>
-          </w:tcPr>
-          <w:p>
-            <w:pPr>
-              <w:spacing w:after="160" w:line="278" w:lineRule="auto"/>
-            </w:pPr>
-            <w:r>
-              <w:t>Establish scale of participation nationally</w:t>
-            </w:r>
-          </w:p>
-        </w:tc>
-        <w:tc>
-          <w:tcPr>
-            <w:tcW w:w="5335" w:type="dxa"/>
-            <w:hideMark/>
-          </w:tcPr>
-          <w:p>
-            <w:pPr>
-              <w:spacing w:after="160" w:line="278" w:lineRule="auto"/>
-            </w:pPr>
-            <w:r>
-              <w:t xml:space="preserve">(1) </w:t>
-            </w:r>
-            <w:r>
-              <w:rPr>
-                <w:b/>
-                <w:bCs/>
-              </w:rPr>
-              <w:t>Choropleth map</w:t>
-            </w:r>
-            <w:r>
-              <w:t xml:space="preserve"> — outdoor rec participation rate by state/territory </w:t>
-            </w:r>
-          </w:p>
-          <w:p>
-            <w:pPr>
-              <w:spacing w:after="160" w:line="278" w:lineRule="auto"/>
-            </w:pPr>
-            <w:r>
-              <w:t>(2) Big-number annotation callout — "X% of Australians took part in an outdoor activity last year"</w:t>
-            </w:r>
-          </w:p>
-        </w:tc>
-      </w:tr>
-      <w:tr>
-        <w:tc>
-          <w:tcPr>
-            <w:tcW w:w="1547" w:type="dxa"/>
-            <w:hideMark/>
-          </w:tcPr>
-          <w:p>
-            <w:pPr>
-              <w:spacing w:after="160" w:line="278" w:lineRule="auto"/>
-            </w:pPr>
-            <w:r>
-              <w:rPr>
-                <w:b/>
-                <w:bCs/>
-              </w:rPr>
-              <w:t>2. The Trend Over Time</w:t>
-            </w:r>
-          </w:p>
-        </w:tc>
-        <w:tc>
-          <w:tcPr>
-            <w:tcW w:w="2134" w:type="dxa"/>
-            <w:hideMark/>
-          </w:tcPr>
-          <w:p>
-            <w:pPr>
-              <w:spacing w:after="160" w:line="278" w:lineRule="auto"/>
-            </w:pPr>
-            <w:r>
-              <w:t>Show the historical/COVID shift</w:t>
-            </w:r>
-          </w:p>
-        </w:tc>
-        <w:tc>
-          <w:tcPr>
-            <w:tcW w:w="5335" w:type="dxa"/>
-            <w:hideMark/>
-          </w:tcPr>
-          <w:p>
-            <w:pPr>
-              <w:spacing w:after="160" w:line="278" w:lineRule="auto"/>
-            </w:pPr>
-            <w:r>
-              <w:t xml:space="preserve">(3) Multi-line chart — participation rate 2015–2024 for hiking, camping, cycling </w:t>
-            </w:r>
-          </w:p>
-          <w:p>
-            <w:pPr>
-              <w:spacing w:after="160" w:line="278" w:lineRule="auto"/>
-            </w:pPr>
-            <w:r>
-              <w:t>(4) Stacked area chart — share of population by activity type over time</w:t>
-            </w:r>
-          </w:p>
-        </w:tc>
-      </w:tr>
-      <w:tr>
-        <w:tc>
-          <w:tcPr>
-            <w:tcW w:w="1547" w:type="dxa"/>
-            <w:hideMark/>
-          </w:tcPr>
-          <w:p>
-            <w:pPr>
-              <w:spacing w:after="160" w:line="278" w:lineRule="auto"/>
-            </w:pPr>
-            <w:r>
-              <w:rPr>
-                <w:b/>
-                <w:bCs/>
-              </w:rPr>
-              <w:t>3. Who's Going Outdoors</w:t>
-            </w:r>
-          </w:p>
-        </w:tc>
-        <w:tc>
-          <w:tcPr>
-            <w:tcW w:w="2134" w:type="dxa"/>
-            <w:hideMark/>
-          </w:tcPr>
-          <w:p>
-            <w:pPr>
-              <w:spacing w:after="160" w:line="278" w:lineRule="auto"/>
-            </w:pPr>
-            <w:r>
-              <w:t>Demographic breakdown</w:t>
-            </w:r>
-          </w:p>
-        </w:tc>
-        <w:tc>
-          <w:tcPr>
-            <w:tcW w:w="5335" w:type="dxa"/>
-            <w:hideMark/>
-          </w:tcPr>
-          <w:p>
-            <w:pPr>
-              <w:spacing w:after="160" w:line="278" w:lineRule="auto"/>
-            </w:pPr>
-            <w:r>
-              <w:t xml:space="preserve">(5) Diverging bar chart — participation rate by age group </w:t>
-            </w:r>
-          </w:p>
-          <w:p>
-            <w:pPr>
-              <w:spacing w:after="160" w:line="278" w:lineRule="auto"/>
-            </w:pPr>
-            <w:r>
-              <w:t>(6) Small multiples — age-group trend lines per activity (shows "changing lifestyle trends" explicitly)</w:t>
-            </w:r>
-          </w:p>
-        </w:tc>
-      </w:tr>
-      <w:tr>
-        <w:tc>
-          <w:tcPr>
-            <w:tcW w:w="1547" w:type="dxa"/>
-            <w:hideMark/>
-          </w:tcPr>
-          <w:p>
-            <w:pPr>
-              <w:spacing w:after="160" w:line="278" w:lineRule="auto"/>
-            </w:pPr>
-            <w:r>
-              <w:rPr>
-                <w:b/>
-                <w:bCs/>
-              </w:rPr>
-              <w:t>4. Where They're Going</w:t>
-            </w:r>
-          </w:p>
-        </w:tc>
-        <w:tc>
-          <w:tcPr>
-            <w:tcW w:w="2134" w:type="dxa"/>
-            <w:hideMark/>
-          </w:tcPr>
-          <w:p>
-            <w:pPr>
-              <w:spacing w:after="160" w:line="278" w:lineRule="auto"/>
-            </w:pPr>
-            <w:r>
-              <w:t>Spatial pattern of activity</w:t>
-            </w:r>
-          </w:p>
-        </w:tc>
-        <w:tc>
-          <w:tcPr>
-            <w:tcW w:w="5335" w:type="dxa"/>
-            <w:hideMark/>
-          </w:tcPr>
-          <w:p>
-            <w:pPr>
-              <w:spacing w:after="160" w:line="278" w:lineRule="auto"/>
-            </w:pPr>
-            <w:r>
-              <w:t xml:space="preserve">(7) </w:t>
-            </w:r>
-            <w:r>
-              <w:rPr>
-                <w:b/>
-                <w:bCs/>
-              </w:rPr>
-              <w:t>Map</w:t>
-            </w:r>
-            <w:r>
-              <w:t xml:space="preserve"> — National Parks visitor density/hotspots (heatmap or proportional symbols) </w:t>
-            </w:r>
-          </w:p>
-          <w:p>
-            <w:pPr>
-              <w:spacing w:after="160" w:line="278" w:lineRule="auto"/>
-            </w:pPr>
-            <w:r>
-              <w:t xml:space="preserve">(8) </w:t>
-            </w:r>
-            <w:r>
-              <w:rPr>
-                <w:b/>
-                <w:bCs/>
-              </w:rPr>
-              <w:t>Map</w:t>
-            </w:r>
-            <w:r>
-              <w:t xml:space="preserve"> — capital-city cycling participation/infrastructure overlay</w:t>
-            </w:r>
-          </w:p>
-        </w:tc>
-      </w:tr>
-      <w:tr>
-        <w:tc>
-          <w:tcPr>
-            <w:tcW w:w="1547" w:type="dxa"/>
-            <w:hideMark/>
-          </w:tcPr>
-          <w:p>
-            <w:pPr>
-              <w:spacing w:after="160" w:line="278" w:lineRule="auto"/>
-            </w:pPr>
-            <w:r>
-              <w:rPr>
-                <w:b/>
-                <w:bCs/>
-              </w:rPr>
-              <w:t>5. Why It's Changing</w:t>
-            </w:r>
-          </w:p>
-        </w:tc>
-        <w:tc>
-          <w:tcPr>
-            <w:tcW w:w="2134" w:type="dxa"/>
-            <w:hideMark/>
-          </w:tcPr>
-          <w:p>
-            <w:pPr>
-              <w:spacing w:after="160" w:line="278" w:lineRule="auto"/>
-            </w:pPr>
-            <w:r>
-              <w:t>Drivers behind the trend</w:t>
-            </w:r>
-          </w:p>
-        </w:tc>
-        <w:tc>
-          <w:tcPr>
-            <w:tcW w:w="5335" w:type="dxa"/>
-            <w:hideMark/>
-          </w:tcPr>
-          <w:p>
-            <w:pPr>
-              <w:spacing w:after="160" w:line="278" w:lineRule="auto"/>
-            </w:pPr>
-            <w:r>
-              <w:t>(9) Scatter/bubble chart — urbanisation rate vs. outdoor participation change</w:t>
-            </w:r>
-            <w:r>
-              <w:t>S</w:t>
-            </w:r>
-            <w:r>
-              <w:t xml:space="preserve"> (bubble size = population) </w:t>
-            </w:r>
-          </w:p>
-          <w:p>
-            <w:pPr>
-              <w:spacing w:after="160" w:line="278" w:lineRule="auto"/>
-            </w:pPr>
-            <w:r>
-              <w:t>(10) Slope chart — pre- vs. post-COVID participation shift by activity</w:t>
-            </w:r>
-          </w:p>
-        </w:tc>
-      </w:tr>
-      <w:tr>
-        <w:tc>
-          <w:tcPr>
-            <w:tcW w:w="1547" w:type="dxa"/>
-            <w:hideMark/>
-          </w:tcPr>
-          <w:p>
-            <w:pPr>
-              <w:spacing w:after="160" w:line="278" w:lineRule="auto"/>
-            </w:pPr>
-            <w:r>
-              <w:rPr>
-                <w:b/>
-                <w:bCs/>
-              </w:rPr>
-              <w:t>6. Takeaway</w:t>
-            </w:r>
-          </w:p>
-        </w:tc>
-        <w:tc>
-          <w:tcPr>
-            <w:tcW w:w="2134" w:type="dxa"/>
-            <w:hideMark/>
-          </w:tcPr>
-          <w:p>
-            <w:pPr>
-              <w:spacing w:after="160" w:line="278" w:lineRule="auto"/>
-            </w:pPr>
-            <w:r>
-              <w:t>Synthesis + call to explore</w:t>
-            </w:r>
-          </w:p>
-        </w:tc>
-        <w:tc>
-          <w:tcPr>
-            <w:tcW w:w="5335" w:type="dxa"/>
-            <w:hideMark/>
-          </w:tcPr>
-          <w:p>
-            <w:pPr>
-              <w:spacing w:after="160" w:line="278" w:lineRule="auto"/>
-            </w:pPr>
-            <w:r>
-              <w:t>(11) Annotated summary dashboard/infographic tying findings together, with interactive filter left open for user exploration</w:t>
-            </w:r>
-          </w:p>
-        </w:tc>
-      </w:tr>
-    </w:tbl>
-    <w:p>
-      <w:r>
-        <w:t>3 maps: state choropleth, park-visitation map, city cycling map. 11 visuals total.</w:t>
-      </w:r>
-    </w:p>
-    <w:p>
-      <w:r>
-        <w:lastRenderedPageBreak/>
-        <w:t>Claude</w:t>
-      </w:r>
-    </w:p>
-    <w:tbl>
-      <w:tblPr>
-        <w:tblStyle w:val="TableGrid"/>
-        <w:tblW w:w="0" w:type="auto"/>
-        <w:tblLook w:val="04A0" w:firstRow="1" w:lastRow="0" w:firstColumn="1" w:lastColumn="0" w:noHBand="0" w:noVBand="1"/>
-      </w:tblPr>
-      <w:tblGrid>
-        <w:gridCol w:w="338"/>
-        <w:gridCol w:w="1702"/>
-        <w:gridCol w:w="4102"/>
-        <w:gridCol w:w="2874"/>
-      </w:tblGrid>
-      <w:tr>
-        <w:tc>
-          <w:tcPr>
-            <w:tcW w:w="0" w:type="auto"/>
-            <w:hideMark/>
-          </w:tcPr>
-          <w:p>
-            <w:pPr>
-              <w:spacing w:after="160" w:line="278" w:lineRule="auto"/>
-              <w:rPr>
-                <w:b/>
-                <w:bCs/>
-              </w:rPr>
-            </w:pPr>
-            <w:r>
-              <w:rPr>
-                <w:b/>
-                <w:bCs/>
-              </w:rPr>
-              <w:t>#</w:t>
-            </w:r>
-          </w:p>
-        </w:tc>
-        <w:tc>
-          <w:tcPr>
-            <w:tcW w:w="0" w:type="auto"/>
-            <w:hideMark/>
-          </w:tcPr>
-          <w:p>
-            <w:pPr>
-              <w:spacing w:after="160" w:line="278" w:lineRule="auto"/>
-              <w:rPr>
-                <w:b/>
-                <w:bCs/>
-              </w:rPr>
-            </w:pPr>
-            <w:r>
-              <w:rPr>
-                <w:b/>
-                <w:bCs/>
-              </w:rPr>
-              <w:t>Section</w:t>
-            </w:r>
-          </w:p>
-        </w:tc>
-        <w:tc>
-          <w:tcPr>
-            <w:tcW w:w="0" w:type="auto"/>
-            <w:hideMark/>
-          </w:tcPr>
-          <w:p>
-            <w:pPr>
-              <w:spacing w:after="160" w:line="278" w:lineRule="auto"/>
-              <w:rPr>
-                <w:b/>
-                <w:bCs/>
-              </w:rPr>
-            </w:pPr>
-            <w:r>
-              <w:rPr>
-                <w:b/>
-                <w:bCs/>
-              </w:rPr>
-              <w:t>Purpose (Why)</w:t>
-            </w:r>
-          </w:p>
-        </w:tc>
-        <w:tc>
-          <w:tcPr>
-            <w:tcW w:w="0" w:type="auto"/>
-            <w:hideMark/>
-          </w:tcPr>
-          <w:p>
-            <w:pPr>
-              <w:spacing w:after="160" w:line="278" w:lineRule="auto"/>
-              <w:rPr>
-                <w:b/>
-                <w:bCs/>
-              </w:rPr>
-            </w:pPr>
-            <w:r>
-              <w:rPr>
-                <w:b/>
-                <w:bCs/>
-              </w:rPr>
-              <w:t>Visuals in this section</w:t>
-            </w:r>
-          </w:p>
-        </w:tc>
-      </w:tr>
-      <w:tr>
-        <w:tc>
-          <w:tcPr>
-            <w:tcW w:w="0" w:type="auto"/>
-            <w:hideMark/>
-          </w:tcPr>
-          <w:p>
-            <w:pPr>
-              <w:spacing w:after="160" w:line="278" w:lineRule="auto"/>
-            </w:pPr>
-            <w:r>
-              <w:t>1</w:t>
-            </w:r>
-          </w:p>
-        </w:tc>
-        <w:tc>
-          <w:tcPr>
-            <w:tcW w:w="0" w:type="auto"/>
-            <w:hideMark/>
-          </w:tcPr>
-          <w:p>
-            <w:pPr>
-              <w:spacing w:after="160" w:line="278" w:lineRule="auto"/>
-            </w:pPr>
-            <w:r>
-              <w:rPr>
-                <w:b/>
-                <w:bCs/>
-              </w:rPr>
-              <w:t>The Great Outdoors, By the Numbers</w:t>
-            </w:r>
-          </w:p>
-        </w:tc>
-        <w:tc>
-          <w:tcPr>
-            <w:tcW w:w="0" w:type="auto"/>
-            <w:hideMark/>
-          </w:tcPr>
-          <w:p>
-            <w:pPr>
-              <w:spacing w:after="160" w:line="278" w:lineRule="auto"/>
-            </w:pPr>
-            <w:r>
-              <w:t>Establish national scale and surface regional variation invisible in a single national statistic</w:t>
-            </w:r>
-          </w:p>
-        </w:tc>
-        <w:tc>
-          <w:tcPr>
-            <w:tcW w:w="0" w:type="auto"/>
-            <w:hideMark/>
-          </w:tcPr>
-          <w:p>
-            <w:pPr>
-              <w:spacing w:after="160" w:line="278" w:lineRule="auto"/>
-            </w:pPr>
-            <w:r>
-              <w:t>Choropleth map; Dot plot</w:t>
-            </w:r>
-          </w:p>
-        </w:tc>
-      </w:tr>
-      <w:tr>
-        <w:tc>
-          <w:tcPr>
-            <w:tcW w:w="0" w:type="auto"/>
-            <w:hideMark/>
-          </w:tcPr>
-          <w:p>
-            <w:pPr>
-              <w:spacing w:after="160" w:line="278" w:lineRule="auto"/>
-            </w:pPr>
-            <w:r>
-              <w:t>2</w:t>
-            </w:r>
-          </w:p>
-        </w:tc>
-        <w:tc>
-          <w:tcPr>
-            <w:tcW w:w="0" w:type="auto"/>
-            <w:hideMark/>
-          </w:tcPr>
-          <w:p>
-            <w:pPr>
-              <w:spacing w:after="160" w:line="278" w:lineRule="auto"/>
-            </w:pPr>
-            <w:r>
-              <w:rPr>
-                <w:b/>
-                <w:bCs/>
-              </w:rPr>
-              <w:t>A Decade of Disruption</w:t>
-            </w:r>
-          </w:p>
-        </w:tc>
-        <w:tc>
-          <w:tcPr>
-            <w:tcW w:w="0" w:type="auto"/>
-            <w:hideMark/>
-          </w:tcPr>
-          <w:p>
-            <w:pPr>
-              <w:spacing w:after="160" w:line="278" w:lineRule="auto"/>
-            </w:pPr>
-            <w:r>
-              <w:t>Show the trend and how bushfires/COVID/methodology changes reshaped it</w:t>
-            </w:r>
-          </w:p>
-        </w:tc>
-        <w:tc>
-          <w:tcPr>
-            <w:tcW w:w="0" w:type="auto"/>
-            <w:hideMark/>
-          </w:tcPr>
-          <w:p>
-            <w:pPr>
-              <w:spacing w:after="160" w:line="278" w:lineRule="auto"/>
-            </w:pPr>
-            <w:r>
-              <w:t>Multi-line chart; Slope chart; Streamgraph</w:t>
-            </w:r>
-          </w:p>
-        </w:tc>
-      </w:tr>
-      <w:tr>
-        <w:tc>
-          <w:tcPr>
-            <w:tcW w:w="0" w:type="auto"/>
-            <w:hideMark/>
-          </w:tcPr>
-          <w:p>
-            <w:pPr>
-              <w:spacing w:after="160" w:line="278" w:lineRule="auto"/>
-            </w:pPr>
-            <w:r>
-              <w:t>3</w:t>
-            </w:r>
-          </w:p>
-        </w:tc>
-        <w:tc>
-          <w:tcPr>
-            <w:tcW w:w="0" w:type="auto"/>
-            <w:hideMark/>
-          </w:tcPr>
-          <w:p>
-            <w:pPr>
-              <w:spacing w:after="160" w:line="278" w:lineRule="auto"/>
-            </w:pPr>
-            <w:r>
-              <w:rPr>
-                <w:b/>
-                <w:bCs/>
-              </w:rPr>
-              <w:t>Who's Heading Outdoors</w:t>
-            </w:r>
-          </w:p>
-        </w:tc>
-        <w:tc>
-          <w:tcPr>
-            <w:tcW w:w="0" w:type="auto"/>
-            <w:hideMark/>
-          </w:tcPr>
-          <w:p>
-            <w:pPr>
-              <w:spacing w:after="160" w:line="278" w:lineRule="auto"/>
-            </w:pPr>
-            <w:r>
-              <w:t>Reveal demographic/generational shifts — the "changing lifestyle" core of the brief</w:t>
-            </w:r>
-          </w:p>
-        </w:tc>
-        <w:tc>
-          <w:tcPr>
-            <w:tcW w:w="0" w:type="auto"/>
-            <w:hideMark/>
-          </w:tcPr>
-          <w:p>
-            <w:pPr>
-              <w:spacing w:after="160" w:line="278" w:lineRule="auto"/>
-            </w:pPr>
-            <w:r>
-              <w:t>Small-multiples line chart; Heatmap/matrix; Ridgeline plot</w:t>
-            </w:r>
-          </w:p>
-        </w:tc>
-      </w:tr>
-      <w:tr>
-        <w:tc>
-          <w:tcPr>
-            <w:tcW w:w="0" w:type="auto"/>
-            <w:hideMark/>
-          </w:tcPr>
-          <w:p>
-            <w:pPr>
-              <w:spacing w:after="160" w:line="278" w:lineRule="auto"/>
-            </w:pPr>
-            <w:r>
-              <w:t>4</w:t>
-            </w:r>
-          </w:p>
-        </w:tc>
-        <w:tc>
-          <w:tcPr>
-            <w:tcW w:w="0" w:type="auto"/>
-            <w:hideMark/>
-          </w:tcPr>
-          <w:p>
-            <w:pPr>
-              <w:spacing w:after="160" w:line="278" w:lineRule="auto"/>
-            </w:pPr>
-            <w:r>
-              <w:rPr>
-                <w:b/>
-                <w:bCs/>
-              </w:rPr>
-              <w:t>The Geography of Recreation</w:t>
-            </w:r>
-          </w:p>
-        </w:tc>
-        <w:tc>
-          <w:tcPr>
-            <w:tcW w:w="0" w:type="auto"/>
-            <w:hideMark/>
-          </w:tcPr>
-          <w:p>
-            <w:pPr>
-              <w:spacing w:after="160" w:line="278" w:lineRule="auto"/>
-            </w:pPr>
-            <w:r>
-              <w:t>Show where participation physically concentrates, beyond what state totals reveal</w:t>
-            </w:r>
-          </w:p>
-        </w:tc>
-        <w:tc>
-          <w:tcPr>
-            <w:tcW w:w="0" w:type="auto"/>
-            <w:hideMark/>
-          </w:tcPr>
-          <w:p>
-            <w:pPr>
-              <w:spacing w:after="160" w:line="278" w:lineRule="auto"/>
-            </w:pPr>
-            <w:r>
-              <w:t>Proportional-symbol map; Treemap</w:t>
-            </w:r>
-          </w:p>
-        </w:tc>
-      </w:tr>
-      <w:tr>
-        <w:tc>
-          <w:tcPr>
-            <w:tcW w:w="0" w:type="auto"/>
-            <w:hideMark/>
-          </w:tcPr>
-          <w:p>
-            <w:pPr>
-              <w:spacing w:after="160" w:line="278" w:lineRule="auto"/>
-            </w:pPr>
-            <w:r>
-              <w:t>5</w:t>
-            </w:r>
-          </w:p>
-        </w:tc>
-        <w:tc>
-          <w:tcPr>
-            <w:tcW w:w="0" w:type="auto"/>
-            <w:hideMark/>
-          </w:tcPr>
-          <w:p>
-            <w:pPr>
-              <w:spacing w:after="160" w:line="278" w:lineRule="auto"/>
-            </w:pPr>
-            <w:r>
-              <w:rPr>
-                <w:b/>
-                <w:bCs/>
-              </w:rPr>
-              <w:t>Why It's Changing</w:t>
-            </w:r>
-          </w:p>
-        </w:tc>
-        <w:tc>
-          <w:tcPr>
-            <w:tcW w:w="0" w:type="auto"/>
-            <w:hideMark/>
-          </w:tcPr>
-          <w:p>
-            <w:pPr>
-              <w:spacing w:after="160" w:line="278" w:lineRule="auto"/>
-            </w:pPr>
-            <w:r>
-              <w:t>Test structural/lifestyle drivers behind the shift</w:t>
-            </w:r>
-          </w:p>
-        </w:tc>
-        <w:tc>
-          <w:tcPr>
-            <w:tcW w:w="0" w:type="auto"/>
-            <w:hideMark/>
-          </w:tcPr>
-          <w:p>
-            <w:pPr>
-              <w:spacing w:after="160" w:line="278" w:lineRule="auto"/>
-            </w:pPr>
-            <w:r>
-              <w:t>Bubble chart; Grouped bar chart</w:t>
-            </w:r>
-          </w:p>
-        </w:tc>
-      </w:tr>
-      <w:tr>
-        <w:tc>
-          <w:tcPr>
-            <w:tcW w:w="0" w:type="auto"/>
-            <w:hideMark/>
-          </w:tcPr>
-          <w:p>
-            <w:pPr>
-              <w:spacing w:after="160" w:line="278" w:lineRule="auto"/>
-            </w:pPr>
-            <w:r>
-              <w:t>6</w:t>
-            </w:r>
-          </w:p>
-        </w:tc>
-        <w:tc>
-          <w:tcPr>
-            <w:tcW w:w="0" w:type="auto"/>
-            <w:hideMark/>
-          </w:tcPr>
-          <w:p>
-            <w:pPr>
-              <w:spacing w:after="160" w:line="278" w:lineRule="auto"/>
-            </w:pPr>
-            <w:r>
-              <w:rPr>
-                <w:b/>
-                <w:bCs/>
-              </w:rPr>
-              <w:t>The Road Ahead</w:t>
-            </w:r>
-          </w:p>
-        </w:tc>
-        <w:tc>
-          <w:tcPr>
-            <w:tcW w:w="0" w:type="auto"/>
-            <w:hideMark/>
-          </w:tcPr>
-          <w:p>
-            <w:pPr>
-              <w:spacing w:after="160" w:line="278" w:lineRule="auto"/>
-            </w:pPr>
-            <w:r>
-              <w:t>Synthesise sections 1–5 into one filterable view; closes the martini-glass structure</w:t>
-            </w:r>
-          </w:p>
-        </w:tc>
-        <w:tc>
-          <w:tcPr>
-            <w:tcW w:w="0" w:type="auto"/>
-            <w:hideMark/>
-          </w:tcPr>
-          <w:p>
-            <w:pPr>
-              <w:spacing w:after="160" w:line="278" w:lineRule="auto"/>
-            </w:pPr>
-            <w:r>
-              <w:t>Interactive annotated summary panel (cross-links prior visuals, no new chart type)</w:t>
-            </w:r>
-          </w:p>
-        </w:tc>
-      </w:tr>
-    </w:tbl>
-    <w:p/>
-    <w:tbl>
-      <w:tblPr>
-        <w:tblStyle w:val="TableGrid"/>
-        <w:tblW w:w="0" w:type="auto"/>
-        <w:tblLook w:val="04A0" w:firstRow="1" w:lastRow="0" w:firstColumn="1" w:lastColumn="0" w:noHBand="0" w:noVBand="1"/>
-      </w:tblPr>
-      <w:tblGrid>
-        <w:gridCol w:w="1860"/>
-        <w:gridCol w:w="1203"/>
-        <w:gridCol w:w="1996"/>
-        <w:gridCol w:w="2470"/>
-        <w:gridCol w:w="1487"/>
-      </w:tblGrid>
-      <w:tr>
-        <w:tc>
-          <w:tcPr>
-            <w:tcW w:w="0" w:type="auto"/>
-            <w:hideMark/>
-          </w:tcPr>
-          <w:p>
-            <w:pPr>
-              <w:spacing w:after="160" w:line="278" w:lineRule="auto"/>
-              <w:rPr>
-                <w:b/>
-                <w:bCs/>
-              </w:rPr>
-            </w:pPr>
-            <w:r>
-              <w:rPr>
-                <w:b/>
-                <w:bCs/>
-              </w:rPr>
-              <w:t>Visual</w:t>
-            </w:r>
-          </w:p>
-        </w:tc>
-        <w:tc>
-          <w:tcPr>
-            <w:tcW w:w="0" w:type="auto"/>
-            <w:hideMark/>
-          </w:tcPr>
-          <w:p>
-            <w:pPr>
-              <w:spacing w:after="160" w:line="278" w:lineRule="auto"/>
-              <w:rPr>
-                <w:b/>
-                <w:bCs/>
-              </w:rPr>
-            </w:pPr>
-            <w:r>
-              <w:rPr>
-                <w:b/>
-                <w:bCs/>
-              </w:rPr>
-              <w:t>Idiom type</w:t>
-            </w:r>
-          </w:p>
-        </w:tc>
-        <w:tc>
-          <w:tcPr>
-            <w:tcW w:w="0" w:type="auto"/>
-            <w:hideMark/>
-          </w:tcPr>
-          <w:p>
-            <w:pPr>
-              <w:spacing w:after="160" w:line="278" w:lineRule="auto"/>
-              <w:rPr>
-                <w:b/>
-                <w:bCs/>
-              </w:rPr>
-            </w:pPr>
-            <w:r>
-              <w:rPr>
-                <w:b/>
-                <w:bCs/>
-              </w:rPr>
-              <w:t>Details (axes / encoding)</w:t>
-            </w:r>
-          </w:p>
-        </w:tc>
-        <w:tc>
-          <w:tcPr>
-            <w:tcW w:w="0" w:type="auto"/>
-            <w:hideMark/>
-          </w:tcPr>
-          <w:p>
-            <w:pPr>
-              <w:spacing w:after="160" w:line="278" w:lineRule="auto"/>
-              <w:rPr>
-                <w:b/>
-                <w:bCs/>
-              </w:rPr>
-            </w:pPr>
-            <w:r>
-              <w:rPr>
-                <w:b/>
-                <w:bCs/>
-              </w:rPr>
-              <w:t>Insight &amp; interactivity</w:t>
-            </w:r>
-          </w:p>
-        </w:tc>
-        <w:tc>
-          <w:tcPr>
-            <w:tcW w:w="0" w:type="auto"/>
-            <w:hideMark/>
-          </w:tcPr>
-          <w:p>
-            <w:pPr>
-              <w:spacing w:after="160" w:line="278" w:lineRule="auto"/>
-              <w:rPr>
-                <w:b/>
-                <w:bCs/>
-              </w:rPr>
-            </w:pPr>
-            <w:r>
-              <w:rPr>
-                <w:b/>
-                <w:bCs/>
-              </w:rPr>
-              <w:t>Data source</w:t>
-            </w:r>
-          </w:p>
-        </w:tc>
-      </w:tr>
-      <w:tr>
-        <w:tc>
-          <w:tcPr>
-            <w:tcW w:w="0" w:type="auto"/>
-            <w:hideMark/>
-          </w:tcPr>
-          <w:p>
-            <w:pPr>
-              <w:spacing w:after="160" w:line="278" w:lineRule="auto"/>
-            </w:pPr>
-            <w:r>
-              <w:t>Choropleth map</w:t>
-            </w:r>
-          </w:p>
-        </w:tc>
-        <w:tc>
-          <w:tcPr>
-            <w:tcW w:w="0" w:type="auto"/>
-            <w:hideMark/>
-          </w:tcPr>
-          <w:p>
-            <w:pPr>
-              <w:spacing w:after="160" w:line="278" w:lineRule="auto"/>
-            </w:pPr>
-            <w:r>
-              <w:t>Map</w:t>
-            </w:r>
-          </w:p>
-        </w:tc>
-        <w:tc>
-          <w:tcPr>
-            <w:tcW w:w="0" w:type="auto"/>
-            <w:hideMark/>
-          </w:tcPr>
-          <w:p>
-            <w:pPr>
-              <w:spacing w:after="160" w:line="278" w:lineRule="auto"/>
-            </w:pPr>
-            <w:r>
-              <w:t>Colour hue/luminance = participation rate (%) by state/territory</w:t>
-            </w:r>
-          </w:p>
-        </w:tc>
-        <w:tc>
-          <w:tcPr>
-            <w:tcW w:w="0" w:type="auto"/>
-            <w:hideMark/>
-          </w:tcPr>
-          <w:p>
-            <w:pPr>
-              <w:spacing w:after="160" w:line="278" w:lineRule="auto"/>
-            </w:pPr>
-            <w:r>
-              <w:t>Reveals which states lag despite similar climate/population — invisible in a ranked table. Click a state to filter all downstream charts</w:t>
-            </w:r>
-          </w:p>
-        </w:tc>
-        <w:tc>
-          <w:tcPr>
-            <w:tcW w:w="0" w:type="auto"/>
-            <w:hideMark/>
-          </w:tcPr>
-          <w:p>
-            <w:pPr>
-              <w:spacing w:after="160" w:line="278" w:lineRule="auto"/>
-            </w:pPr>
-            <w:hyperlink r:id="rId26" w:history="1">
-              <w:r>
-                <w:rPr>
-                  <w:rStyle w:val="Hyperlink"/>
-                </w:rPr>
-                <w:t>AusPlay Survey</w:t>
-              </w:r>
-            </w:hyperlink>
-          </w:p>
-        </w:tc>
-      </w:tr>
-      <w:tr>
-        <w:tc>
-          <w:tcPr>
-            <w:tcW w:w="0" w:type="auto"/>
-            <w:hideMark/>
-          </w:tcPr>
-          <w:p>
-            <w:pPr>
-              <w:spacing w:after="160" w:line="278" w:lineRule="auto"/>
-            </w:pPr>
-            <w:r>
-              <w:t>Dot plot</w:t>
-            </w:r>
-          </w:p>
-        </w:tc>
-        <w:tc>
-          <w:tcPr>
-            <w:tcW w:w="0" w:type="auto"/>
-            <w:hideMark/>
-          </w:tcPr>
-          <w:p>
-            <w:pPr>
-              <w:spacing w:after="160" w:line="278" w:lineRule="auto"/>
-            </w:pPr>
-            <w:r>
-              <w:t>Basic</w:t>
-            </w:r>
-          </w:p>
-        </w:tc>
-        <w:tc>
-          <w:tcPr>
-            <w:tcW w:w="0" w:type="auto"/>
-            <w:hideMark/>
-          </w:tcPr>
-          <w:p>
-            <w:pPr>
-              <w:spacing w:after="160" w:line="278" w:lineRule="auto"/>
-            </w:pPr>
-            <w:r>
-              <w:t xml:space="preserve">X = participation rate (%); Y = state/territory (sorted); </w:t>
-            </w:r>
-            <w:r>
-              <w:lastRenderedPageBreak/>
-              <w:t>reference line = national average</w:t>
-            </w:r>
-          </w:p>
-        </w:tc>
-        <w:tc>
-          <w:tcPr>
-            <w:tcW w:w="0" w:type="auto"/>
-            <w:hideMark/>
-          </w:tcPr>
-          <w:p>
-            <w:pPr>
-              <w:spacing w:after="160" w:line="278" w:lineRule="auto"/>
-            </w:pPr>
-            <w:r>
-              <w:lastRenderedPageBreak/>
-              <w:t xml:space="preserve">Shows exact distance from average without the area-distortion of a bar chart. Hover for exact %; drag </w:t>
-            </w:r>
-            <w:r>
-              <w:lastRenderedPageBreak/>
-              <w:t>reference line to test other benchmarks</w:t>
-            </w:r>
-          </w:p>
-        </w:tc>
-        <w:tc>
-          <w:tcPr>
-            <w:tcW w:w="0" w:type="auto"/>
-            <w:hideMark/>
-          </w:tcPr>
-          <w:p>
-            <w:pPr>
-              <w:spacing w:after="160" w:line="278" w:lineRule="auto"/>
-            </w:pPr>
-            <w:r>
-              <w:lastRenderedPageBreak/>
-              <w:t>AusPlay Data Portal</w:t>
-            </w:r>
-          </w:p>
-        </w:tc>
-      </w:tr>
-      <w:tr>
-        <w:tc>
-          <w:tcPr>
-            <w:tcW w:w="0" w:type="auto"/>
-            <w:hideMark/>
-          </w:tcPr>
-          <w:p>
-            <w:pPr>
-              <w:spacing w:after="160" w:line="278" w:lineRule="auto"/>
-            </w:pPr>
-            <w:r>
-              <w:t>Multi-line chart</w:t>
-            </w:r>
-          </w:p>
-        </w:tc>
-        <w:tc>
-          <w:tcPr>
-            <w:tcW w:w="0" w:type="auto"/>
-            <w:hideMark/>
-          </w:tcPr>
-          <w:p>
-            <w:pPr>
-              <w:spacing w:after="160" w:line="278" w:lineRule="auto"/>
-            </w:pPr>
-            <w:r>
-              <w:t>Basic</w:t>
-            </w:r>
-          </w:p>
-        </w:tc>
-        <w:tc>
-          <w:tcPr>
-            <w:tcW w:w="0" w:type="auto"/>
-            <w:hideMark/>
-          </w:tcPr>
-          <w:p>
-            <w:pPr>
-              <w:spacing w:after="160" w:line="278" w:lineRule="auto"/>
-            </w:pPr>
-            <w:r>
-              <w:t>X = year (2015–2023); Y = participation rate (%); one line per activity</w:t>
-            </w:r>
-          </w:p>
-        </w:tc>
-        <w:tc>
-          <w:tcPr>
-            <w:tcW w:w="0" w:type="auto"/>
-            <w:hideMark/>
-          </w:tcPr>
-          <w:p>
-            <w:pPr>
-              <w:spacing w:after="160" w:line="278" w:lineRule="auto"/>
-            </w:pPr>
-            <w:r>
-              <w:t>Shows cycling's post-COVID plateau vs. hiking's continued rise — invisible in single-year data</w:t>
-            </w:r>
-          </w:p>
-        </w:tc>
-        <w:tc>
-          <w:tcPr>
-            <w:tcW w:w="0" w:type="auto"/>
-            <w:hideMark/>
-          </w:tcPr>
-          <w:p>
-            <w:pPr>
-              <w:spacing w:after="160" w:line="278" w:lineRule="auto"/>
-            </w:pPr>
-            <w:hyperlink r:id="rId27" w:history="1">
-              <w:r>
-                <w:rPr>
-                  <w:rStyle w:val="Hyperlink"/>
-                </w:rPr>
-                <w:t>AusPlay Data Portal</w:t>
-              </w:r>
-            </w:hyperlink>
-          </w:p>
-        </w:tc>
-      </w:tr>
-      <w:tr>
-        <w:tc>
-          <w:tcPr>
-            <w:tcW w:w="0" w:type="auto"/>
-            <w:hideMark/>
-          </w:tcPr>
-          <w:p>
-            <w:pPr>
-              <w:spacing w:after="160" w:line="278" w:lineRule="auto"/>
-            </w:pPr>
-            <w:r>
-              <w:t>Slope chart</w:t>
-            </w:r>
-          </w:p>
-        </w:tc>
-        <w:tc>
-          <w:tcPr>
-            <w:tcW w:w="0" w:type="auto"/>
-            <w:hideMark/>
-          </w:tcPr>
-          <w:p>
-            <w:pPr>
-              <w:spacing w:after="160" w:line="278" w:lineRule="auto"/>
-            </w:pPr>
-            <w:r>
-              <w:t>Advanced</w:t>
-            </w:r>
-          </w:p>
-        </w:tc>
-        <w:tc>
-          <w:tcPr>
-            <w:tcW w:w="0" w:type="auto"/>
-            <w:hideMark/>
-          </w:tcPr>
-          <w:p>
-            <w:pPr>
-              <w:spacing w:after="160" w:line="278" w:lineRule="auto"/>
-            </w:pPr>
-            <w:r>
-              <w:t>Two X positions (pre-/post-2020); Y = participation rate (%); line per activity</w:t>
-            </w:r>
-          </w:p>
-        </w:tc>
-        <w:tc>
-          <w:tcPr>
-            <w:tcW w:w="0" w:type="auto"/>
-            <w:hideMark/>
-          </w:tcPr>
-          <w:p>
-            <w:pPr>
-              <w:spacing w:after="160" w:line="278" w:lineRule="auto"/>
-            </w:pPr>
-            <w:r>
-              <w:t>Quantifies which activities kept COVID-era gains vs. reverted. Click a line for annotated % change</w:t>
-            </w:r>
-          </w:p>
-        </w:tc>
-        <w:tc>
-          <w:tcPr>
-            <w:tcW w:w="0" w:type="auto"/>
-            <w:hideMark/>
-          </w:tcPr>
-          <w:p>
-            <w:pPr>
-              <w:spacing w:after="160" w:line="278" w:lineRule="auto"/>
-            </w:pPr>
-            <w:r>
-              <w:t>AusPlay (2018–19 vs. 2021–22 waves)</w:t>
-            </w:r>
-          </w:p>
-        </w:tc>
-      </w:tr>
-      <w:tr>
-        <w:tc>
-          <w:tcPr>
-            <w:tcW w:w="0" w:type="auto"/>
-            <w:hideMark/>
-          </w:tcPr>
-          <w:p>
-            <w:pPr>
-              <w:spacing w:after="160" w:line="278" w:lineRule="auto"/>
-            </w:pPr>
-            <w:r>
-              <w:t>Streamgraph</w:t>
-            </w:r>
-          </w:p>
-        </w:tc>
-        <w:tc>
-          <w:tcPr>
-            <w:tcW w:w="0" w:type="auto"/>
-            <w:hideMark/>
-          </w:tcPr>
-          <w:p>
-            <w:pPr>
-              <w:spacing w:after="160" w:line="278" w:lineRule="auto"/>
-            </w:pPr>
-            <w:r>
-              <w:t>Advanced</w:t>
-            </w:r>
-          </w:p>
-        </w:tc>
-        <w:tc>
-          <w:tcPr>
-            <w:tcW w:w="0" w:type="auto"/>
-            <w:hideMark/>
-          </w:tcPr>
-          <w:p>
-            <w:pPr>
-              <w:spacing w:after="160" w:line="278" w:lineRule="auto"/>
-            </w:pPr>
-            <w:r>
-              <w:t>X = year (continuous); Y (thickness) = share of total participants, flowing by activity</w:t>
-            </w:r>
-          </w:p>
-        </w:tc>
-        <w:tc>
-          <w:tcPr>
-            <w:tcW w:w="0" w:type="auto"/>
-            <w:hideMark/>
-          </w:tcPr>
-          <w:p>
-            <w:pPr>
-              <w:spacing w:after="160" w:line="278" w:lineRule="auto"/>
-            </w:pPr>
-            <w:r>
-              <w:t xml:space="preserve">Shows the </w:t>
-            </w:r>
-            <w:r>
-              <w:rPr>
-                <w:i/>
-                <w:iCs/>
-              </w:rPr>
-              <w:t>mix</w:t>
-            </w:r>
-            <w:r>
-              <w:t xml:space="preserve"> shifting (e.g. camping's rising share) even while totals are flat — a stacked bar can't show this smoothly</w:t>
-            </w:r>
-          </w:p>
-        </w:tc>
-        <w:tc>
-          <w:tcPr>
-            <w:tcW w:w="0" w:type="auto"/>
-            <w:hideMark/>
-          </w:tcPr>
-          <w:p>
-            <w:pPr>
-              <w:spacing w:after="160" w:line="278" w:lineRule="auto"/>
-            </w:pPr>
-            <w:r>
-              <w:t>AusPlay Data Portal</w:t>
-            </w:r>
-          </w:p>
-        </w:tc>
-      </w:tr>
-      <w:tr>
-        <w:tc>
-          <w:tcPr>
-            <w:tcW w:w="0" w:type="auto"/>
-            <w:hideMark/>
-          </w:tcPr>
-          <w:p>
-            <w:pPr>
-              <w:spacing w:after="160" w:line="278" w:lineRule="auto"/>
-            </w:pPr>
-            <w:r>
-              <w:t>Small-multiples line chart</w:t>
-            </w:r>
-          </w:p>
-        </w:tc>
-        <w:tc>
-          <w:tcPr>
-            <w:tcW w:w="0" w:type="auto"/>
-            <w:hideMark/>
-          </w:tcPr>
-          <w:p>
-            <w:pPr>
-              <w:spacing w:after="160" w:line="278" w:lineRule="auto"/>
-            </w:pPr>
-            <w:r>
-              <w:t>Advanced (1 chart)</w:t>
-            </w:r>
-          </w:p>
-        </w:tc>
-        <w:tc>
-          <w:tcPr>
-            <w:tcW w:w="0" w:type="auto"/>
-            <w:hideMark/>
-          </w:tcPr>
-          <w:p>
-            <w:pPr>
-              <w:spacing w:after="160" w:line="278" w:lineRule="auto"/>
-            </w:pPr>
-            <w:r>
-              <w:t>Each panel: X = year, Y = participation rate (%); faceted by age group</w:t>
-            </w:r>
-          </w:p>
-        </w:tc>
-        <w:tc>
-          <w:tcPr>
-            <w:tcW w:w="0" w:type="auto"/>
-            <w:hideMark/>
-          </w:tcPr>
-          <w:p>
-            <w:pPr>
-              <w:spacing w:after="160" w:line="278" w:lineRule="auto"/>
-            </w:pPr>
-            <w:r>
-              <w:t>Shows Gen Z and Boomers moved in opposite directions post-2020 — unreadable if overlaid in one chart. Click a panel to enlarge</w:t>
-            </w:r>
-          </w:p>
-        </w:tc>
-        <w:tc>
-          <w:tcPr>
-            <w:tcW w:w="0" w:type="auto"/>
-            <w:hideMark/>
-          </w:tcPr>
-          <w:p>
-            <w:pPr>
-              <w:spacing w:after="160" w:line="278" w:lineRule="auto"/>
-            </w:pPr>
-            <w:r>
-              <w:t>AusPlay Data Portal</w:t>
-            </w:r>
-          </w:p>
-        </w:tc>
-      </w:tr>
-      <w:tr>
-        <w:tc>
-          <w:tcPr>
-            <w:tcW w:w="0" w:type="auto"/>
-            <w:hideMark/>
-          </w:tcPr>
-          <w:p>
-            <w:pPr>
-              <w:spacing w:after="160" w:line="278" w:lineRule="auto"/>
-            </w:pPr>
-            <w:r>
-              <w:t>Heatmap/matrix</w:t>
-            </w:r>
-          </w:p>
-        </w:tc>
-        <w:tc>
-          <w:tcPr>
-            <w:tcW w:w="0" w:type="auto"/>
-            <w:hideMark/>
-          </w:tcPr>
-          <w:p>
-            <w:pPr>
-              <w:spacing w:after="160" w:line="278" w:lineRule="auto"/>
-            </w:pPr>
-            <w:r>
-              <w:t>Advanced</w:t>
-            </w:r>
-          </w:p>
-        </w:tc>
-        <w:tc>
-          <w:tcPr>
-            <w:tcW w:w="0" w:type="auto"/>
-            <w:hideMark/>
-          </w:tcPr>
-          <w:p>
-            <w:pPr>
-              <w:spacing w:after="160" w:line="278" w:lineRule="auto"/>
-            </w:pPr>
-            <w:r>
-              <w:t>X = activity type; Y = age group; colour intensity = participation rate (%)</w:t>
-            </w:r>
-          </w:p>
-        </w:tc>
-        <w:tc>
-          <w:tcPr>
-            <w:tcW w:w="0" w:type="auto"/>
-            <w:hideMark/>
-          </w:tcPr>
-          <w:p>
-            <w:pPr>
-              <w:spacing w:after="160" w:line="278" w:lineRule="auto"/>
-            </w:pPr>
-            <w:r>
-              <w:t>Surfaces exact age×activity combinations driving overall growth (e.g. 25–39 + hiking). Hover for value; click row/column to isolate</w:t>
-            </w:r>
-          </w:p>
-        </w:tc>
-        <w:tc>
-          <w:tcPr>
-            <w:tcW w:w="0" w:type="auto"/>
-            <w:hideMark/>
-          </w:tcPr>
-          <w:p>
-            <w:pPr>
-              <w:spacing w:after="160" w:line="278" w:lineRule="auto"/>
-            </w:pPr>
-            <w:r>
-              <w:t>AusPlay Data Portal (cross-tab export)</w:t>
-            </w:r>
-          </w:p>
-        </w:tc>
-      </w:tr>
-      <w:tr>
-        <w:tc>
-          <w:tcPr>
-            <w:tcW w:w="0" w:type="auto"/>
-            <w:hideMark/>
-          </w:tcPr>
-          <w:p>
-            <w:pPr>
-              <w:spacing w:after="160" w:line="278" w:lineRule="auto"/>
-            </w:pPr>
-            <w:r>
-              <w:t>Ridgeline plot</w:t>
-            </w:r>
-          </w:p>
-        </w:tc>
-        <w:tc>
-          <w:tcPr>
-            <w:tcW w:w="0" w:type="auto"/>
-            <w:hideMark/>
-          </w:tcPr>
-          <w:p>
-            <w:pPr>
-              <w:spacing w:after="160" w:line="278" w:lineRule="auto"/>
-            </w:pPr>
-            <w:r>
-              <w:t>Advanced</w:t>
-            </w:r>
-          </w:p>
-        </w:tc>
-        <w:tc>
-          <w:tcPr>
-            <w:tcW w:w="0" w:type="auto"/>
-            <w:hideMark/>
-          </w:tcPr>
-          <w:p>
-            <w:pPr>
-              <w:spacing w:after="160" w:line="278" w:lineRule="auto"/>
-            </w:pPr>
-            <w:r>
-              <w:t>X = daily minutes on outdoor activity; Y = density; one ridge per generation</w:t>
-            </w:r>
-          </w:p>
-        </w:tc>
-        <w:tc>
-          <w:tcPr>
-            <w:tcW w:w="0" w:type="auto"/>
-            <w:hideMark/>
-          </w:tcPr>
-          <w:p>
-            <w:pPr>
-              <w:spacing w:after="160" w:line="278" w:lineRule="auto"/>
-            </w:pPr>
-            <w:r>
-              <w:t xml:space="preserve">Shows </w:t>
-            </w:r>
-            <w:r>
-              <w:rPr>
-                <w:i/>
-                <w:iCs/>
-              </w:rPr>
-              <w:t>spread</w:t>
-            </w:r>
-            <w:r>
-              <w:t xml:space="preserve"> within a generation, not just its average — reveals bimodal behaviour a mean-bar chart </w:t>
-            </w:r>
-            <w:r>
-              <w:lastRenderedPageBreak/>
-              <w:t>flattens. Hover to isolate a ridge</w:t>
-            </w:r>
-          </w:p>
-        </w:tc>
-        <w:tc>
-          <w:tcPr>
-            <w:tcW w:w="0" w:type="auto"/>
-            <w:hideMark/>
-          </w:tcPr>
-          <w:p>
-            <w:pPr>
-              <w:spacing w:after="160" w:line="278" w:lineRule="auto"/>
-            </w:pPr>
-            <w:hyperlink r:id="rId28" w:history="1">
-              <w:r>
-                <w:rPr>
-                  <w:rStyle w:val="Hyperlink"/>
-                </w:rPr>
-                <w:t>ABS Time Use Survey</w:t>
-              </w:r>
-            </w:hyperlink>
-          </w:p>
-        </w:tc>
-      </w:tr>
-      <w:tr>
-        <w:tc>
-          <w:tcPr>
-            <w:tcW w:w="0" w:type="auto"/>
-            <w:hideMark/>
-          </w:tcPr>
-          <w:p>
-            <w:pPr>
-              <w:spacing w:after="160" w:line="278" w:lineRule="auto"/>
-            </w:pPr>
-            <w:r>
-              <w:t>Proportional-symbol map</w:t>
-            </w:r>
-          </w:p>
-        </w:tc>
-        <w:tc>
-          <w:tcPr>
-            <w:tcW w:w="0" w:type="auto"/>
-            <w:hideMark/>
-          </w:tcPr>
-          <w:p>
-            <w:pPr>
-              <w:spacing w:after="160" w:line="278" w:lineRule="auto"/>
-            </w:pPr>
-            <w:r>
-              <w:t>Map</w:t>
-            </w:r>
-          </w:p>
-        </w:tc>
-        <w:tc>
-          <w:tcPr>
-            <w:tcW w:w="0" w:type="auto"/>
-            <w:hideMark/>
-          </w:tcPr>
-          <w:p>
-            <w:pPr>
-              <w:spacing w:after="160" w:line="278" w:lineRule="auto"/>
-            </w:pPr>
-            <w:r>
-              <w:t>Symbol size = annual visitor count, positioned at park location</w:t>
-            </w:r>
-          </w:p>
-        </w:tc>
-        <w:tc>
-          <w:tcPr>
-            <w:tcW w:w="0" w:type="auto"/>
-            <w:hideMark/>
-          </w:tcPr>
-          <w:p>
-            <w:pPr>
-              <w:spacing w:after="160" w:line="278" w:lineRule="auto"/>
-            </w:pPr>
-            <w:r>
-              <w:t>Shows visitation is extremely concentrated near Sydney despite even park distribution statewide. Zoom/pan; click symbol for park detail</w:t>
-            </w:r>
-          </w:p>
-        </w:tc>
-        <w:tc>
-          <w:tcPr>
-            <w:tcW w:w="0" w:type="auto"/>
-            <w:hideMark/>
-          </w:tcPr>
-          <w:p>
-            <w:pPr>
-              <w:spacing w:after="160" w:line="278" w:lineRule="auto"/>
-            </w:pPr>
-            <w:hyperlink r:id="rId29" w:history="1">
-              <w:r>
-                <w:rPr>
-                  <w:rStyle w:val="Hyperlink"/>
-                </w:rPr>
-                <w:t>NSW NPWS Park Visitor Survey</w:t>
-              </w:r>
-            </w:hyperlink>
-          </w:p>
-        </w:tc>
-      </w:tr>
-      <w:tr>
-        <w:tc>
-          <w:tcPr>
-            <w:tcW w:w="0" w:type="auto"/>
-            <w:hideMark/>
-          </w:tcPr>
-          <w:p>
-            <w:pPr>
-              <w:spacing w:after="160" w:line="278" w:lineRule="auto"/>
-            </w:pPr>
-            <w:r>
-              <w:t>Treemap</w:t>
-            </w:r>
-          </w:p>
-        </w:tc>
-        <w:tc>
-          <w:tcPr>
-            <w:tcW w:w="0" w:type="auto"/>
-            <w:hideMark/>
-          </w:tcPr>
-          <w:p>
-            <w:pPr>
-              <w:spacing w:after="160" w:line="278" w:lineRule="auto"/>
-            </w:pPr>
-            <w:r>
-              <w:t>Advanced</w:t>
-            </w:r>
-          </w:p>
-        </w:tc>
-        <w:tc>
-          <w:tcPr>
-            <w:tcW w:w="0" w:type="auto"/>
-            <w:hideMark/>
-          </w:tcPr>
-          <w:p>
-            <w:pPr>
-              <w:spacing w:after="160" w:line="278" w:lineRule="auto"/>
-            </w:pPr>
-            <w:r>
-              <w:t>Rectangle area = share of total visits, grouped by region</w:t>
-            </w:r>
-          </w:p>
-        </w:tc>
-        <w:tc>
-          <w:tcPr>
-            <w:tcW w:w="0" w:type="auto"/>
-            <w:hideMark/>
-          </w:tcPr>
-          <w:p>
-            <w:pPr>
-              <w:spacing w:after="160" w:line="278" w:lineRule="auto"/>
-            </w:pPr>
-            <w:r>
-              <w:t>Shows regional NSW's combined share rivals Sydney's despite no single dominant park — invisible in a ranked list. Click a cluster to drill in</w:t>
-            </w:r>
-          </w:p>
-        </w:tc>
-        <w:tc>
-          <w:tcPr>
-            <w:tcW w:w="0" w:type="auto"/>
-            <w:hideMark/>
-          </w:tcPr>
-          <w:p>
-            <w:pPr>
-              <w:spacing w:after="160" w:line="278" w:lineRule="auto"/>
-            </w:pPr>
-            <w:r>
-              <w:t>NSW NPWS Park Visitor Survey annual report</w:t>
-            </w:r>
-          </w:p>
-        </w:tc>
-      </w:tr>
-      <w:tr>
-        <w:tc>
-          <w:tcPr>
-            <w:tcW w:w="0" w:type="auto"/>
-            <w:hideMark/>
-          </w:tcPr>
-          <w:p>
-            <w:pPr>
-              <w:spacing w:after="160" w:line="278" w:lineRule="auto"/>
-            </w:pPr>
-            <w:r>
-              <w:t>Bubble chart</w:t>
-            </w:r>
-          </w:p>
-        </w:tc>
-        <w:tc>
-          <w:tcPr>
-            <w:tcW w:w="0" w:type="auto"/>
-            <w:hideMark/>
-          </w:tcPr>
-          <w:p>
-            <w:pPr>
-              <w:spacing w:after="160" w:line="278" w:lineRule="auto"/>
-            </w:pPr>
-            <w:r>
-              <w:t>Basic</w:t>
-            </w:r>
-          </w:p>
-        </w:tc>
-        <w:tc>
-          <w:tcPr>
-            <w:tcW w:w="0" w:type="auto"/>
-            <w:hideMark/>
-          </w:tcPr>
-          <w:p>
-            <w:pPr>
-              <w:spacing w:after="160" w:line="278" w:lineRule="auto"/>
-            </w:pPr>
-            <w:r>
-              <w:t>X = urbanisation rate (%); Y = participation change 2015–2023 (pp); size = state population</w:t>
-            </w:r>
-          </w:p>
-        </w:tc>
-        <w:tc>
-          <w:tcPr>
-            <w:tcW w:w="0" w:type="auto"/>
-            <w:hideMark/>
-          </w:tcPr>
-          <w:p>
-            <w:pPr>
-              <w:spacing w:after="160" w:line="278" w:lineRule="auto"/>
-            </w:pPr>
-            <w:r>
-              <w:t>Tests whether urbanisation actually predicts decline, or which states buck the trend. Hover for detail; brush to select a subset</w:t>
-            </w:r>
-          </w:p>
-        </w:tc>
-        <w:tc>
-          <w:tcPr>
-            <w:tcW w:w="0" w:type="auto"/>
-            <w:hideMark/>
-          </w:tcPr>
-          <w:p>
-            <w:pPr>
-              <w:spacing w:after="160" w:line="278" w:lineRule="auto"/>
-            </w:pPr>
-            <w:r>
-              <w:t>ABS Regional Population statistics + AusPlay</w:t>
-            </w:r>
-          </w:p>
-        </w:tc>
-      </w:tr>
-      <w:tr>
-        <w:tc>
-          <w:tcPr>
-            <w:tcW w:w="0" w:type="auto"/>
-            <w:hideMark/>
-          </w:tcPr>
-          <w:p>
-            <w:pPr>
-              <w:spacing w:after="160" w:line="278" w:lineRule="auto"/>
-            </w:pPr>
-            <w:r>
-              <w:t>Grouped bar chart</w:t>
-            </w:r>
-          </w:p>
-        </w:tc>
-        <w:tc>
-          <w:tcPr>
-            <w:tcW w:w="0" w:type="auto"/>
-            <w:hideMark/>
-          </w:tcPr>
-          <w:p>
-            <w:pPr>
-              <w:spacing w:after="160" w:line="278" w:lineRule="auto"/>
-            </w:pPr>
-            <w:r>
-              <w:t>Basic</w:t>
-            </w:r>
-          </w:p>
-        </w:tc>
-        <w:tc>
-          <w:tcPr>
-            <w:tcW w:w="0" w:type="auto"/>
-            <w:hideMark/>
-          </w:tcPr>
-          <w:p>
-            <w:pPr>
-              <w:spacing w:after="160" w:line="278" w:lineRule="auto"/>
-            </w:pPr>
-            <w:r>
-              <w:t>X = activity type; grouped bars = metro/regional; Y = participation rate (%)</w:t>
-            </w:r>
-          </w:p>
-        </w:tc>
-        <w:tc>
-          <w:tcPr>
-            <w:tcW w:w="0" w:type="auto"/>
-            <w:hideMark/>
-          </w:tcPr>
-          <w:p>
-            <w:pPr>
-              <w:spacing w:after="160" w:line="278" w:lineRule="auto"/>
-            </w:pPr>
-            <w:r>
-              <w:t>Quantifies the metro–regional gap per activity specifically, not just overall. Toggle % vs. absolute count</w:t>
-            </w:r>
-          </w:p>
-        </w:tc>
-        <w:tc>
-          <w:tcPr>
-            <w:tcW w:w="0" w:type="auto"/>
-            <w:hideMark/>
-          </w:tcPr>
-          <w:p>
-            <w:pPr>
-              <w:spacing w:after="160" w:line="278" w:lineRule="auto"/>
-            </w:pPr>
-            <w:r>
-              <w:t>AusPlay Data Portal (geographic breakdown)</w:t>
-            </w:r>
-          </w:p>
-        </w:tc>
-      </w:tr>
-    </w:tbl>
-    <w:p/>
-    <w:p>
-      <w:r>
         <w:br w:type="page"/>
       </w:r>
     </w:p>

</xml_diff>

<commit_message>
rearrange data into raw and cleaned folder
</commit_message>
<xml_diff>
--- a/draft.docx
+++ b/draft.docx
@@ -4219,6 +4219,25 @@
       </w:r>
       <w:r>
         <w:t xml:space="preserve"> give you the detailed activity × state × geography information you need for your main visualisation.</w:t>
+      </w:r>
+    </w:p>
+    <w:p>
+      <w:pPr>
+        <w:rPr>
+          <w:lang w:val="af-ZA"/>
+        </w:rPr>
+      </w:pPr>
+    </w:p>
+    <w:p>
+      <w:r>
+        <w:rPr>
+          <w:b/>
+          <w:bCs/>
+        </w:rPr>
+        <w:t>Outdoor recreational activities</w:t>
+      </w:r>
+      <w:r>
+        <w:t xml:space="preserve"> refer to leisure activities undertaken in natural or outdoor settings for enjoyment, physical exercise, relaxation, adventure, or appreciation of nature. Examples include hiking, camping, cycling, wildlife watching, fishing, surfing, visiting national parks, and caravan or road trips.</w:t>
       </w:r>
     </w:p>
     <w:p>
@@ -5302,7 +5321,6 @@
   <w:style w:type="character" w:default="1" w:styleId="DefaultParagraphFont">
     <w:name w:val="Default Paragraph Font"/>
     <w:uiPriority w:val="1"/>
-    <w:semiHidden/>
     <w:unhideWhenUsed/>
   </w:style>
   <w:style w:type="table" w:default="1" w:styleId="TableNormal">

</xml_diff>

<commit_message>
update chart 1.2 label
</commit_message>
<xml_diff>
--- a/draft.docx
+++ b/draft.docx
@@ -192,7 +192,15 @@
         <w:t xml:space="preserve"> </w:t>
       </w:r>
       <w:r>
-        <w:t>(AusPlay Survey)</w:t>
+        <w:t>(</w:t>
+      </w:r>
+      <w:proofErr w:type="spellStart"/>
+      <w:r>
+        <w:t>AusPlay</w:t>
+      </w:r>
+      <w:proofErr w:type="spellEnd"/>
+      <w:r>
+        <w:t xml:space="preserve"> Survey)</w:t>
       </w:r>
     </w:p>
     <w:p>
@@ -222,18 +230,36 @@
       </w:r>
     </w:p>
     <w:p>
-      <w:r>
-        <w:t>AusPlay – National Data Tables – 30 April 2026</w:t>
+      <w:proofErr w:type="spellStart"/>
+      <w:r>
+        <w:t>AusPlay</w:t>
+      </w:r>
+      <w:proofErr w:type="spellEnd"/>
+      <w:r>
+        <w:t xml:space="preserve"> – National Data Tables – 30 April 2026</w:t>
       </w:r>
     </w:p>
     <w:p>
-      <w:r>
-        <w:t>AusPlay – By Sport Data Tables – 30 April 2026</w:t>
+      <w:proofErr w:type="spellStart"/>
+      <w:r>
+        <w:t>AusPlay</w:t>
+      </w:r>
+      <w:proofErr w:type="spellEnd"/>
+      <w:r>
+        <w:t xml:space="preserve"> – By Sport Data Tables – 30 April 2026</w:t>
       </w:r>
     </w:p>
     <w:p>
       <w:r>
-        <w:t xml:space="preserve">ABS – AusGenerationTimeSpent - </w:t>
+        <w:t xml:space="preserve">ABS – </w:t>
+      </w:r>
+      <w:proofErr w:type="spellStart"/>
+      <w:r>
+        <w:t>AusGenerationTimeSpent</w:t>
+      </w:r>
+      <w:proofErr w:type="spellEnd"/>
+      <w:r>
+        <w:t xml:space="preserve"> - </w:t>
       </w:r>
       <w:r>
         <w:t>16/04/2024</w:t>
@@ -1473,8 +1499,13 @@
               <w:spacing w:after="160" w:line="278" w:lineRule="auto"/>
             </w:pPr>
             <w:r>
-              <w:t>ABS TableBuilder</w:t>
-            </w:r>
+              <w:t xml:space="preserve">ABS </w:t>
+            </w:r>
+            <w:proofErr w:type="spellStart"/>
+            <w:r>
+              <w:t>TableBuilder</w:t>
+            </w:r>
+            <w:proofErr w:type="spellEnd"/>
           </w:p>
         </w:tc>
       </w:tr>
@@ -1653,8 +1684,13 @@
               <w:spacing w:after="160" w:line="278" w:lineRule="auto"/>
             </w:pPr>
             <w:r>
-              <w:t>ABS TableBuilder</w:t>
-            </w:r>
+              <w:t xml:space="preserve">ABS </w:t>
+            </w:r>
+            <w:proofErr w:type="spellStart"/>
+            <w:r>
+              <w:t>TableBuilder</w:t>
+            </w:r>
+            <w:proofErr w:type="spellEnd"/>
           </w:p>
         </w:tc>
       </w:tr>
@@ -1743,8 +1779,13 @@
               <w:spacing w:after="160" w:line="278" w:lineRule="auto"/>
             </w:pPr>
             <w:r>
-              <w:t>ABS TableBuilder</w:t>
-            </w:r>
+              <w:t xml:space="preserve">ABS </w:t>
+            </w:r>
+            <w:proofErr w:type="spellStart"/>
+            <w:r>
+              <w:t>TableBuilder</w:t>
+            </w:r>
+            <w:proofErr w:type="spellEnd"/>
           </w:p>
         </w:tc>
       </w:tr>
@@ -1927,8 +1968,13 @@
               <w:spacing w:after="160" w:line="278" w:lineRule="auto"/>
             </w:pPr>
             <w:r>
-              <w:t>ABS TableBuilder</w:t>
-            </w:r>
+              <w:t xml:space="preserve">ABS </w:t>
+            </w:r>
+            <w:proofErr w:type="spellStart"/>
+            <w:r>
+              <w:t>TableBuilder</w:t>
+            </w:r>
+            <w:proofErr w:type="spellEnd"/>
           </w:p>
         </w:tc>
       </w:tr>
@@ -2017,8 +2063,13 @@
               <w:spacing w:after="160" w:line="278" w:lineRule="auto"/>
             </w:pPr>
             <w:r>
-              <w:t>ABS TableBuilder</w:t>
-            </w:r>
+              <w:t xml:space="preserve">ABS </w:t>
+            </w:r>
+            <w:proofErr w:type="spellStart"/>
+            <w:r>
+              <w:t>TableBuilder</w:t>
+            </w:r>
+            <w:proofErr w:type="spellEnd"/>
           </w:p>
         </w:tc>
       </w:tr>
@@ -2193,8 +2244,13 @@
               <w:spacing w:after="160" w:line="278" w:lineRule="auto"/>
             </w:pPr>
             <w:r>
-              <w:t>ABS TableBuilder</w:t>
-            </w:r>
+              <w:t xml:space="preserve">ABS </w:t>
+            </w:r>
+            <w:proofErr w:type="spellStart"/>
+            <w:r>
+              <w:t>TableBuilder</w:t>
+            </w:r>
+            <w:proofErr w:type="spellEnd"/>
           </w:p>
         </w:tc>
       </w:tr>
@@ -2283,8 +2339,13 @@
               <w:spacing w:after="160" w:line="278" w:lineRule="auto"/>
             </w:pPr>
             <w:r>
-              <w:t>ABS 2013–14/TableBuilder</w:t>
-            </w:r>
+              <w:t>ABS 2013–14/</w:t>
+            </w:r>
+            <w:proofErr w:type="spellStart"/>
+            <w:r>
+              <w:t>TableBuilder</w:t>
+            </w:r>
+            <w:proofErr w:type="spellEnd"/>
           </w:p>
         </w:tc>
       </w:tr>
@@ -2370,8 +2431,13 @@
               <w:spacing w:after="160" w:line="278" w:lineRule="auto"/>
             </w:pPr>
             <w:r>
-              <w:t>ABS 2013–14/TableBuilder</w:t>
-            </w:r>
+              <w:t>ABS 2013–14/</w:t>
+            </w:r>
+            <w:proofErr w:type="spellStart"/>
+            <w:r>
+              <w:t>TableBuilder</w:t>
+            </w:r>
+            <w:proofErr w:type="spellEnd"/>
           </w:p>
         </w:tc>
       </w:tr>
@@ -2460,8 +2526,13 @@
               <w:spacing w:after="160" w:line="278" w:lineRule="auto"/>
             </w:pPr>
             <w:r>
-              <w:t>ABS TableBuilder</w:t>
-            </w:r>
+              <w:t xml:space="preserve">ABS </w:t>
+            </w:r>
+            <w:proofErr w:type="spellStart"/>
+            <w:r>
+              <w:t>TableBuilder</w:t>
+            </w:r>
+            <w:proofErr w:type="spellEnd"/>
           </w:p>
         </w:tc>
       </w:tr>
@@ -2550,8 +2621,13 @@
               <w:spacing w:after="160" w:line="278" w:lineRule="auto"/>
             </w:pPr>
             <w:r>
-              <w:t>ABS TableBuilder</w:t>
-            </w:r>
+              <w:t xml:space="preserve">ABS </w:t>
+            </w:r>
+            <w:proofErr w:type="spellStart"/>
+            <w:r>
+              <w:t>TableBuilder</w:t>
+            </w:r>
+            <w:proofErr w:type="spellEnd"/>
           </w:p>
         </w:tc>
       </w:tr>
@@ -2906,8 +2982,13 @@
               <w:spacing w:after="160" w:line="278" w:lineRule="auto"/>
             </w:pPr>
             <w:r>
-              <w:t>ABS historical/TableBuilder</w:t>
-            </w:r>
+              <w:t>ABS historical/</w:t>
+            </w:r>
+            <w:proofErr w:type="spellStart"/>
+            <w:r>
+              <w:t>TableBuilder</w:t>
+            </w:r>
+            <w:proofErr w:type="spellEnd"/>
           </w:p>
         </w:tc>
       </w:tr>
@@ -3082,8 +3163,13 @@
               <w:spacing w:after="160" w:line="278" w:lineRule="auto"/>
             </w:pPr>
             <w:r>
-              <w:t>ABS TableBuilder</w:t>
-            </w:r>
+              <w:t xml:space="preserve">ABS </w:t>
+            </w:r>
+            <w:proofErr w:type="spellStart"/>
+            <w:r>
+              <w:t>TableBuilder</w:t>
+            </w:r>
+            <w:proofErr w:type="spellEnd"/>
           </w:p>
         </w:tc>
       </w:tr>
@@ -3129,12 +3215,21 @@
       <w:r>
         <w:t xml:space="preserve">It is the Australian Sports Commission's </w:t>
       </w:r>
+      <w:proofErr w:type="spellStart"/>
       <w:r>
         <w:rPr>
           <w:b/>
           <w:bCs/>
         </w:rPr>
-        <w:t>AusPlay January–December 2025</w:t>
+        <w:t>AusPlay</w:t>
+      </w:r>
+      <w:proofErr w:type="spellEnd"/>
+      <w:r>
+        <w:rPr>
+          <w:b/>
+          <w:bCs/>
+        </w:rPr>
+        <w:t xml:space="preserve"> January–December 2025</w:t>
       </w:r>
       <w:r>
         <w:t xml:space="preserve"> data.</w:t>
@@ -3721,7 +3816,15 @@
     </w:p>
     <w:p>
       <w:r>
-        <w:t>The ASC confirms that the January–December 2025 AusPlay data provide national, state and territory estimates, and that the latest release was 30 April 2026</w:t>
+        <w:t xml:space="preserve">The ASC confirms that the January–December 2025 </w:t>
+      </w:r>
+      <w:proofErr w:type="spellStart"/>
+      <w:r>
+        <w:t>AusPlay</w:t>
+      </w:r>
+      <w:proofErr w:type="spellEnd"/>
+      <w:r>
+        <w:t xml:space="preserve"> data provide national, state and territory estimates, and that the latest release was 30 April 2026</w:t>
       </w:r>
     </w:p>
     <w:p>
@@ -3790,6 +3893,7 @@
           <w:ilvl w:val="0"/>
           <w:numId w:val="3"/>
         </w:numPr>
+        <w:spacing w:after="0"/>
       </w:pPr>
       <w:r>
         <w:t xml:space="preserve">Generation Z </w:t>
@@ -3801,6 +3905,7 @@
           <w:ilvl w:val="0"/>
           <w:numId w:val="3"/>
         </w:numPr>
+        <w:spacing w:after="0"/>
       </w:pPr>
       <w:r>
         <w:t xml:space="preserve">Millennials </w:t>
@@ -3812,6 +3917,7 @@
           <w:ilvl w:val="0"/>
           <w:numId w:val="3"/>
         </w:numPr>
+        <w:spacing w:after="0"/>
       </w:pPr>
       <w:r>
         <w:t xml:space="preserve">Generation X </w:t>
@@ -3823,6 +3929,7 @@
           <w:ilvl w:val="0"/>
           <w:numId w:val="3"/>
         </w:numPr>
+        <w:spacing w:after="0"/>
       </w:pPr>
       <w:r>
         <w:t xml:space="preserve">Baby Boomers </w:t>
@@ -3834,6 +3941,7 @@
           <w:ilvl w:val="0"/>
           <w:numId w:val="3"/>
         </w:numPr>
+        <w:spacing w:after="0"/>
       </w:pPr>
       <w:r>
         <w:t xml:space="preserve">Interwar generation </w:t>
@@ -3845,6 +3953,7 @@
           <w:ilvl w:val="0"/>
           <w:numId w:val="3"/>
         </w:numPr>
+        <w:spacing w:after="0"/>
       </w:pPr>
       <w:r>
         <w:t xml:space="preserve">male/female/person </w:t>
@@ -3856,6 +3965,7 @@
           <w:ilvl w:val="0"/>
           <w:numId w:val="3"/>
         </w:numPr>
+        <w:spacing w:after="0"/>
       </w:pPr>
       <w:r>
         <w:t xml:space="preserve">proportion participating </w:t>
@@ -3867,6 +3977,7 @@
           <w:ilvl w:val="0"/>
           <w:numId w:val="3"/>
         </w:numPr>
+        <w:spacing w:after="0"/>
       </w:pPr>
       <w:r>
         <w:t xml:space="preserve">average time spent per day </w:t>
@@ -4188,7 +4299,15 @@
     </w:tbl>
     <w:p>
       <w:r>
-        <w:t>So this dataset can answer something that AusPlay doesn't answer as directly:</w:t>
+        <w:t xml:space="preserve">So this dataset can answer something that </w:t>
+      </w:r>
+      <w:proofErr w:type="spellStart"/>
+      <w:r>
+        <w:t>AusPlay</w:t>
+      </w:r>
+      <w:proofErr w:type="spellEnd"/>
+      <w:r>
+        <w:t xml:space="preserve"> doesn't answer as directly:</w:t>
       </w:r>
     </w:p>
     <w:p>
@@ -4206,8 +4325,15 @@
       </w:r>
     </w:p>
     <w:p>
-      <w:r>
-        <w:lastRenderedPageBreak/>
+      <w:pPr>
+        <w:sectPr>
+          <w:pgSz w:w="11906" w:h="16838"/>
+          <w:pgMar w:top="1440" w:right="1440" w:bottom="1440" w:left="1440" w:header="708" w:footer="708" w:gutter="0"/>
+          <w:cols w:space="708"/>
+          <w:docGrid w:linePitch="360"/>
+        </w:sectPr>
+      </w:pPr>
+      <w:r>
         <w:t xml:space="preserve">But it does </w:t>
       </w:r>
       <w:r>
@@ -4221,6 +4347,1571 @@
         <w:t xml:space="preserve"> give you the detailed activity × state × geography information you need for your main visualisation.</w:t>
       </w:r>
     </w:p>
+    <w:p/>
+    <w:tbl>
+      <w:tblPr>
+        <w:tblStyle w:val="TableGrid"/>
+        <w:tblW w:w="14184" w:type="dxa"/>
+        <w:tblLook w:val="04A0" w:firstRow="1" w:lastRow="0" w:firstColumn="1" w:lastColumn="0" w:noHBand="0" w:noVBand="1"/>
+      </w:tblPr>
+      <w:tblGrid>
+        <w:gridCol w:w="3448"/>
+        <w:gridCol w:w="460"/>
+        <w:gridCol w:w="3608"/>
+        <w:gridCol w:w="2539"/>
+        <w:gridCol w:w="4129"/>
+      </w:tblGrid>
+      <w:tr>
+        <w:tc>
+          <w:tcPr>
+            <w:tcW w:w="3448" w:type="dxa"/>
+            <w:hideMark/>
+          </w:tcPr>
+          <w:p>
+            <w:pPr>
+              <w:spacing w:line="278" w:lineRule="auto"/>
+              <w:rPr>
+                <w:b/>
+                <w:bCs/>
+              </w:rPr>
+            </w:pPr>
+            <w:r>
+              <w:rPr>
+                <w:b/>
+                <w:bCs/>
+              </w:rPr>
+              <w:t>Section</w:t>
+            </w:r>
+          </w:p>
+        </w:tc>
+        <w:tc>
+          <w:tcPr>
+            <w:tcW w:w="0" w:type="auto"/>
+            <w:hideMark/>
+          </w:tcPr>
+          <w:p>
+            <w:pPr>
+              <w:spacing w:line="278" w:lineRule="auto"/>
+              <w:rPr>
+                <w:b/>
+                <w:bCs/>
+              </w:rPr>
+            </w:pPr>
+            <w:r>
+              <w:rPr>
+                <w:b/>
+                <w:bCs/>
+              </w:rPr>
+              <w:t>#</w:t>
+            </w:r>
+          </w:p>
+        </w:tc>
+        <w:tc>
+          <w:tcPr>
+            <w:tcW w:w="0" w:type="auto"/>
+            <w:hideMark/>
+          </w:tcPr>
+          <w:p>
+            <w:pPr>
+              <w:spacing w:line="278" w:lineRule="auto"/>
+              <w:rPr>
+                <w:b/>
+                <w:bCs/>
+              </w:rPr>
+            </w:pPr>
+            <w:r>
+              <w:rPr>
+                <w:b/>
+                <w:bCs/>
+              </w:rPr>
+              <w:t>Visual</w:t>
+            </w:r>
+          </w:p>
+        </w:tc>
+        <w:tc>
+          <w:tcPr>
+            <w:tcW w:w="0" w:type="auto"/>
+            <w:hideMark/>
+          </w:tcPr>
+          <w:p>
+            <w:pPr>
+              <w:spacing w:line="278" w:lineRule="auto"/>
+              <w:rPr>
+                <w:b/>
+                <w:bCs/>
+              </w:rPr>
+            </w:pPr>
+            <w:r>
+              <w:rPr>
+                <w:b/>
+                <w:bCs/>
+              </w:rPr>
+              <w:t>Type</w:t>
+            </w:r>
+          </w:p>
+        </w:tc>
+        <w:tc>
+          <w:tcPr>
+            <w:tcW w:w="0" w:type="auto"/>
+            <w:hideMark/>
+          </w:tcPr>
+          <w:p>
+            <w:pPr>
+              <w:spacing w:line="278" w:lineRule="auto"/>
+              <w:rPr>
+                <w:b/>
+                <w:bCs/>
+              </w:rPr>
+            </w:pPr>
+            <w:r>
+              <w:rPr>
+                <w:b/>
+                <w:bCs/>
+              </w:rPr>
+              <w:t>Main question</w:t>
+            </w:r>
+          </w:p>
+        </w:tc>
+      </w:tr>
+      <w:tr>
+        <w:tc>
+          <w:tcPr>
+            <w:tcW w:w="3448" w:type="dxa"/>
+            <w:hideMark/>
+          </w:tcPr>
+          <w:p>
+            <w:pPr>
+              <w:spacing w:line="278" w:lineRule="auto"/>
+            </w:pPr>
+            <w:r>
+              <w:rPr>
+                <w:b/>
+                <w:bCs/>
+              </w:rPr>
+              <w:t>1. Does Australia Really Live Outdoors?</w:t>
+            </w:r>
+          </w:p>
+        </w:tc>
+        <w:tc>
+          <w:tcPr>
+            <w:tcW w:w="0" w:type="auto"/>
+            <w:hideMark/>
+          </w:tcPr>
+          <w:p>
+            <w:pPr>
+              <w:spacing w:line="278" w:lineRule="auto"/>
+            </w:pPr>
+            <w:r>
+              <w:t>1</w:t>
+            </w:r>
+          </w:p>
+        </w:tc>
+        <w:tc>
+          <w:tcPr>
+            <w:tcW w:w="0" w:type="auto"/>
+            <w:hideMark/>
+          </w:tcPr>
+          <w:p>
+            <w:pPr>
+              <w:spacing w:line="278" w:lineRule="auto"/>
+            </w:pPr>
+            <w:r>
+              <w:t>Participation Activeness</w:t>
+            </w:r>
+          </w:p>
+        </w:tc>
+        <w:tc>
+          <w:tcPr>
+            <w:tcW w:w="0" w:type="auto"/>
+            <w:hideMark/>
+          </w:tcPr>
+          <w:p>
+            <w:pPr>
+              <w:spacing w:line="278" w:lineRule="auto"/>
+            </w:pPr>
+            <w:r>
+              <w:rPr>
+                <w:b/>
+                <w:bCs/>
+              </w:rPr>
+              <w:t>Basic – Donut</w:t>
+            </w:r>
+          </w:p>
+        </w:tc>
+        <w:tc>
+          <w:tcPr>
+            <w:tcW w:w="0" w:type="auto"/>
+            <w:hideMark/>
+          </w:tcPr>
+          <w:p>
+            <w:pPr>
+              <w:spacing w:line="278" w:lineRule="auto"/>
+            </w:pPr>
+            <w:r>
+              <w:t>How many Australians participate?</w:t>
+            </w:r>
+          </w:p>
+        </w:tc>
+      </w:tr>
+      <w:tr>
+        <w:tc>
+          <w:tcPr>
+            <w:tcW w:w="3448" w:type="dxa"/>
+            <w:hideMark/>
+          </w:tcPr>
+          <w:p>
+            <w:pPr>
+              <w:spacing w:line="278" w:lineRule="auto"/>
+            </w:pPr>
+          </w:p>
+        </w:tc>
+        <w:tc>
+          <w:tcPr>
+            <w:tcW w:w="0" w:type="auto"/>
+            <w:hideMark/>
+          </w:tcPr>
+          <w:p>
+            <w:pPr>
+              <w:spacing w:line="278" w:lineRule="auto"/>
+            </w:pPr>
+            <w:r>
+              <w:t>2</w:t>
+            </w:r>
+          </w:p>
+        </w:tc>
+        <w:tc>
+          <w:tcPr>
+            <w:tcW w:w="0" w:type="auto"/>
+            <w:hideMark/>
+          </w:tcPr>
+          <w:p>
+            <w:pPr>
+              <w:spacing w:line="278" w:lineRule="auto"/>
+            </w:pPr>
+            <w:r>
+              <w:t>Top 20 Activities</w:t>
+            </w:r>
+          </w:p>
+        </w:tc>
+        <w:tc>
+          <w:tcPr>
+            <w:tcW w:w="0" w:type="auto"/>
+            <w:hideMark/>
+          </w:tcPr>
+          <w:p>
+            <w:pPr>
+              <w:spacing w:line="278" w:lineRule="auto"/>
+            </w:pPr>
+            <w:r>
+              <w:rPr>
+                <w:b/>
+                <w:bCs/>
+              </w:rPr>
+              <w:t>Basic – Ranked bar</w:t>
+            </w:r>
+          </w:p>
+        </w:tc>
+        <w:tc>
+          <w:tcPr>
+            <w:tcW w:w="0" w:type="auto"/>
+            <w:hideMark/>
+          </w:tcPr>
+          <w:p>
+            <w:pPr>
+              <w:spacing w:line="278" w:lineRule="auto"/>
+            </w:pPr>
+            <w:r>
+              <w:t>What do Australians actually do?</w:t>
+            </w:r>
+          </w:p>
+        </w:tc>
+      </w:tr>
+      <w:tr>
+        <w:tc>
+          <w:tcPr>
+            <w:tcW w:w="3448" w:type="dxa"/>
+            <w:hideMark/>
+          </w:tcPr>
+          <w:p>
+            <w:pPr>
+              <w:spacing w:line="278" w:lineRule="auto"/>
+            </w:pPr>
+          </w:p>
+        </w:tc>
+        <w:tc>
+          <w:tcPr>
+            <w:tcW w:w="0" w:type="auto"/>
+            <w:hideMark/>
+          </w:tcPr>
+          <w:p>
+            <w:pPr>
+              <w:spacing w:line="278" w:lineRule="auto"/>
+            </w:pPr>
+            <w:r>
+              <w:t>3</w:t>
+            </w:r>
+          </w:p>
+        </w:tc>
+        <w:tc>
+          <w:tcPr>
+            <w:tcW w:w="0" w:type="auto"/>
+            <w:hideMark/>
+          </w:tcPr>
+          <w:p>
+            <w:pPr>
+              <w:spacing w:line="278" w:lineRule="auto"/>
+            </w:pPr>
+            <w:r>
+              <w:t>Top Outdoor Activities</w:t>
+            </w:r>
+          </w:p>
+        </w:tc>
+        <w:tc>
+          <w:tcPr>
+            <w:tcW w:w="0" w:type="auto"/>
+            <w:hideMark/>
+          </w:tcPr>
+          <w:p>
+            <w:pPr>
+              <w:spacing w:line="278" w:lineRule="auto"/>
+            </w:pPr>
+            <w:r>
+              <w:rPr>
+                <w:b/>
+                <w:bCs/>
+              </w:rPr>
+              <w:t>Basic – Ranked bar</w:t>
+            </w:r>
+          </w:p>
+        </w:tc>
+        <w:tc>
+          <w:tcPr>
+            <w:tcW w:w="0" w:type="auto"/>
+            <w:hideMark/>
+          </w:tcPr>
+          <w:p>
+            <w:pPr>
+              <w:spacing w:line="278" w:lineRule="auto"/>
+            </w:pPr>
+            <w:r>
+              <w:t>What does the outdoor part of Australian recreation look like?</w:t>
+            </w:r>
+          </w:p>
+        </w:tc>
+      </w:tr>
+      <w:tr>
+        <w:tc>
+          <w:tcPr>
+            <w:tcW w:w="3448" w:type="dxa"/>
+            <w:hideMark/>
+          </w:tcPr>
+          <w:p>
+            <w:pPr>
+              <w:spacing w:line="278" w:lineRule="auto"/>
+            </w:pPr>
+            <w:r>
+              <w:rPr>
+                <w:b/>
+                <w:bCs/>
+              </w:rPr>
+              <w:t>2. What Does “Going Outdoors” Actually Mean?</w:t>
+            </w:r>
+          </w:p>
+        </w:tc>
+        <w:tc>
+          <w:tcPr>
+            <w:tcW w:w="0" w:type="auto"/>
+            <w:hideMark/>
+          </w:tcPr>
+          <w:p>
+            <w:pPr>
+              <w:spacing w:line="278" w:lineRule="auto"/>
+            </w:pPr>
+            <w:r>
+              <w:t>4</w:t>
+            </w:r>
+          </w:p>
+        </w:tc>
+        <w:tc>
+          <w:tcPr>
+            <w:tcW w:w="0" w:type="auto"/>
+            <w:hideMark/>
+          </w:tcPr>
+          <w:p>
+            <w:pPr>
+              <w:spacing w:line="278" w:lineRule="auto"/>
+            </w:pPr>
+            <w:r>
+              <w:t>Organised vs non-organised outdoor participation</w:t>
+            </w:r>
+          </w:p>
+        </w:tc>
+        <w:tc>
+          <w:tcPr>
+            <w:tcW w:w="0" w:type="auto"/>
+            <w:hideMark/>
+          </w:tcPr>
+          <w:p>
+            <w:pPr>
+              <w:spacing w:line="278" w:lineRule="auto"/>
+            </w:pPr>
+            <w:r>
+              <w:rPr>
+                <w:b/>
+                <w:bCs/>
+              </w:rPr>
+              <w:t>Basic – Grouped/stacked bar</w:t>
+            </w:r>
+          </w:p>
+        </w:tc>
+        <w:tc>
+          <w:tcPr>
+            <w:tcW w:w="0" w:type="auto"/>
+            <w:hideMark/>
+          </w:tcPr>
+          <w:p>
+            <w:pPr>
+              <w:spacing w:line="278" w:lineRule="auto"/>
+            </w:pPr>
+            <w:r>
+              <w:t>Is outdoor recreation structured or casual?</w:t>
+            </w:r>
+          </w:p>
+        </w:tc>
+      </w:tr>
+      <w:tr>
+        <w:tc>
+          <w:tcPr>
+            <w:tcW w:w="3448" w:type="dxa"/>
+            <w:hideMark/>
+          </w:tcPr>
+          <w:p>
+            <w:pPr>
+              <w:spacing w:line="278" w:lineRule="auto"/>
+            </w:pPr>
+          </w:p>
+        </w:tc>
+        <w:tc>
+          <w:tcPr>
+            <w:tcW w:w="0" w:type="auto"/>
+            <w:hideMark/>
+          </w:tcPr>
+          <w:p>
+            <w:pPr>
+              <w:spacing w:line="278" w:lineRule="auto"/>
+            </w:pPr>
+            <w:r>
+              <w:t>5</w:t>
+            </w:r>
+          </w:p>
+        </w:tc>
+        <w:tc>
+          <w:tcPr>
+            <w:tcW w:w="0" w:type="auto"/>
+            <w:hideMark/>
+          </w:tcPr>
+          <w:p>
+            <w:pPr>
+              <w:spacing w:line="278" w:lineRule="auto"/>
+            </w:pPr>
+            <w:r>
+              <w:t>Outdoor Activity × Age</w:t>
+            </w:r>
+          </w:p>
+        </w:tc>
+        <w:tc>
+          <w:tcPr>
+            <w:tcW w:w="0" w:type="auto"/>
+            <w:hideMark/>
+          </w:tcPr>
+          <w:p>
+            <w:pPr>
+              <w:spacing w:line="278" w:lineRule="auto"/>
+            </w:pPr>
+            <w:r>
+              <w:rPr>
+                <w:b/>
+                <w:bCs/>
+              </w:rPr>
+              <w:t>Advanced – Heatmap</w:t>
+            </w:r>
+          </w:p>
+        </w:tc>
+        <w:tc>
+          <w:tcPr>
+            <w:tcW w:w="0" w:type="auto"/>
+            <w:hideMark/>
+          </w:tcPr>
+          <w:p>
+            <w:pPr>
+              <w:spacing w:line="278" w:lineRule="auto"/>
+            </w:pPr>
+            <w:r>
+              <w:t>Which outdoor activities attract different generations?</w:t>
+            </w:r>
+          </w:p>
+        </w:tc>
+      </w:tr>
+      <w:tr>
+        <w:tc>
+          <w:tcPr>
+            <w:tcW w:w="3448" w:type="dxa"/>
+            <w:hideMark/>
+          </w:tcPr>
+          <w:p>
+            <w:pPr>
+              <w:spacing w:line="278" w:lineRule="auto"/>
+            </w:pPr>
+          </w:p>
+        </w:tc>
+        <w:tc>
+          <w:tcPr>
+            <w:tcW w:w="0" w:type="auto"/>
+            <w:hideMark/>
+          </w:tcPr>
+          <w:p>
+            <w:pPr>
+              <w:spacing w:line="278" w:lineRule="auto"/>
+            </w:pPr>
+            <w:r>
+              <w:t>6</w:t>
+            </w:r>
+          </w:p>
+        </w:tc>
+        <w:tc>
+          <w:tcPr>
+            <w:tcW w:w="0" w:type="auto"/>
+            <w:hideMark/>
+          </w:tcPr>
+          <w:p>
+            <w:pPr>
+              <w:spacing w:line="278" w:lineRule="auto"/>
+            </w:pPr>
+            <w:r>
+              <w:t>Age Profiles of Outdoor Activities</w:t>
+            </w:r>
+          </w:p>
+        </w:tc>
+        <w:tc>
+          <w:tcPr>
+            <w:tcW w:w="0" w:type="auto"/>
+            <w:hideMark/>
+          </w:tcPr>
+          <w:p>
+            <w:pPr>
+              <w:spacing w:line="278" w:lineRule="auto"/>
+            </w:pPr>
+            <w:r>
+              <w:rPr>
+                <w:b/>
+                <w:bCs/>
+              </w:rPr>
+              <w:t>Advanced – Small multiples</w:t>
+            </w:r>
+          </w:p>
+        </w:tc>
+        <w:tc>
+          <w:tcPr>
+            <w:tcW w:w="0" w:type="auto"/>
+            <w:hideMark/>
+          </w:tcPr>
+          <w:p>
+            <w:pPr>
+              <w:spacing w:line="278" w:lineRule="auto"/>
+            </w:pPr>
+            <w:r>
+              <w:t>How does each activity's audience differ by age?</w:t>
+            </w:r>
+          </w:p>
+        </w:tc>
+      </w:tr>
+      <w:tr>
+        <w:tc>
+          <w:tcPr>
+            <w:tcW w:w="3448" w:type="dxa"/>
+            <w:hideMark/>
+          </w:tcPr>
+          <w:p>
+            <w:pPr>
+              <w:spacing w:line="278" w:lineRule="auto"/>
+            </w:pPr>
+            <w:r>
+              <w:rPr>
+                <w:b/>
+                <w:bCs/>
+              </w:rPr>
+              <w:t>3. Is Outdoor Australia a Place?</w:t>
+            </w:r>
+          </w:p>
+        </w:tc>
+        <w:tc>
+          <w:tcPr>
+            <w:tcW w:w="0" w:type="auto"/>
+            <w:hideMark/>
+          </w:tcPr>
+          <w:p>
+            <w:pPr>
+              <w:spacing w:line="278" w:lineRule="auto"/>
+            </w:pPr>
+            <w:r>
+              <w:t>7</w:t>
+            </w:r>
+          </w:p>
+        </w:tc>
+        <w:tc>
+          <w:tcPr>
+            <w:tcW w:w="0" w:type="auto"/>
+            <w:hideMark/>
+          </w:tcPr>
+          <w:p>
+            <w:pPr>
+              <w:spacing w:line="278" w:lineRule="auto"/>
+            </w:pPr>
+            <w:r>
+              <w:t>Participation by State</w:t>
+            </w:r>
+          </w:p>
+        </w:tc>
+        <w:tc>
+          <w:tcPr>
+            <w:tcW w:w="0" w:type="auto"/>
+            <w:hideMark/>
+          </w:tcPr>
+          <w:p>
+            <w:pPr>
+              <w:spacing w:line="278" w:lineRule="auto"/>
+            </w:pPr>
+            <w:r>
+              <w:rPr>
+                <w:b/>
+                <w:bCs/>
+              </w:rPr>
+              <w:t>Basic – Dot plot</w:t>
+            </w:r>
+          </w:p>
+        </w:tc>
+        <w:tc>
+          <w:tcPr>
+            <w:tcW w:w="0" w:type="auto"/>
+            <w:hideMark/>
+          </w:tcPr>
+          <w:p>
+            <w:pPr>
+              <w:spacing w:line="278" w:lineRule="auto"/>
+            </w:pPr>
+            <w:r>
+              <w:t>Which states participate more?</w:t>
+            </w:r>
+          </w:p>
+        </w:tc>
+      </w:tr>
+      <w:tr>
+        <w:tc>
+          <w:tcPr>
+            <w:tcW w:w="3448" w:type="dxa"/>
+            <w:hideMark/>
+          </w:tcPr>
+          <w:p>
+            <w:pPr>
+              <w:spacing w:line="278" w:lineRule="auto"/>
+            </w:pPr>
+          </w:p>
+        </w:tc>
+        <w:tc>
+          <w:tcPr>
+            <w:tcW w:w="0" w:type="auto"/>
+            <w:hideMark/>
+          </w:tcPr>
+          <w:p>
+            <w:pPr>
+              <w:spacing w:line="278" w:lineRule="auto"/>
+            </w:pPr>
+            <w:r>
+              <w:t>8</w:t>
+            </w:r>
+          </w:p>
+        </w:tc>
+        <w:tc>
+          <w:tcPr>
+            <w:tcW w:w="0" w:type="auto"/>
+            <w:hideMark/>
+          </w:tcPr>
+          <w:p>
+            <w:pPr>
+              <w:spacing w:line="278" w:lineRule="auto"/>
+            </w:pPr>
+            <w:r>
+              <w:t>Geographic Variation of Outdoor Activities</w:t>
+            </w:r>
+          </w:p>
+        </w:tc>
+        <w:tc>
+          <w:tcPr>
+            <w:tcW w:w="0" w:type="auto"/>
+            <w:hideMark/>
+          </w:tcPr>
+          <w:p>
+            <w:pPr>
+              <w:spacing w:line="278" w:lineRule="auto"/>
+            </w:pPr>
+            <w:r>
+              <w:rPr>
+                <w:b/>
+                <w:bCs/>
+              </w:rPr>
+              <w:t>Advanced – Box plot</w:t>
+            </w:r>
+          </w:p>
+        </w:tc>
+        <w:tc>
+          <w:tcPr>
+            <w:tcW w:w="0" w:type="auto"/>
+            <w:hideMark/>
+          </w:tcPr>
+          <w:p>
+            <w:pPr>
+              <w:spacing w:line="278" w:lineRule="auto"/>
+            </w:pPr>
+            <w:r>
+              <w:t>Are some outdoor activities geographically concentrated?</w:t>
+            </w:r>
+          </w:p>
+        </w:tc>
+      </w:tr>
+      <w:tr>
+        <w:tc>
+          <w:tcPr>
+            <w:tcW w:w="3448" w:type="dxa"/>
+            <w:hideMark/>
+          </w:tcPr>
+          <w:p>
+            <w:pPr>
+              <w:spacing w:line="278" w:lineRule="auto"/>
+            </w:pPr>
+          </w:p>
+        </w:tc>
+        <w:tc>
+          <w:tcPr>
+            <w:tcW w:w="0" w:type="auto"/>
+            <w:hideMark/>
+          </w:tcPr>
+          <w:p>
+            <w:pPr>
+              <w:spacing w:line="278" w:lineRule="auto"/>
+            </w:pPr>
+            <w:r>
+              <w:t>9</w:t>
+            </w:r>
+          </w:p>
+        </w:tc>
+        <w:tc>
+          <w:tcPr>
+            <w:tcW w:w="0" w:type="auto"/>
+            <w:hideMark/>
+          </w:tcPr>
+          <w:p>
+            <w:pPr>
+              <w:spacing w:line="278" w:lineRule="auto"/>
+            </w:pPr>
+            <w:r>
+              <w:t>Overall Participation by State</w:t>
+            </w:r>
+          </w:p>
+        </w:tc>
+        <w:tc>
+          <w:tcPr>
+            <w:tcW w:w="0" w:type="auto"/>
+            <w:hideMark/>
+          </w:tcPr>
+          <w:p>
+            <w:pPr>
+              <w:spacing w:line="278" w:lineRule="auto"/>
+            </w:pPr>
+            <w:r>
+              <w:rPr>
+                <w:b/>
+                <w:bCs/>
+              </w:rPr>
+              <w:t>Map</w:t>
+            </w:r>
+          </w:p>
+        </w:tc>
+        <w:tc>
+          <w:tcPr>
+            <w:tcW w:w="0" w:type="auto"/>
+            <w:hideMark/>
+          </w:tcPr>
+          <w:p>
+            <w:pPr>
+              <w:spacing w:line="278" w:lineRule="auto"/>
+            </w:pPr>
+            <w:r>
+              <w:t>Where is participation highest?</w:t>
+            </w:r>
+          </w:p>
+        </w:tc>
+      </w:tr>
+      <w:tr>
+        <w:tc>
+          <w:tcPr>
+            <w:tcW w:w="3448" w:type="dxa"/>
+            <w:hideMark/>
+          </w:tcPr>
+          <w:p>
+            <w:pPr>
+              <w:spacing w:line="278" w:lineRule="auto"/>
+            </w:pPr>
+          </w:p>
+        </w:tc>
+        <w:tc>
+          <w:tcPr>
+            <w:tcW w:w="0" w:type="auto"/>
+            <w:hideMark/>
+          </w:tcPr>
+          <w:p>
+            <w:pPr>
+              <w:spacing w:line="278" w:lineRule="auto"/>
+            </w:pPr>
+            <w:r>
+              <w:t>10</w:t>
+            </w:r>
+          </w:p>
+        </w:tc>
+        <w:tc>
+          <w:tcPr>
+            <w:tcW w:w="0" w:type="auto"/>
+            <w:hideMark/>
+          </w:tcPr>
+          <w:p>
+            <w:pPr>
+              <w:spacing w:line="278" w:lineRule="auto"/>
+            </w:pPr>
+            <w:r>
+              <w:t>Selected Activity by State</w:t>
+            </w:r>
+          </w:p>
+        </w:tc>
+        <w:tc>
+          <w:tcPr>
+            <w:tcW w:w="0" w:type="auto"/>
+            <w:hideMark/>
+          </w:tcPr>
+          <w:p>
+            <w:pPr>
+              <w:spacing w:line="278" w:lineRule="auto"/>
+            </w:pPr>
+            <w:r>
+              <w:rPr>
+                <w:b/>
+                <w:bCs/>
+              </w:rPr>
+              <w:t>Interactive Map</w:t>
+            </w:r>
+          </w:p>
+        </w:tc>
+        <w:tc>
+          <w:tcPr>
+            <w:tcW w:w="0" w:type="auto"/>
+            <w:hideMark/>
+          </w:tcPr>
+          <w:p>
+            <w:pPr>
+              <w:spacing w:line="278" w:lineRule="auto"/>
+            </w:pPr>
+            <w:r>
+              <w:t>Does the geography change depending on the activity?</w:t>
+            </w:r>
+          </w:p>
+        </w:tc>
+      </w:tr>
+      <w:tr>
+        <w:tc>
+          <w:tcPr>
+            <w:tcW w:w="3448" w:type="dxa"/>
+            <w:hideMark/>
+          </w:tcPr>
+          <w:p>
+            <w:pPr>
+              <w:spacing w:line="278" w:lineRule="auto"/>
+            </w:pPr>
+          </w:p>
+        </w:tc>
+        <w:tc>
+          <w:tcPr>
+            <w:tcW w:w="0" w:type="auto"/>
+            <w:hideMark/>
+          </w:tcPr>
+          <w:p>
+            <w:pPr>
+              <w:spacing w:line="278" w:lineRule="auto"/>
+            </w:pPr>
+            <w:r>
+              <w:t>11</w:t>
+            </w:r>
+          </w:p>
+        </w:tc>
+        <w:tc>
+          <w:tcPr>
+            <w:tcW w:w="0" w:type="auto"/>
+            <w:hideMark/>
+          </w:tcPr>
+          <w:p>
+            <w:pPr>
+              <w:spacing w:line="278" w:lineRule="auto"/>
+            </w:pPr>
+            <w:r>
+              <w:t>Change by State, 2024→2025</w:t>
+            </w:r>
+          </w:p>
+        </w:tc>
+        <w:tc>
+          <w:tcPr>
+            <w:tcW w:w="0" w:type="auto"/>
+            <w:hideMark/>
+          </w:tcPr>
+          <w:p>
+            <w:pPr>
+              <w:spacing w:line="278" w:lineRule="auto"/>
+            </w:pPr>
+            <w:r>
+              <w:rPr>
+                <w:b/>
+                <w:bCs/>
+              </w:rPr>
+              <w:t>Map</w:t>
+            </w:r>
+          </w:p>
+        </w:tc>
+        <w:tc>
+          <w:tcPr>
+            <w:tcW w:w="0" w:type="auto"/>
+            <w:hideMark/>
+          </w:tcPr>
+          <w:p>
+            <w:pPr>
+              <w:spacing w:line="278" w:lineRule="auto"/>
+            </w:pPr>
+            <w:r>
+              <w:t>Where is participation increasing/decreasing?</w:t>
+            </w:r>
+          </w:p>
+        </w:tc>
+      </w:tr>
+      <w:tr>
+        <w:tc>
+          <w:tcPr>
+            <w:tcW w:w="3448" w:type="dxa"/>
+            <w:hideMark/>
+          </w:tcPr>
+          <w:p>
+            <w:pPr>
+              <w:spacing w:line="278" w:lineRule="auto"/>
+            </w:pPr>
+            <w:r>
+              <w:rPr>
+                <w:b/>
+                <w:bCs/>
+              </w:rPr>
+              <w:t>4. Who Gets Outdoors — and Who Doesn't?</w:t>
+            </w:r>
+          </w:p>
+        </w:tc>
+        <w:tc>
+          <w:tcPr>
+            <w:tcW w:w="0" w:type="auto"/>
+            <w:hideMark/>
+          </w:tcPr>
+          <w:p>
+            <w:pPr>
+              <w:spacing w:line="278" w:lineRule="auto"/>
+            </w:pPr>
+            <w:r>
+              <w:t>12</w:t>
+            </w:r>
+          </w:p>
+        </w:tc>
+        <w:tc>
+          <w:tcPr>
+            <w:tcW w:w="0" w:type="auto"/>
+            <w:hideMark/>
+          </w:tcPr>
+          <w:p>
+            <w:pPr>
+              <w:spacing w:line="278" w:lineRule="auto"/>
+            </w:pPr>
+            <w:r>
+              <w:t>Participation by Age</w:t>
+            </w:r>
+          </w:p>
+        </w:tc>
+        <w:tc>
+          <w:tcPr>
+            <w:tcW w:w="0" w:type="auto"/>
+            <w:hideMark/>
+          </w:tcPr>
+          <w:p>
+            <w:pPr>
+              <w:spacing w:line="278" w:lineRule="auto"/>
+            </w:pPr>
+            <w:r>
+              <w:rPr>
+                <w:b/>
+                <w:bCs/>
+              </w:rPr>
+              <w:t>Basic – Bar</w:t>
+            </w:r>
+          </w:p>
+        </w:tc>
+        <w:tc>
+          <w:tcPr>
+            <w:tcW w:w="0" w:type="auto"/>
+            <w:hideMark/>
+          </w:tcPr>
+          <w:p>
+            <w:pPr>
+              <w:spacing w:line="278" w:lineRule="auto"/>
+            </w:pPr>
+            <w:r>
+              <w:t>How does participation change with age?</w:t>
+            </w:r>
+          </w:p>
+        </w:tc>
+      </w:tr>
+      <w:tr>
+        <w:tc>
+          <w:tcPr>
+            <w:tcW w:w="3448" w:type="dxa"/>
+            <w:hideMark/>
+          </w:tcPr>
+          <w:p>
+            <w:pPr>
+              <w:spacing w:line="278" w:lineRule="auto"/>
+            </w:pPr>
+          </w:p>
+        </w:tc>
+        <w:tc>
+          <w:tcPr>
+            <w:tcW w:w="0" w:type="auto"/>
+            <w:hideMark/>
+          </w:tcPr>
+          <w:p>
+            <w:pPr>
+              <w:spacing w:line="278" w:lineRule="auto"/>
+            </w:pPr>
+            <w:r>
+              <w:t>13</w:t>
+            </w:r>
+          </w:p>
+        </w:tc>
+        <w:tc>
+          <w:tcPr>
+            <w:tcW w:w="0" w:type="auto"/>
+            <w:hideMark/>
+          </w:tcPr>
+          <w:p>
+            <w:pPr>
+              <w:spacing w:line="278" w:lineRule="auto"/>
+            </w:pPr>
+            <w:r>
+              <w:t>Male vs Female Participation</w:t>
+            </w:r>
+          </w:p>
+        </w:tc>
+        <w:tc>
+          <w:tcPr>
+            <w:tcW w:w="0" w:type="auto"/>
+            <w:hideMark/>
+          </w:tcPr>
+          <w:p>
+            <w:pPr>
+              <w:spacing w:line="278" w:lineRule="auto"/>
+            </w:pPr>
+            <w:r>
+              <w:rPr>
+                <w:b/>
+                <w:bCs/>
+              </w:rPr>
+              <w:t>Basic – Grouped bar</w:t>
+            </w:r>
+          </w:p>
+        </w:tc>
+        <w:tc>
+          <w:tcPr>
+            <w:tcW w:w="0" w:type="auto"/>
+            <w:hideMark/>
+          </w:tcPr>
+          <w:p>
+            <w:pPr>
+              <w:spacing w:line="278" w:lineRule="auto"/>
+            </w:pPr>
+            <w:r>
+              <w:t>Are outdoor activities equally popular across sexes?</w:t>
+            </w:r>
+          </w:p>
+        </w:tc>
+      </w:tr>
+      <w:tr>
+        <w:tc>
+          <w:tcPr>
+            <w:tcW w:w="3448" w:type="dxa"/>
+            <w:hideMark/>
+          </w:tcPr>
+          <w:p>
+            <w:pPr>
+              <w:spacing w:line="278" w:lineRule="auto"/>
+            </w:pPr>
+          </w:p>
+        </w:tc>
+        <w:tc>
+          <w:tcPr>
+            <w:tcW w:w="0" w:type="auto"/>
+            <w:hideMark/>
+          </w:tcPr>
+          <w:p>
+            <w:pPr>
+              <w:spacing w:line="278" w:lineRule="auto"/>
+            </w:pPr>
+            <w:r>
+              <w:t>14</w:t>
+            </w:r>
+          </w:p>
+        </w:tc>
+        <w:tc>
+          <w:tcPr>
+            <w:tcW w:w="0" w:type="auto"/>
+            <w:hideMark/>
+          </w:tcPr>
+          <w:p>
+            <w:pPr>
+              <w:spacing w:line="278" w:lineRule="auto"/>
+            </w:pPr>
+            <w:r>
+              <w:t>Outdoor Participation Population Pyramid</w:t>
+            </w:r>
+          </w:p>
+        </w:tc>
+        <w:tc>
+          <w:tcPr>
+            <w:tcW w:w="0" w:type="auto"/>
+            <w:hideMark/>
+          </w:tcPr>
+          <w:p>
+            <w:pPr>
+              <w:spacing w:line="278" w:lineRule="auto"/>
+            </w:pPr>
+            <w:r>
+              <w:rPr>
+                <w:b/>
+                <w:bCs/>
+              </w:rPr>
+              <w:t>Advanced – Population pyramid</w:t>
+            </w:r>
+          </w:p>
+        </w:tc>
+        <w:tc>
+          <w:tcPr>
+            <w:tcW w:w="0" w:type="auto"/>
+            <w:hideMark/>
+          </w:tcPr>
+          <w:p>
+            <w:pPr>
+              <w:spacing w:line="278" w:lineRule="auto"/>
+            </w:pPr>
+            <w:r>
+              <w:t>What does the outdoor participant profile look like?</w:t>
+            </w:r>
+          </w:p>
+        </w:tc>
+      </w:tr>
+      <w:tr>
+        <w:tc>
+          <w:tcPr>
+            <w:tcW w:w="3448" w:type="dxa"/>
+            <w:hideMark/>
+          </w:tcPr>
+          <w:p>
+            <w:pPr>
+              <w:spacing w:line="278" w:lineRule="auto"/>
+            </w:pPr>
+          </w:p>
+        </w:tc>
+        <w:tc>
+          <w:tcPr>
+            <w:tcW w:w="0" w:type="auto"/>
+            <w:hideMark/>
+          </w:tcPr>
+          <w:p>
+            <w:pPr>
+              <w:spacing w:line="278" w:lineRule="auto"/>
+            </w:pPr>
+            <w:r>
+              <w:t>15</w:t>
+            </w:r>
+          </w:p>
+        </w:tc>
+        <w:tc>
+          <w:tcPr>
+            <w:tcW w:w="0" w:type="auto"/>
+            <w:hideMark/>
+          </w:tcPr>
+          <w:p>
+            <w:pPr>
+              <w:spacing w:line="278" w:lineRule="auto"/>
+            </w:pPr>
+            <w:r>
+              <w:t>Outdoor Activity Profiles Across Demographics</w:t>
+            </w:r>
+          </w:p>
+        </w:tc>
+        <w:tc>
+          <w:tcPr>
+            <w:tcW w:w="0" w:type="auto"/>
+            <w:hideMark/>
+          </w:tcPr>
+          <w:p>
+            <w:pPr>
+              <w:spacing w:line="278" w:lineRule="auto"/>
+            </w:pPr>
+            <w:r>
+              <w:rPr>
+                <w:b/>
+                <w:bCs/>
+              </w:rPr>
+              <w:t>Advanced – Parallel coordinates</w:t>
+            </w:r>
+          </w:p>
+        </w:tc>
+        <w:tc>
+          <w:tcPr>
+            <w:tcW w:w="0" w:type="auto"/>
+            <w:hideMark/>
+          </w:tcPr>
+          <w:p>
+            <w:pPr>
+              <w:spacing w:line="278" w:lineRule="auto"/>
+            </w:pPr>
+            <w:r>
+              <w:t>Which activities have the most distinctive demographic profiles?</w:t>
+            </w:r>
+          </w:p>
+        </w:tc>
+      </w:tr>
+      <w:tr>
+        <w:tc>
+          <w:tcPr>
+            <w:tcW w:w="3448" w:type="dxa"/>
+            <w:hideMark/>
+          </w:tcPr>
+          <w:p>
+            <w:pPr>
+              <w:spacing w:line="278" w:lineRule="auto"/>
+            </w:pPr>
+            <w:r>
+              <w:rPr>
+                <w:b/>
+                <w:bCs/>
+              </w:rPr>
+              <w:t>5. Are Australians Changing the Way They Get Outdoors?</w:t>
+            </w:r>
+          </w:p>
+        </w:tc>
+        <w:tc>
+          <w:tcPr>
+            <w:tcW w:w="0" w:type="auto"/>
+            <w:hideMark/>
+          </w:tcPr>
+          <w:p>
+            <w:pPr>
+              <w:spacing w:line="278" w:lineRule="auto"/>
+            </w:pPr>
+            <w:r>
+              <w:t>16</w:t>
+            </w:r>
+          </w:p>
+        </w:tc>
+        <w:tc>
+          <w:tcPr>
+            <w:tcW w:w="0" w:type="auto"/>
+            <w:hideMark/>
+          </w:tcPr>
+          <w:p>
+            <w:pPr>
+              <w:spacing w:line="278" w:lineRule="auto"/>
+            </w:pPr>
+            <w:r>
+              <w:t>Participation 2024→2025</w:t>
+            </w:r>
+          </w:p>
+        </w:tc>
+        <w:tc>
+          <w:tcPr>
+            <w:tcW w:w="0" w:type="auto"/>
+            <w:hideMark/>
+          </w:tcPr>
+          <w:p>
+            <w:pPr>
+              <w:spacing w:line="278" w:lineRule="auto"/>
+            </w:pPr>
+            <w:r>
+              <w:rPr>
+                <w:b/>
+                <w:bCs/>
+              </w:rPr>
+              <w:t>Basic – Line</w:t>
+            </w:r>
+          </w:p>
+        </w:tc>
+        <w:tc>
+          <w:tcPr>
+            <w:tcW w:w="0" w:type="auto"/>
+            <w:hideMark/>
+          </w:tcPr>
+          <w:p>
+            <w:pPr>
+              <w:spacing w:line="278" w:lineRule="auto"/>
+            </w:pPr>
+            <w:r>
+              <w:t>Is participation changing?</w:t>
+            </w:r>
+          </w:p>
+        </w:tc>
+      </w:tr>
+      <w:tr>
+        <w:tc>
+          <w:tcPr>
+            <w:tcW w:w="3448" w:type="dxa"/>
+            <w:hideMark/>
+          </w:tcPr>
+          <w:p>
+            <w:pPr>
+              <w:spacing w:line="278" w:lineRule="auto"/>
+            </w:pPr>
+          </w:p>
+        </w:tc>
+        <w:tc>
+          <w:tcPr>
+            <w:tcW w:w="0" w:type="auto"/>
+            <w:hideMark/>
+          </w:tcPr>
+          <w:p>
+            <w:pPr>
+              <w:spacing w:line="278" w:lineRule="auto"/>
+            </w:pPr>
+            <w:r>
+              <w:t>17</w:t>
+            </w:r>
+          </w:p>
+        </w:tc>
+        <w:tc>
+          <w:tcPr>
+            <w:tcW w:w="0" w:type="auto"/>
+            <w:hideMark/>
+          </w:tcPr>
+          <w:p>
+            <w:pPr>
+              <w:spacing w:line="278" w:lineRule="auto"/>
+            </w:pPr>
+            <w:r>
+              <w:t>Activity Winners &amp; Losers</w:t>
+            </w:r>
+          </w:p>
+        </w:tc>
+        <w:tc>
+          <w:tcPr>
+            <w:tcW w:w="0" w:type="auto"/>
+            <w:hideMark/>
+          </w:tcPr>
+          <w:p>
+            <w:pPr>
+              <w:spacing w:line="278" w:lineRule="auto"/>
+            </w:pPr>
+            <w:r>
+              <w:rPr>
+                <w:b/>
+                <w:bCs/>
+              </w:rPr>
+              <w:t xml:space="preserve">Advanced – </w:t>
+            </w:r>
+            <w:proofErr w:type="spellStart"/>
+            <w:r>
+              <w:rPr>
+                <w:b/>
+                <w:bCs/>
+              </w:rPr>
+              <w:t>Slopegraph</w:t>
+            </w:r>
+            <w:proofErr w:type="spellEnd"/>
+          </w:p>
+        </w:tc>
+        <w:tc>
+          <w:tcPr>
+            <w:tcW w:w="0" w:type="auto"/>
+            <w:hideMark/>
+          </w:tcPr>
+          <w:p>
+            <w:pPr>
+              <w:spacing w:line="278" w:lineRule="auto"/>
+            </w:pPr>
+            <w:r>
+              <w:t>Which outdoor activities changed the most?</w:t>
+            </w:r>
+          </w:p>
+        </w:tc>
+      </w:tr>
+      <w:tr>
+        <w:tc>
+          <w:tcPr>
+            <w:tcW w:w="3448" w:type="dxa"/>
+            <w:hideMark/>
+          </w:tcPr>
+          <w:p>
+            <w:pPr>
+              <w:spacing w:line="278" w:lineRule="auto"/>
+            </w:pPr>
+          </w:p>
+        </w:tc>
+        <w:tc>
+          <w:tcPr>
+            <w:tcW w:w="0" w:type="auto"/>
+            <w:hideMark/>
+          </w:tcPr>
+          <w:p>
+            <w:pPr>
+              <w:spacing w:line="278" w:lineRule="auto"/>
+            </w:pPr>
+            <w:r>
+              <w:t>18</w:t>
+            </w:r>
+          </w:p>
+        </w:tc>
+        <w:tc>
+          <w:tcPr>
+            <w:tcW w:w="0" w:type="auto"/>
+            <w:hideMark/>
+          </w:tcPr>
+          <w:p>
+            <w:pPr>
+              <w:spacing w:line="278" w:lineRule="auto"/>
+            </w:pPr>
+            <w:r>
+              <w:t>Change in Outdoor Activity Participation</w:t>
+            </w:r>
+          </w:p>
+        </w:tc>
+        <w:tc>
+          <w:tcPr>
+            <w:tcW w:w="0" w:type="auto"/>
+            <w:hideMark/>
+          </w:tcPr>
+          <w:p>
+            <w:pPr>
+              <w:spacing w:line="278" w:lineRule="auto"/>
+            </w:pPr>
+            <w:r>
+              <w:rPr>
+                <w:b/>
+                <w:bCs/>
+              </w:rPr>
+              <w:t>Basic – Diverging bar</w:t>
+            </w:r>
+          </w:p>
+        </w:tc>
+        <w:tc>
+          <w:tcPr>
+            <w:tcW w:w="0" w:type="auto"/>
+            <w:hideMark/>
+          </w:tcPr>
+          <w:p>
+            <w:pPr>
+              <w:spacing w:line="278" w:lineRule="auto"/>
+            </w:pPr>
+            <w:r>
+              <w:t>Which activities gained or lost participation?</w:t>
+            </w:r>
+          </w:p>
+        </w:tc>
+      </w:tr>
+      <w:tr>
+        <w:tc>
+          <w:tcPr>
+            <w:tcW w:w="3448" w:type="dxa"/>
+            <w:hideMark/>
+          </w:tcPr>
+          <w:p>
+            <w:pPr>
+              <w:spacing w:line="278" w:lineRule="auto"/>
+            </w:pPr>
+            <w:r>
+              <w:rPr>
+                <w:b/>
+                <w:bCs/>
+              </w:rPr>
+              <w:t>6. What Does “Living Outdoors” Look Like in Daily Life?</w:t>
+            </w:r>
+          </w:p>
+        </w:tc>
+        <w:tc>
+          <w:tcPr>
+            <w:tcW w:w="0" w:type="auto"/>
+            <w:hideMark/>
+          </w:tcPr>
+          <w:p>
+            <w:pPr>
+              <w:spacing w:line="278" w:lineRule="auto"/>
+            </w:pPr>
+            <w:r>
+              <w:t>19</w:t>
+            </w:r>
+          </w:p>
+        </w:tc>
+        <w:tc>
+          <w:tcPr>
+            <w:tcW w:w="0" w:type="auto"/>
+            <w:hideMark/>
+          </w:tcPr>
+          <w:p>
+            <w:pPr>
+              <w:spacing w:line="278" w:lineRule="auto"/>
+            </w:pPr>
+            <w:r>
+              <w:t>Time Spent on Exercise, Sport &amp; Outdoor Activity by Generation</w:t>
+            </w:r>
+          </w:p>
+        </w:tc>
+        <w:tc>
+          <w:tcPr>
+            <w:tcW w:w="0" w:type="auto"/>
+            <w:hideMark/>
+          </w:tcPr>
+          <w:p>
+            <w:pPr>
+              <w:spacing w:line="278" w:lineRule="auto"/>
+            </w:pPr>
+            <w:r>
+              <w:rPr>
+                <w:b/>
+                <w:bCs/>
+              </w:rPr>
+              <w:t>Basic – Bar</w:t>
+            </w:r>
+          </w:p>
+        </w:tc>
+        <w:tc>
+          <w:tcPr>
+            <w:tcW w:w="0" w:type="auto"/>
+            <w:hideMark/>
+          </w:tcPr>
+          <w:p>
+            <w:pPr>
+              <w:spacing w:line="278" w:lineRule="auto"/>
+            </w:pPr>
+            <w:r>
+              <w:t>Does outdoor activity actually translate into time spent?</w:t>
+            </w:r>
+          </w:p>
+        </w:tc>
+      </w:tr>
+    </w:tbl>
     <w:p>
       <w:pPr>
         <w:rPr>
@@ -4242,13 +5933,623 @@
     </w:p>
     <w:p>
       <w:pPr>
+        <w:pStyle w:val="ListParagraph"/>
+        <w:numPr>
+          <w:ilvl w:val="0"/>
+          <w:numId w:val="6"/>
+        </w:numPr>
+      </w:pPr>
+      <w:r>
+        <w:rPr>
+          <w:b/>
+          <w:bCs/>
+        </w:rPr>
+        <w:t>Core outdoor</w:t>
+      </w:r>
+      <w:r>
+        <w:t xml:space="preserve"> → participation fundamentally depends on an outdoor/natural environment. </w:t>
+      </w:r>
+    </w:p>
+    <w:p>
+      <w:pPr>
+        <w:pStyle w:val="ListParagraph"/>
+        <w:numPr>
+          <w:ilvl w:val="0"/>
+          <w:numId w:val="6"/>
+        </w:numPr>
+      </w:pPr>
+      <w:r>
+        <w:rPr>
+          <w:b/>
+          <w:bCs/>
+        </w:rPr>
+        <w:t>Outdoor-capable</w:t>
+      </w:r>
+      <w:r>
+        <w:t xml:space="preserve"> → commonly undertaken either outdoors or indoors. </w:t>
+      </w:r>
+    </w:p>
+    <w:p>
+      <w:pPr>
+        <w:pStyle w:val="ListParagraph"/>
+        <w:numPr>
+          <w:ilvl w:val="0"/>
+          <w:numId w:val="6"/>
+        </w:numPr>
+      </w:pPr>
+      <w:r>
+        <w:rPr>
+          <w:b/>
+          <w:bCs/>
+        </w:rPr>
+        <w:t>Indoor/facility-based</w:t>
+      </w:r>
+      <w:r>
+        <w:t xml:space="preserve"> → normally requires an indoor/specialised facility.</w:t>
+      </w:r>
+    </w:p>
+    <w:p>
+      <w:pPr>
+        <w:pStyle w:val="ListParagraph"/>
+        <w:numPr>
+          <w:ilvl w:val="0"/>
+          <w:numId w:val="6"/>
+        </w:numPr>
+      </w:pPr>
+      <w:r>
+        <w:br w:type="page"/>
+      </w:r>
+    </w:p>
+    <w:p>
+      <w:r>
+        <w:lastRenderedPageBreak/>
+        <w:t>Australia sells itself as an outdoor nation, with beaches, bush and a "no worries" weekend. But how much of that picture is true in everyday life? This story tests the claim against national survey data, asking what Australians actually do, who does it, where, and how it is changing.</w:t>
+      </w:r>
+    </w:p>
+    <w:tbl>
+      <w:tblPr>
+        <w:tblStyle w:val="TableGrid"/>
+        <w:tblW w:w="13980" w:type="dxa"/>
+        <w:tblLook w:val="04A0" w:firstRow="1" w:lastRow="0" w:firstColumn="1" w:lastColumn="0" w:noHBand="0" w:noVBand="1"/>
+      </w:tblPr>
+      <w:tblGrid>
+        <w:gridCol w:w="1129"/>
+        <w:gridCol w:w="1843"/>
+        <w:gridCol w:w="1843"/>
+        <w:gridCol w:w="1701"/>
+        <w:gridCol w:w="5282"/>
+        <w:gridCol w:w="2182"/>
+      </w:tblGrid>
+      <w:tr>
+        <w:tc>
+          <w:tcPr>
+            <w:tcW w:w="1129" w:type="dxa"/>
+          </w:tcPr>
+          <w:p>
+            <w:pPr>
+              <w:rPr>
+                <w:lang w:val="af-ZA"/>
+              </w:rPr>
+            </w:pPr>
+            <w:r>
+              <w:rPr>
+                <w:lang w:val="af-ZA"/>
+              </w:rPr>
+              <w:t>Chart No</w:t>
+            </w:r>
+          </w:p>
+        </w:tc>
+        <w:tc>
+          <w:tcPr>
+            <w:tcW w:w="1843" w:type="dxa"/>
+          </w:tcPr>
+          <w:p>
+            <w:pPr>
+              <w:rPr>
+                <w:lang w:val="af-ZA"/>
+              </w:rPr>
+            </w:pPr>
+            <w:r>
+              <w:rPr>
+                <w:lang w:val="af-ZA"/>
+              </w:rPr>
+              <w:t>Visuals</w:t>
+            </w:r>
+          </w:p>
+        </w:tc>
+        <w:tc>
+          <w:tcPr>
+            <w:tcW w:w="1843" w:type="dxa"/>
+          </w:tcPr>
+          <w:p>
+            <w:pPr>
+              <w:rPr>
+                <w:lang w:val="af-ZA"/>
+              </w:rPr>
+            </w:pPr>
+            <w:r>
+              <w:rPr>
+                <w:lang w:val="af-ZA"/>
+              </w:rPr>
+              <w:t>Main Ques</w:t>
+            </w:r>
+          </w:p>
+        </w:tc>
+        <w:tc>
+          <w:tcPr>
+            <w:tcW w:w="1701" w:type="dxa"/>
+          </w:tcPr>
+          <w:p>
+            <w:pPr>
+              <w:rPr>
+                <w:lang w:val="af-ZA"/>
+              </w:rPr>
+            </w:pPr>
+            <w:r>
+              <w:rPr>
+                <w:lang w:val="af-ZA"/>
+              </w:rPr>
+              <w:t>Chart Type</w:t>
+            </w:r>
+          </w:p>
+        </w:tc>
+        <w:tc>
+          <w:tcPr>
+            <w:tcW w:w="5282" w:type="dxa"/>
+          </w:tcPr>
+          <w:p>
+            <w:pPr>
+              <w:rPr>
+                <w:lang w:val="af-ZA"/>
+              </w:rPr>
+            </w:pPr>
+            <w:r>
+              <w:rPr>
+                <w:lang w:val="af-ZA"/>
+              </w:rPr>
+              <w:t xml:space="preserve">Text to link to next </w:t>
+            </w:r>
+          </w:p>
+        </w:tc>
+        <w:tc>
+          <w:tcPr>
+            <w:tcW w:w="2182" w:type="dxa"/>
+          </w:tcPr>
+          <w:p>
+            <w:pPr>
+              <w:rPr>
+                <w:lang w:val="af-ZA"/>
+              </w:rPr>
+            </w:pPr>
+            <w:r>
+              <w:rPr>
+                <w:lang w:val="af-ZA"/>
+              </w:rPr>
+              <w:t>Original Data source</w:t>
+            </w:r>
+          </w:p>
+        </w:tc>
+      </w:tr>
+      <w:tr>
+        <w:tc>
+          <w:tcPr>
+            <w:tcW w:w="1129" w:type="dxa"/>
+          </w:tcPr>
+          <w:p>
+            <w:pPr>
+              <w:rPr>
+                <w:lang w:val="af-ZA"/>
+              </w:rPr>
+            </w:pPr>
+            <w:r>
+              <w:rPr>
+                <w:lang w:val="af-ZA"/>
+              </w:rPr>
+              <w:t>1.1</w:t>
+            </w:r>
+          </w:p>
+        </w:tc>
+        <w:tc>
+          <w:tcPr>
+            <w:tcW w:w="1843" w:type="dxa"/>
+          </w:tcPr>
+          <w:p>
+            <w:r>
+              <w:t>Participation Activeness</w:t>
+            </w:r>
+          </w:p>
+        </w:tc>
+        <w:tc>
+          <w:tcPr>
+            <w:tcW w:w="1843" w:type="dxa"/>
+          </w:tcPr>
+          <w:p>
+            <w:pPr>
+              <w:rPr>
+                <w:lang w:val="af-ZA"/>
+              </w:rPr>
+            </w:pPr>
+            <w:r>
+              <w:t>How active are Australians?</w:t>
+            </w:r>
+          </w:p>
+        </w:tc>
+        <w:tc>
+          <w:tcPr>
+            <w:tcW w:w="1701" w:type="dxa"/>
+          </w:tcPr>
+          <w:p>
+            <w:r>
+              <w:t>Donut Chart</w:t>
+            </w:r>
+          </w:p>
+        </w:tc>
+        <w:tc>
+          <w:tcPr>
+            <w:tcW w:w="5282" w:type="dxa"/>
+          </w:tcPr>
+          <w:p>
+            <w:pPr>
+              <w:rPr>
+                <w:lang w:val="af-ZA"/>
+              </w:rPr>
+            </w:pPr>
+            <w:r>
+              <w:t>[X%] of Australian adults took part in physical activity in 2025, so participation is widespread. But "active" covers everything from a gym class to a coastal hike. What are people actually doing?</w:t>
+            </w:r>
+            <w:r>
+              <w:t xml:space="preserve"> </w:t>
+            </w:r>
+          </w:p>
+        </w:tc>
+        <w:tc>
+          <w:tcPr>
+            <w:tcW w:w="2182" w:type="dxa"/>
+          </w:tcPr>
+          <w:p>
+            <w:pPr>
+              <w:rPr>
+                <w:lang w:val="af-ZA"/>
+              </w:rPr>
+            </w:pPr>
+            <w:r>
+              <w:rPr>
+                <w:lang w:val="af-ZA"/>
+              </w:rPr>
+              <w:t>AusPlay-National Data 30 April 2026, Table 1</w:t>
+            </w:r>
+          </w:p>
+        </w:tc>
+      </w:tr>
+      <w:tr>
+        <w:tc>
+          <w:tcPr>
+            <w:tcW w:w="1129" w:type="dxa"/>
+          </w:tcPr>
+          <w:p>
+            <w:pPr>
+              <w:rPr>
+                <w:lang w:val="af-ZA"/>
+              </w:rPr>
+            </w:pPr>
+            <w:r>
+              <w:rPr>
+                <w:lang w:val="af-ZA"/>
+              </w:rPr>
+              <w:t>1.2</w:t>
+            </w:r>
+          </w:p>
+        </w:tc>
+        <w:tc>
+          <w:tcPr>
+            <w:tcW w:w="1843" w:type="dxa"/>
+          </w:tcPr>
+          <w:p>
+            <w:r>
+              <w:t>Top 20 Activities</w:t>
+            </w:r>
+          </w:p>
+        </w:tc>
+        <w:tc>
+          <w:tcPr>
+            <w:tcW w:w="1843" w:type="dxa"/>
+          </w:tcPr>
+          <w:p>
+            <w:r>
+              <w:t>What do Australians actually do?</w:t>
+            </w:r>
+          </w:p>
+        </w:tc>
+        <w:tc>
+          <w:tcPr>
+            <w:tcW w:w="1701" w:type="dxa"/>
+          </w:tcPr>
+          <w:p>
+            <w:r>
+              <w:t>Rank Bar Chart</w:t>
+            </w:r>
+          </w:p>
+        </w:tc>
+        <w:tc>
+          <w:tcPr>
+            <w:tcW w:w="5282" w:type="dxa"/>
+          </w:tcPr>
+          <w:p>
+            <w:pPr>
+              <w:rPr>
+                <w:lang w:val="af-ZA"/>
+              </w:rPr>
+            </w:pPr>
+            <w:r>
+              <w:t>Walking leads at 50.2%, with fitness/gym second at 34.1% and bush walking third at 17.5%. Outdoor activities fill much of the top of the ranking. Taking the gym and court sports out leaves what outdoor recreation in Australia actually looks like.</w:t>
+            </w:r>
+          </w:p>
+        </w:tc>
+        <w:tc>
+          <w:tcPr>
+            <w:tcW w:w="2182" w:type="dxa"/>
+          </w:tcPr>
+          <w:p>
+            <w:pPr>
+              <w:rPr>
+                <w:lang w:val="af-ZA"/>
+              </w:rPr>
+            </w:pPr>
+            <w:r>
+              <w:rPr>
+                <w:lang w:val="af-ZA"/>
+              </w:rPr>
+              <w:t>AusPlay-By Sport Data 30 April 2026, Table 6</w:t>
+            </w:r>
+          </w:p>
+        </w:tc>
+      </w:tr>
+      <w:tr>
+        <w:tc>
+          <w:tcPr>
+            <w:tcW w:w="1129" w:type="dxa"/>
+          </w:tcPr>
+          <w:p>
+            <w:pPr>
+              <w:rPr>
+                <w:lang w:val="af-ZA"/>
+              </w:rPr>
+            </w:pPr>
+            <w:r>
+              <w:rPr>
+                <w:lang w:val="af-ZA"/>
+              </w:rPr>
+              <w:t>1.3</w:t>
+            </w:r>
+          </w:p>
+        </w:tc>
+        <w:tc>
+          <w:tcPr>
+            <w:tcW w:w="1843" w:type="dxa"/>
+          </w:tcPr>
+          <w:p>
+            <w:r>
+              <w:t>Top Outdoor Activities</w:t>
+            </w:r>
+          </w:p>
+        </w:tc>
+        <w:tc>
+          <w:tcPr>
+            <w:tcW w:w="1843" w:type="dxa"/>
+          </w:tcPr>
+          <w:p>
+            <w:pPr>
+              <w:rPr>
+                <w:lang w:val="af-ZA"/>
+              </w:rPr>
+            </w:pPr>
+            <w:r>
+              <w:t>What does Australia's outdoor lifestyle look like?</w:t>
+            </w:r>
+          </w:p>
+        </w:tc>
+        <w:tc>
+          <w:tcPr>
+            <w:tcW w:w="1701" w:type="dxa"/>
+          </w:tcPr>
+          <w:p>
+            <w:r>
+              <w:t>Rank Bar Chart</w:t>
+            </w:r>
+          </w:p>
+        </w:tc>
+        <w:tc>
+          <w:tcPr>
+            <w:tcW w:w="5282" w:type="dxa"/>
+          </w:tcPr>
+          <w:p>
+            <w:pPr>
+              <w:rPr>
+                <w:lang w:val="af-ZA"/>
+              </w:rPr>
+            </w:pPr>
+            <w:r>
+              <w:t>A few outdoor activities dominate and a long tail trails behind them. That raises the next question: does "going outdoors" mean the same thing for everyone? Section 2 asks how structured it is and who does what.</w:t>
+            </w:r>
+          </w:p>
+        </w:tc>
+        <w:tc>
+          <w:tcPr>
+            <w:tcW w:w="2182" w:type="dxa"/>
+          </w:tcPr>
+          <w:p>
+            <w:pPr>
+              <w:rPr>
+                <w:lang w:val="af-ZA"/>
+              </w:rPr>
+            </w:pPr>
+            <w:r>
+              <w:rPr>
+                <w:lang w:val="af-ZA"/>
+              </w:rPr>
+              <w:t>AusPlay-By Sport Data 30 April 2026, Table 6</w:t>
+            </w:r>
+          </w:p>
+        </w:tc>
+      </w:tr>
+      <w:tr>
+        <w:tc>
+          <w:tcPr>
+            <w:tcW w:w="1129" w:type="dxa"/>
+          </w:tcPr>
+          <w:p>
+            <w:pPr>
+              <w:rPr>
+                <w:lang w:val="af-ZA"/>
+              </w:rPr>
+            </w:pPr>
+          </w:p>
+        </w:tc>
+        <w:tc>
+          <w:tcPr>
+            <w:tcW w:w="1843" w:type="dxa"/>
+          </w:tcPr>
+          <w:p>
+            <w:pPr>
+              <w:rPr>
+                <w:lang w:val="af-ZA"/>
+              </w:rPr>
+            </w:pPr>
+          </w:p>
+        </w:tc>
+        <w:tc>
+          <w:tcPr>
+            <w:tcW w:w="1843" w:type="dxa"/>
+          </w:tcPr>
+          <w:p>
+            <w:pPr>
+              <w:rPr>
+                <w:lang w:val="af-ZA"/>
+              </w:rPr>
+            </w:pPr>
+          </w:p>
+        </w:tc>
+        <w:tc>
+          <w:tcPr>
+            <w:tcW w:w="1701" w:type="dxa"/>
+          </w:tcPr>
+          <w:p>
+            <w:pPr>
+              <w:rPr>
+                <w:lang w:val="af-ZA"/>
+              </w:rPr>
+            </w:pPr>
+          </w:p>
+        </w:tc>
+        <w:tc>
+          <w:tcPr>
+            <w:tcW w:w="5282" w:type="dxa"/>
+          </w:tcPr>
+          <w:p>
+            <w:pPr>
+              <w:rPr>
+                <w:lang w:val="af-ZA"/>
+              </w:rPr>
+            </w:pPr>
+          </w:p>
+        </w:tc>
+        <w:tc>
+          <w:tcPr>
+            <w:tcW w:w="2182" w:type="dxa"/>
+          </w:tcPr>
+          <w:p>
+            <w:pPr>
+              <w:rPr>
+                <w:lang w:val="af-ZA"/>
+              </w:rPr>
+            </w:pPr>
+          </w:p>
+        </w:tc>
+      </w:tr>
+      <w:tr>
+        <w:tc>
+          <w:tcPr>
+            <w:tcW w:w="1129" w:type="dxa"/>
+          </w:tcPr>
+          <w:p>
+            <w:pPr>
+              <w:rPr>
+                <w:lang w:val="af-ZA"/>
+              </w:rPr>
+            </w:pPr>
+          </w:p>
+        </w:tc>
+        <w:tc>
+          <w:tcPr>
+            <w:tcW w:w="1843" w:type="dxa"/>
+          </w:tcPr>
+          <w:p>
+            <w:pPr>
+              <w:rPr>
+                <w:lang w:val="af-ZA"/>
+              </w:rPr>
+            </w:pPr>
+          </w:p>
+        </w:tc>
+        <w:tc>
+          <w:tcPr>
+            <w:tcW w:w="1843" w:type="dxa"/>
+          </w:tcPr>
+          <w:p>
+            <w:pPr>
+              <w:rPr>
+                <w:lang w:val="af-ZA"/>
+              </w:rPr>
+            </w:pPr>
+          </w:p>
+        </w:tc>
+        <w:tc>
+          <w:tcPr>
+            <w:tcW w:w="1701" w:type="dxa"/>
+          </w:tcPr>
+          <w:p>
+            <w:pPr>
+              <w:rPr>
+                <w:lang w:val="af-ZA"/>
+              </w:rPr>
+            </w:pPr>
+          </w:p>
+        </w:tc>
+        <w:tc>
+          <w:tcPr>
+            <w:tcW w:w="5282" w:type="dxa"/>
+          </w:tcPr>
+          <w:p>
+            <w:pPr>
+              <w:rPr>
+                <w:lang w:val="af-ZA"/>
+              </w:rPr>
+            </w:pPr>
+          </w:p>
+        </w:tc>
+        <w:tc>
+          <w:tcPr>
+            <w:tcW w:w="2182" w:type="dxa"/>
+          </w:tcPr>
+          <w:p>
+            <w:pPr>
+              <w:rPr>
+                <w:lang w:val="af-ZA"/>
+              </w:rPr>
+            </w:pPr>
+          </w:p>
+        </w:tc>
+      </w:tr>
+    </w:tbl>
+    <w:p>
+      <w:pPr>
         <w:rPr>
           <w:lang w:val="af-ZA"/>
         </w:rPr>
       </w:pPr>
     </w:p>
     <w:sectPr>
-      <w:pgSz w:w="11906" w:h="16838"/>
+      <w:pgSz w:w="16838" w:h="11906" w:orient="landscape"/>
       <w:pgMar w:top="1440" w:right="1440" w:bottom="1440" w:left="1440" w:header="708" w:footer="708" w:gutter="0"/>
       <w:cols w:space="708"/>
       <w:docGrid w:linePitch="360"/>
@@ -4260,6 +6561,232 @@
 <file path=word/numbering.xml><?xml version="1.0" encoding="utf-8"?>
 <w:numbering xmlns:wpc="http://schemas.microsoft.com/office/word/2010/wordprocessingCanvas" xmlns:cx="http://schemas.microsoft.com/office/drawing/2014/chartex" xmlns:cx1="http://schemas.microsoft.com/office/drawing/2015/9/8/chartex" xmlns:cx2="http://schemas.microsoft.com/office/drawing/2015/10/21/chartex" xmlns:cx3="http://schemas.microsoft.com/office/drawing/2016/5/9/chartex" xmlns:cx4="http://schemas.microsoft.com/office/drawing/2016/5/10/chartex" xmlns:cx5="http://schemas.microsoft.com/office/drawing/2016/5/11/chartex" xmlns:cx6="http://schemas.microsoft.com/office/drawing/2016/5/12/chartex" xmlns:cx7="http://schemas.microsoft.com/office/drawing/2016/5/13/chartex" xmlns:cx8="http://schemas.microsoft.com/office/drawing/2016/5/14/chartex" xmlns:mc="http://schemas.openxmlformats.org/markup-compatibility/2006" xmlns:aink="http://schemas.microsoft.com/office/drawing/2016/ink" xmlns:am3d="http://schemas.microsoft.com/office/drawing/2017/model3d" xmlns:o="urn:schemas-microsoft-com:office:office" xmlns:oel="http://schemas.microsoft.com/office/2019/extlst" xmlns:r="http://schemas.openxmlformats.org/officeDocument/2006/relationships" xmlns:m="http://schemas.openxmlformats.org/officeDocument/2006/math" xmlns:v="urn:schemas-microsoft-com:vml" xmlns:wp14="http://schemas.microsoft.com/office/word/2010/wordprocessingDrawing" xmlns:wp="http://schemas.openxmlformats.org/drawingml/2006/wordprocessingDrawing" xmlns:w10="urn:schemas-microsoft-com:office:word" xmlns:w="http://schemas.openxmlformats.org/wordprocessingml/2006/main" xmlns:w14="http://schemas.microsoft.com/office/word/2010/wordml" xmlns:w15="http://schemas.microsoft.com/office/word/2012/wordml" xmlns:w16cex="http://schemas.microsoft.com/office/word/2018/wordml/cex" xmlns:w16cid="http://schemas.microsoft.com/office/word/2016/wordml/cid" xmlns:w16="http://schemas.microsoft.com/office/word/2018/wordml" xmlns:w16du="http://schemas.microsoft.com/office/word/2023/wordml/word16du" xmlns:w16sdtdh="http://schemas.microsoft.com/office/word/2020/wordml/sdtdatahash" xmlns:w16sdtfl="http://schemas.microsoft.com/office/word/2024/wordml/sdtformatlock" xmlns:w16se="http://schemas.microsoft.com/office/word/2015/wordml/symex" xmlns:wpg="http://schemas.microsoft.com/office/word/2010/wordprocessingGroup" xmlns:wpi="http://schemas.microsoft.com/office/word/2010/wordprocessingInk" xmlns:wne="http://schemas.microsoft.com/office/word/2006/wordml" xmlns:wps="http://schemas.microsoft.com/office/word/2010/wordprocessingShape" mc:Ignorable="w14 w15 w16se w16cid w16 w16cex w16sdtdh w16sdtfl w16du wp14">
   <w:abstractNum w:abstractNumId="0" w15:restartNumberingAfterBreak="0">
+    <w:nsid w:val="0F987309"/>
+    <w:multiLevelType w:val="hybridMultilevel"/>
+    <w:tmpl w:val="D194D5CC"/>
+    <w:lvl w:ilvl="0" w:tplc="44090001">
+      <w:start w:val="1"/>
+      <w:numFmt w:val="bullet"/>
+      <w:lvlText w:val=""/>
+      <w:lvlJc w:val="left"/>
+      <w:pPr>
+        <w:ind w:left="1080" w:hanging="360"/>
+      </w:pPr>
+      <w:rPr>
+        <w:rFonts w:ascii="Symbol" w:hAnsi="Symbol" w:hint="default"/>
+      </w:rPr>
+    </w:lvl>
+    <w:lvl w:ilvl="1" w:tplc="44090003" w:tentative="1">
+      <w:start w:val="1"/>
+      <w:numFmt w:val="bullet"/>
+      <w:lvlText w:val="o"/>
+      <w:lvlJc w:val="left"/>
+      <w:pPr>
+        <w:ind w:left="1800" w:hanging="360"/>
+      </w:pPr>
+      <w:rPr>
+        <w:rFonts w:ascii="Courier New" w:hAnsi="Courier New" w:cs="Courier New" w:hint="default"/>
+      </w:rPr>
+    </w:lvl>
+    <w:lvl w:ilvl="2" w:tplc="44090005" w:tentative="1">
+      <w:start w:val="1"/>
+      <w:numFmt w:val="bullet"/>
+      <w:lvlText w:val=""/>
+      <w:lvlJc w:val="left"/>
+      <w:pPr>
+        <w:ind w:left="2520" w:hanging="360"/>
+      </w:pPr>
+      <w:rPr>
+        <w:rFonts w:ascii="Wingdings" w:hAnsi="Wingdings" w:hint="default"/>
+      </w:rPr>
+    </w:lvl>
+    <w:lvl w:ilvl="3" w:tplc="44090001" w:tentative="1">
+      <w:start w:val="1"/>
+      <w:numFmt w:val="bullet"/>
+      <w:lvlText w:val=""/>
+      <w:lvlJc w:val="left"/>
+      <w:pPr>
+        <w:ind w:left="3240" w:hanging="360"/>
+      </w:pPr>
+      <w:rPr>
+        <w:rFonts w:ascii="Symbol" w:hAnsi="Symbol" w:hint="default"/>
+      </w:rPr>
+    </w:lvl>
+    <w:lvl w:ilvl="4" w:tplc="44090003" w:tentative="1">
+      <w:start w:val="1"/>
+      <w:numFmt w:val="bullet"/>
+      <w:lvlText w:val="o"/>
+      <w:lvlJc w:val="left"/>
+      <w:pPr>
+        <w:ind w:left="3960" w:hanging="360"/>
+      </w:pPr>
+      <w:rPr>
+        <w:rFonts w:ascii="Courier New" w:hAnsi="Courier New" w:cs="Courier New" w:hint="default"/>
+      </w:rPr>
+    </w:lvl>
+    <w:lvl w:ilvl="5" w:tplc="44090005" w:tentative="1">
+      <w:start w:val="1"/>
+      <w:numFmt w:val="bullet"/>
+      <w:lvlText w:val=""/>
+      <w:lvlJc w:val="left"/>
+      <w:pPr>
+        <w:ind w:left="4680" w:hanging="360"/>
+      </w:pPr>
+      <w:rPr>
+        <w:rFonts w:ascii="Wingdings" w:hAnsi="Wingdings" w:hint="default"/>
+      </w:rPr>
+    </w:lvl>
+    <w:lvl w:ilvl="6" w:tplc="44090001" w:tentative="1">
+      <w:start w:val="1"/>
+      <w:numFmt w:val="bullet"/>
+      <w:lvlText w:val=""/>
+      <w:lvlJc w:val="left"/>
+      <w:pPr>
+        <w:ind w:left="5400" w:hanging="360"/>
+      </w:pPr>
+      <w:rPr>
+        <w:rFonts w:ascii="Symbol" w:hAnsi="Symbol" w:hint="default"/>
+      </w:rPr>
+    </w:lvl>
+    <w:lvl w:ilvl="7" w:tplc="44090003" w:tentative="1">
+      <w:start w:val="1"/>
+      <w:numFmt w:val="bullet"/>
+      <w:lvlText w:val="o"/>
+      <w:lvlJc w:val="left"/>
+      <w:pPr>
+        <w:ind w:left="6120" w:hanging="360"/>
+      </w:pPr>
+      <w:rPr>
+        <w:rFonts w:ascii="Courier New" w:hAnsi="Courier New" w:cs="Courier New" w:hint="default"/>
+      </w:rPr>
+    </w:lvl>
+    <w:lvl w:ilvl="8" w:tplc="44090005" w:tentative="1">
+      <w:start w:val="1"/>
+      <w:numFmt w:val="bullet"/>
+      <w:lvlText w:val=""/>
+      <w:lvlJc w:val="left"/>
+      <w:pPr>
+        <w:ind w:left="6840" w:hanging="360"/>
+      </w:pPr>
+      <w:rPr>
+        <w:rFonts w:ascii="Wingdings" w:hAnsi="Wingdings" w:hint="default"/>
+      </w:rPr>
+    </w:lvl>
+  </w:abstractNum>
+  <w:abstractNum w:abstractNumId="1" w15:restartNumberingAfterBreak="0">
+    <w:nsid w:val="3AED4CDC"/>
+    <w:multiLevelType w:val="hybridMultilevel"/>
+    <w:tmpl w:val="92E28E4C"/>
+    <w:lvl w:ilvl="0" w:tplc="44090001">
+      <w:start w:val="1"/>
+      <w:numFmt w:val="bullet"/>
+      <w:lvlText w:val=""/>
+      <w:lvlJc w:val="left"/>
+      <w:pPr>
+        <w:ind w:left="720" w:hanging="360"/>
+      </w:pPr>
+      <w:rPr>
+        <w:rFonts w:ascii="Symbol" w:hAnsi="Symbol" w:hint="default"/>
+      </w:rPr>
+    </w:lvl>
+    <w:lvl w:ilvl="1" w:tplc="44090003" w:tentative="1">
+      <w:start w:val="1"/>
+      <w:numFmt w:val="bullet"/>
+      <w:lvlText w:val="o"/>
+      <w:lvlJc w:val="left"/>
+      <w:pPr>
+        <w:ind w:left="1440" w:hanging="360"/>
+      </w:pPr>
+      <w:rPr>
+        <w:rFonts w:ascii="Courier New" w:hAnsi="Courier New" w:cs="Courier New" w:hint="default"/>
+      </w:rPr>
+    </w:lvl>
+    <w:lvl w:ilvl="2" w:tplc="44090005" w:tentative="1">
+      <w:start w:val="1"/>
+      <w:numFmt w:val="bullet"/>
+      <w:lvlText w:val=""/>
+      <w:lvlJc w:val="left"/>
+      <w:pPr>
+        <w:ind w:left="2160" w:hanging="360"/>
+      </w:pPr>
+      <w:rPr>
+        <w:rFonts w:ascii="Wingdings" w:hAnsi="Wingdings" w:hint="default"/>
+      </w:rPr>
+    </w:lvl>
+    <w:lvl w:ilvl="3" w:tplc="44090001" w:tentative="1">
+      <w:start w:val="1"/>
+      <w:numFmt w:val="bullet"/>
+      <w:lvlText w:val=""/>
+      <w:lvlJc w:val="left"/>
+      <w:pPr>
+        <w:ind w:left="2880" w:hanging="360"/>
+      </w:pPr>
+      <w:rPr>
+        <w:rFonts w:ascii="Symbol" w:hAnsi="Symbol" w:hint="default"/>
+      </w:rPr>
+    </w:lvl>
+    <w:lvl w:ilvl="4" w:tplc="44090003" w:tentative="1">
+      <w:start w:val="1"/>
+      <w:numFmt w:val="bullet"/>
+      <w:lvlText w:val="o"/>
+      <w:lvlJc w:val="left"/>
+      <w:pPr>
+        <w:ind w:left="3600" w:hanging="360"/>
+      </w:pPr>
+      <w:rPr>
+        <w:rFonts w:ascii="Courier New" w:hAnsi="Courier New" w:cs="Courier New" w:hint="default"/>
+      </w:rPr>
+    </w:lvl>
+    <w:lvl w:ilvl="5" w:tplc="44090005" w:tentative="1">
+      <w:start w:val="1"/>
+      <w:numFmt w:val="bullet"/>
+      <w:lvlText w:val=""/>
+      <w:lvlJc w:val="left"/>
+      <w:pPr>
+        <w:ind w:left="4320" w:hanging="360"/>
+      </w:pPr>
+      <w:rPr>
+        <w:rFonts w:ascii="Wingdings" w:hAnsi="Wingdings" w:hint="default"/>
+      </w:rPr>
+    </w:lvl>
+    <w:lvl w:ilvl="6" w:tplc="44090001" w:tentative="1">
+      <w:start w:val="1"/>
+      <w:numFmt w:val="bullet"/>
+      <w:lvlText w:val=""/>
+      <w:lvlJc w:val="left"/>
+      <w:pPr>
+        <w:ind w:left="5040" w:hanging="360"/>
+      </w:pPr>
+      <w:rPr>
+        <w:rFonts w:ascii="Symbol" w:hAnsi="Symbol" w:hint="default"/>
+      </w:rPr>
+    </w:lvl>
+    <w:lvl w:ilvl="7" w:tplc="44090003" w:tentative="1">
+      <w:start w:val="1"/>
+      <w:numFmt w:val="bullet"/>
+      <w:lvlText w:val="o"/>
+      <w:lvlJc w:val="left"/>
+      <w:pPr>
+        <w:ind w:left="5760" w:hanging="360"/>
+      </w:pPr>
+      <w:rPr>
+        <w:rFonts w:ascii="Courier New" w:hAnsi="Courier New" w:cs="Courier New" w:hint="default"/>
+      </w:rPr>
+    </w:lvl>
+    <w:lvl w:ilvl="8" w:tplc="44090005" w:tentative="1">
+      <w:start w:val="1"/>
+      <w:numFmt w:val="bullet"/>
+      <w:lvlText w:val=""/>
+      <w:lvlJc w:val="left"/>
+      <w:pPr>
+        <w:ind w:left="6480" w:hanging="360"/>
+      </w:pPr>
+      <w:rPr>
+        <w:rFonts w:ascii="Wingdings" w:hAnsi="Wingdings" w:hint="default"/>
+      </w:rPr>
+    </w:lvl>
+  </w:abstractNum>
+  <w:abstractNum w:abstractNumId="2" w15:restartNumberingAfterBreak="0">
     <w:nsid w:val="4913244F"/>
     <w:multiLevelType w:val="multilevel"/>
     <w:tmpl w:val="52C25A86"/>
@@ -4408,7 +6935,7 @@
       </w:rPr>
     </w:lvl>
   </w:abstractNum>
-  <w:abstractNum w:abstractNumId="1" w15:restartNumberingAfterBreak="0">
+  <w:abstractNum w:abstractNumId="3" w15:restartNumberingAfterBreak="0">
     <w:nsid w:val="4E61177E"/>
     <w:multiLevelType w:val="multilevel"/>
     <w:tmpl w:val="CA1AEED4"/>
@@ -4557,10 +7084,10 @@
       </w:rPr>
     </w:lvl>
   </w:abstractNum>
-  <w:abstractNum w:abstractNumId="2" w15:restartNumberingAfterBreak="0">
-    <w:nsid w:val="79B72AEC"/>
+  <w:abstractNum w:abstractNumId="4" w15:restartNumberingAfterBreak="0">
+    <w:nsid w:val="5D915DEF"/>
     <w:multiLevelType w:val="multilevel"/>
-    <w:tmpl w:val="BCE2BD50"/>
+    <w:tmpl w:val="ADAAC2C4"/>
     <w:lvl w:ilvl="0">
       <w:start w:val="1"/>
       <w:numFmt w:val="bullet"/>
@@ -4706,14 +7233,172 @@
       </w:rPr>
     </w:lvl>
   </w:abstractNum>
+  <w:abstractNum w:abstractNumId="5" w15:restartNumberingAfterBreak="0">
+    <w:nsid w:val="79B72AEC"/>
+    <w:multiLevelType w:val="multilevel"/>
+    <w:tmpl w:val="BCE2BD50"/>
+    <w:lvl w:ilvl="0">
+      <w:start w:val="1"/>
+      <w:numFmt w:val="bullet"/>
+      <w:lvlText w:val=""/>
+      <w:lvlJc w:val="left"/>
+      <w:pPr>
+        <w:tabs>
+          <w:tab w:val="num" w:pos="720"/>
+        </w:tabs>
+        <w:ind w:left="720" w:hanging="360"/>
+      </w:pPr>
+      <w:rPr>
+        <w:rFonts w:ascii="Symbol" w:hAnsi="Symbol" w:hint="default"/>
+        <w:sz w:val="20"/>
+      </w:rPr>
+    </w:lvl>
+    <w:lvl w:ilvl="1" w:tentative="1">
+      <w:start w:val="1"/>
+      <w:numFmt w:val="bullet"/>
+      <w:lvlText w:val="o"/>
+      <w:lvlJc w:val="left"/>
+      <w:pPr>
+        <w:tabs>
+          <w:tab w:val="num" w:pos="1440"/>
+        </w:tabs>
+        <w:ind w:left="1440" w:hanging="360"/>
+      </w:pPr>
+      <w:rPr>
+        <w:rFonts w:ascii="Courier New" w:hAnsi="Courier New" w:hint="default"/>
+        <w:sz w:val="20"/>
+      </w:rPr>
+    </w:lvl>
+    <w:lvl w:ilvl="2" w:tentative="1">
+      <w:start w:val="1"/>
+      <w:numFmt w:val="bullet"/>
+      <w:lvlText w:val=""/>
+      <w:lvlJc w:val="left"/>
+      <w:pPr>
+        <w:tabs>
+          <w:tab w:val="num" w:pos="2160"/>
+        </w:tabs>
+        <w:ind w:left="2160" w:hanging="360"/>
+      </w:pPr>
+      <w:rPr>
+        <w:rFonts w:ascii="Wingdings" w:hAnsi="Wingdings" w:hint="default"/>
+        <w:sz w:val="20"/>
+      </w:rPr>
+    </w:lvl>
+    <w:lvl w:ilvl="3" w:tentative="1">
+      <w:start w:val="1"/>
+      <w:numFmt w:val="bullet"/>
+      <w:lvlText w:val=""/>
+      <w:lvlJc w:val="left"/>
+      <w:pPr>
+        <w:tabs>
+          <w:tab w:val="num" w:pos="2880"/>
+        </w:tabs>
+        <w:ind w:left="2880" w:hanging="360"/>
+      </w:pPr>
+      <w:rPr>
+        <w:rFonts w:ascii="Wingdings" w:hAnsi="Wingdings" w:hint="default"/>
+        <w:sz w:val="20"/>
+      </w:rPr>
+    </w:lvl>
+    <w:lvl w:ilvl="4" w:tentative="1">
+      <w:start w:val="1"/>
+      <w:numFmt w:val="bullet"/>
+      <w:lvlText w:val=""/>
+      <w:lvlJc w:val="left"/>
+      <w:pPr>
+        <w:tabs>
+          <w:tab w:val="num" w:pos="3600"/>
+        </w:tabs>
+        <w:ind w:left="3600" w:hanging="360"/>
+      </w:pPr>
+      <w:rPr>
+        <w:rFonts w:ascii="Wingdings" w:hAnsi="Wingdings" w:hint="default"/>
+        <w:sz w:val="20"/>
+      </w:rPr>
+    </w:lvl>
+    <w:lvl w:ilvl="5" w:tentative="1">
+      <w:start w:val="1"/>
+      <w:numFmt w:val="bullet"/>
+      <w:lvlText w:val=""/>
+      <w:lvlJc w:val="left"/>
+      <w:pPr>
+        <w:tabs>
+          <w:tab w:val="num" w:pos="4320"/>
+        </w:tabs>
+        <w:ind w:left="4320" w:hanging="360"/>
+      </w:pPr>
+      <w:rPr>
+        <w:rFonts w:ascii="Wingdings" w:hAnsi="Wingdings" w:hint="default"/>
+        <w:sz w:val="20"/>
+      </w:rPr>
+    </w:lvl>
+    <w:lvl w:ilvl="6" w:tentative="1">
+      <w:start w:val="1"/>
+      <w:numFmt w:val="bullet"/>
+      <w:lvlText w:val=""/>
+      <w:lvlJc w:val="left"/>
+      <w:pPr>
+        <w:tabs>
+          <w:tab w:val="num" w:pos="5040"/>
+        </w:tabs>
+        <w:ind w:left="5040" w:hanging="360"/>
+      </w:pPr>
+      <w:rPr>
+        <w:rFonts w:ascii="Wingdings" w:hAnsi="Wingdings" w:hint="default"/>
+        <w:sz w:val="20"/>
+      </w:rPr>
+    </w:lvl>
+    <w:lvl w:ilvl="7" w:tentative="1">
+      <w:start w:val="1"/>
+      <w:numFmt w:val="bullet"/>
+      <w:lvlText w:val=""/>
+      <w:lvlJc w:val="left"/>
+      <w:pPr>
+        <w:tabs>
+          <w:tab w:val="num" w:pos="5760"/>
+        </w:tabs>
+        <w:ind w:left="5760" w:hanging="360"/>
+      </w:pPr>
+      <w:rPr>
+        <w:rFonts w:ascii="Wingdings" w:hAnsi="Wingdings" w:hint="default"/>
+        <w:sz w:val="20"/>
+      </w:rPr>
+    </w:lvl>
+    <w:lvl w:ilvl="8" w:tentative="1">
+      <w:start w:val="1"/>
+      <w:numFmt w:val="bullet"/>
+      <w:lvlText w:val=""/>
+      <w:lvlJc w:val="left"/>
+      <w:pPr>
+        <w:tabs>
+          <w:tab w:val="num" w:pos="6480"/>
+        </w:tabs>
+        <w:ind w:left="6480" w:hanging="360"/>
+      </w:pPr>
+      <w:rPr>
+        <w:rFonts w:ascii="Wingdings" w:hAnsi="Wingdings" w:hint="default"/>
+        <w:sz w:val="20"/>
+      </w:rPr>
+    </w:lvl>
+  </w:abstractNum>
   <w:num w:numId="1" w16cid:durableId="337345517">
-    <w:abstractNumId w:val="0"/>
+    <w:abstractNumId w:val="2"/>
   </w:num>
   <w:num w:numId="2" w16cid:durableId="1894458561">
+    <w:abstractNumId w:val="3"/>
+  </w:num>
+  <w:num w:numId="3" w16cid:durableId="750276746">
+    <w:abstractNumId w:val="5"/>
+  </w:num>
+  <w:num w:numId="4" w16cid:durableId="680472545">
+    <w:abstractNumId w:val="4"/>
+  </w:num>
+  <w:num w:numId="5" w16cid:durableId="1662275160">
     <w:abstractNumId w:val="1"/>
   </w:num>
-  <w:num w:numId="3" w16cid:durableId="750276746">
-    <w:abstractNumId w:val="2"/>
+  <w:num w:numId="6" w16cid:durableId="1303584516">
+    <w:abstractNumId w:val="0"/>
   </w:num>
 </w:numbering>
 </file>

</xml_diff>

<commit_message>
revert and redo everything
</commit_message>
<xml_diff>
--- a/draft.docx
+++ b/draft.docx
@@ -266,6 +266,34 @@
       </w:r>
     </w:p>
     <w:p>
+      <w:hyperlink r:id="rId10" w:history="1">
+        <w:r>
+          <w:rPr>
+            <w:rStyle w:val="Hyperlink"/>
+          </w:rPr>
+          <w:t>https://vega.github.io/vega-lite/examples/</w:t>
+        </w:r>
+      </w:hyperlink>
+      <w:r>
+        <w:t xml:space="preserve"> </w:t>
+      </w:r>
+    </w:p>
+    <w:p>
+      <w:hyperlink r:id="rId11" w:history="1">
+        <w:r>
+          <w:rPr>
+            <w:rStyle w:val="Hyperlink"/>
+          </w:rPr>
+          <w:t>https://en.wikipedia.org/wiki/Outdoor_recreation</w:t>
+        </w:r>
+      </w:hyperlink>
+      <w:r>
+        <w:rPr>
+          <w:b/>
+          <w:bCs/>
+        </w:rPr>
+        <w:t xml:space="preserve"> </w:t>
+      </w:r>
       <w:r>
         <w:rPr>
           <w:b/>
@@ -1041,17 +1069,8 @@
                 <w:b/>
                 <w:bCs/>
               </w:rPr>
-              <w:t xml:space="preserve">10 </w:t>
-            </w:r>
-            <w:proofErr w:type="gramStart"/>
-            <w:r>
-              <w:rPr>
-                <w:b/>
-                <w:bCs/>
-              </w:rPr>
-              <w:t>basic</w:t>
-            </w:r>
-            <w:proofErr w:type="gramEnd"/>
+              <w:t>10 basic</w:t>
+            </w:r>
           </w:p>
         </w:tc>
         <w:tc>
@@ -3809,13 +3828,8 @@
       </w:r>
     </w:p>
     <w:p>
-      <w:proofErr w:type="gramStart"/>
-      <w:r>
-        <w:t>So</w:t>
-      </w:r>
-      <w:proofErr w:type="gramEnd"/>
-      <w:r>
-        <w:t xml:space="preserve"> this one file already gives you a </w:t>
+      <w:r>
+        <w:t xml:space="preserve">So this one file already gives you a </w:t>
       </w:r>
       <w:r>
         <w:rPr>
@@ -4312,13 +4326,8 @@
       </w:tr>
     </w:tbl>
     <w:p>
-      <w:proofErr w:type="gramStart"/>
-      <w:r>
-        <w:t>So</w:t>
-      </w:r>
-      <w:proofErr w:type="gramEnd"/>
-      <w:r>
-        <w:t xml:space="preserve"> this dataset can answer something that </w:t>
+      <w:r>
+        <w:t xml:space="preserve">So this dataset can answer something that </w:t>
       </w:r>
       <w:proofErr w:type="spellStart"/>
       <w:r>
@@ -4341,6 +4350,74 @@
     <w:p>
       <w:r>
         <w:t>That could make your introduction/conclusion much more interesting.</w:t>
+      </w:r>
+    </w:p>
+    <w:p>
+      <w:r>
+        <w:t xml:space="preserve">But it does </w:t>
+      </w:r>
+      <w:r>
+        <w:rPr>
+          <w:b/>
+          <w:bCs/>
+        </w:rPr>
+        <w:t>not</w:t>
+      </w:r>
+      <w:r>
+        <w:t xml:space="preserve"> give you the detailed activity × state × geography information you need for your main visualisation.</w:t>
+      </w:r>
+    </w:p>
+    <w:p>
+      <w:r>
+        <w:br w:type="page"/>
+      </w:r>
+    </w:p>
+    <w:p>
+      <w:r>
+        <w:rPr>
+          <w:noProof/>
+        </w:rPr>
+        <w:lastRenderedPageBreak/>
+        <w:drawing>
+          <wp:inline distT="0" distB="0" distL="0" distR="0" wp14:anchorId="4CC93652" wp14:editId="43524BC7">
+            <wp:extent cx="5731510" cy="3208655"/>
+            <wp:effectExtent l="0" t="0" r="2540" b="0"/>
+            <wp:docPr id="932506585" name="Picture 1"/>
+            <wp:cNvGraphicFramePr>
+              <a:graphicFrameLocks xmlns:a="http://schemas.openxmlformats.org/drawingml/2006/main" noChangeAspect="1"/>
+            </wp:cNvGraphicFramePr>
+            <a:graphic xmlns:a="http://schemas.openxmlformats.org/drawingml/2006/main">
+              <a:graphicData uri="http://schemas.openxmlformats.org/drawingml/2006/picture">
+                <pic:pic xmlns:pic="http://schemas.openxmlformats.org/drawingml/2006/picture">
+                  <pic:nvPicPr>
+                    <pic:cNvPr id="932506585" name=""/>
+                    <pic:cNvPicPr/>
+                  </pic:nvPicPr>
+                  <pic:blipFill>
+                    <a:blip r:embed="rId12"/>
+                    <a:stretch>
+                      <a:fillRect/>
+                    </a:stretch>
+                  </pic:blipFill>
+                  <pic:spPr>
+                    <a:xfrm>
+                      <a:off x="0" y="0"/>
+                      <a:ext cx="5731510" cy="3208655"/>
+                    </a:xfrm>
+                    <a:prstGeom prst="rect">
+                      <a:avLst/>
+                    </a:prstGeom>
+                  </pic:spPr>
+                </pic:pic>
+              </a:graphicData>
+            </a:graphic>
+          </wp:inline>
+        </w:drawing>
+      </w:r>
+    </w:p>
+    <w:p>
+      <w:r>
+        <w:br w:type="page"/>
       </w:r>
     </w:p>
     <w:p>
@@ -4352,19 +4429,6 @@
           <w:docGrid w:linePitch="360"/>
         </w:sectPr>
       </w:pPr>
-      <w:r>
-        <w:t xml:space="preserve">But it does </w:t>
-      </w:r>
-      <w:r>
-        <w:rPr>
-          <w:b/>
-          <w:bCs/>
-        </w:rPr>
-        <w:t>not</w:t>
-      </w:r>
-      <w:r>
-        <w:t xml:space="preserve"> give you the detailed activity × state × geography information you need for your main visualisation.</w:t>
-      </w:r>
     </w:p>
     <w:p/>
     <w:tbl>
@@ -4649,17 +4713,19 @@
         <w:tc>
           <w:tcPr>
             <w:tcW w:w="3448" w:type="dxa"/>
-            <w:hideMark/>
-          </w:tcPr>
-          <w:p>
-            <w:pPr>
-              <w:spacing w:line="278" w:lineRule="auto"/>
-            </w:pPr>
-          </w:p>
-        </w:tc>
-        <w:tc>
-          <w:tcPr>
-            <w:tcW w:w="0" w:type="auto"/>
+            <w:shd w:val="clear" w:color="auto" w:fill="F2F2F2" w:themeFill="background1" w:themeFillShade="F2"/>
+            <w:hideMark/>
+          </w:tcPr>
+          <w:p>
+            <w:pPr>
+              <w:spacing w:line="278" w:lineRule="auto"/>
+            </w:pPr>
+          </w:p>
+        </w:tc>
+        <w:tc>
+          <w:tcPr>
+            <w:tcW w:w="0" w:type="auto"/>
+            <w:shd w:val="clear" w:color="auto" w:fill="F2F2F2" w:themeFill="background1" w:themeFillShade="F2"/>
             <w:hideMark/>
           </w:tcPr>
           <w:p>
@@ -4674,6 +4740,7 @@
         <w:tc>
           <w:tcPr>
             <w:tcW w:w="0" w:type="auto"/>
+            <w:shd w:val="clear" w:color="auto" w:fill="F2F2F2" w:themeFill="background1" w:themeFillShade="F2"/>
             <w:hideMark/>
           </w:tcPr>
           <w:p>
@@ -4688,6 +4755,7 @@
         <w:tc>
           <w:tcPr>
             <w:tcW w:w="0" w:type="auto"/>
+            <w:shd w:val="clear" w:color="auto" w:fill="F2F2F2" w:themeFill="background1" w:themeFillShade="F2"/>
             <w:hideMark/>
           </w:tcPr>
           <w:p>
@@ -4706,6 +4774,7 @@
         <w:tc>
           <w:tcPr>
             <w:tcW w:w="0" w:type="auto"/>
+            <w:shd w:val="clear" w:color="auto" w:fill="F2F2F2" w:themeFill="background1" w:themeFillShade="F2"/>
             <w:hideMark/>
           </w:tcPr>
           <w:p>
@@ -6023,6 +6092,11 @@
       <w:r>
         <w:lastRenderedPageBreak/>
         <w:t>Australia sells itself as an outdoor nation, with beaches, bush and a "no worries" weekend. But how much of that picture is true in everyday life? This story tests the claim against national survey data, asking what Australians actually do, who does it, where, and how it is changing.</w:t>
+      </w:r>
+    </w:p>
+    <w:p>
+      <w:r>
+        <w:t>To explore what Australian outdoor recreation really looks like, activities are categorized based on their primary environment. "Core Outdoor" activities (like bush walking and surfing) rely strictly on natural settings, while "Outdoor Capable" sports can shift between indoor and outdoor venues. Indoor-exclusive facility activities are excluded from outdoor-specific rankings to isolate true outdoor trends.</w:t>
       </w:r>
     </w:p>
     <w:tbl>
@@ -6393,15 +6467,7 @@
               </w:rPr>
             </w:pPr>
             <w:r>
-              <w:t xml:space="preserve">A few outdoor activities dominate and a long tail </w:t>
-            </w:r>
-            <w:proofErr w:type="gramStart"/>
-            <w:r>
-              <w:t>trails</w:t>
-            </w:r>
-            <w:proofErr w:type="gramEnd"/>
-            <w:r>
-              <w:t xml:space="preserve"> behind them. That raises the next question: does "going outdoors" mean the same thing for everyone? Section 2 asks how structured it is and who does what.</w:t>
+              <w:t>A few outdoor activities dominate and a long tail trails behind them. That raises the next question: does "going outdoors" mean the same thing for everyone? Section 2 asks how structured it is and who does what.</w:t>
             </w:r>
           </w:p>
         </w:tc>
@@ -8039,6 +8105,7 @@
   <w:style w:type="character" w:default="1" w:styleId="DefaultParagraphFont">
     <w:name w:val="Default Paragraph Font"/>
     <w:uiPriority w:val="1"/>
+    <w:semiHidden/>
     <w:unhideWhenUsed/>
   </w:style>
   <w:style w:type="table" w:default="1" w:styleId="TableNormal">

</xml_diff>

<commit_message>
updated color and sizing for each chart
</commit_message>
<xml_diff>
--- a/draft.docx
+++ b/draft.docx
@@ -8895,137 +8895,68 @@
         <w:br w:type="page"/>
       </w:r>
     </w:p>
-    <w:p>
-      <w:r>
-        <w:lastRenderedPageBreak/>
-        <w:t>Australia sells itself as an outdoor nation, with beaches, bush and a "no worries" weekend. But how much of that picture is true in everyday life? This story tests the claim against national survey data, asking what Australians actually do, who does it, where, and how it is changing.</w:t>
-      </w:r>
-    </w:p>
-    <w:p>
-      <w:r>
-        <w:t>To explore what Australian outdoor recreation really looks like, activities are categorized based on their primary environment. "Core Outdoor" activities (like bush walking and surfing) rely strictly on natural settings, while "Outdoor Capable" sports can shift between indoor and outdoor venues. Indoor-exclusive facility activities are excluded from outdoor-specific rankings to isolate true outdoor trends.</w:t>
-      </w:r>
-    </w:p>
     <w:tbl>
       <w:tblPr>
         <w:tblStyle w:val="TableGrid"/>
-        <w:tblW w:w="13980" w:type="dxa"/>
+        <w:tblW w:w="0" w:type="auto"/>
         <w:tblLook w:val="04A0" w:firstRow="1" w:lastRow="0" w:firstColumn="1" w:lastColumn="0" w:noHBand="0" w:noVBand="1"/>
       </w:tblPr>
       <w:tblGrid>
-        <w:gridCol w:w="1129"/>
-        <w:gridCol w:w="1843"/>
-        <w:gridCol w:w="1843"/>
-        <w:gridCol w:w="1701"/>
-        <w:gridCol w:w="5282"/>
-        <w:gridCol w:w="2182"/>
+        <w:gridCol w:w="2689"/>
+        <w:gridCol w:w="3118"/>
+        <w:gridCol w:w="3827"/>
+        <w:gridCol w:w="4314"/>
       </w:tblGrid>
       <w:tr>
         <w:tc>
           <w:tcPr>
-            <w:tcW w:w="1129" w:type="dxa"/>
-          </w:tcPr>
-          <w:p>
-            <w:pPr>
-              <w:rPr>
-                <w:lang w:val="af-ZA"/>
-              </w:rPr>
-            </w:pPr>
-            <w:r>
-              <w:rPr>
-                <w:lang w:val="af-ZA"/>
-              </w:rPr>
-              <w:t>Chart No</w:t>
-            </w:r>
-          </w:p>
-        </w:tc>
-        <w:tc>
-          <w:tcPr>
-            <w:tcW w:w="1843" w:type="dxa"/>
-          </w:tcPr>
-          <w:p>
-            <w:pPr>
-              <w:rPr>
-                <w:lang w:val="af-ZA"/>
-              </w:rPr>
-            </w:pPr>
-            <w:r>
-              <w:rPr>
-                <w:lang w:val="af-ZA"/>
-              </w:rPr>
-              <w:t>Visuals</w:t>
-            </w:r>
-          </w:p>
-        </w:tc>
-        <w:tc>
-          <w:tcPr>
-            <w:tcW w:w="1843" w:type="dxa"/>
-          </w:tcPr>
-          <w:p>
-            <w:pPr>
-              <w:rPr>
-                <w:lang w:val="af-ZA"/>
-              </w:rPr>
-            </w:pPr>
-            <w:r>
-              <w:rPr>
-                <w:lang w:val="af-ZA"/>
-              </w:rPr>
-              <w:t>Main Ques</w:t>
-            </w:r>
-          </w:p>
-        </w:tc>
-        <w:tc>
-          <w:tcPr>
-            <w:tcW w:w="1701" w:type="dxa"/>
-          </w:tcPr>
-          <w:p>
-            <w:pPr>
-              <w:rPr>
-                <w:lang w:val="af-ZA"/>
-              </w:rPr>
-            </w:pPr>
-            <w:r>
-              <w:rPr>
-                <w:lang w:val="af-ZA"/>
-              </w:rPr>
-              <w:t>Chart Type</w:t>
-            </w:r>
-          </w:p>
-        </w:tc>
-        <w:tc>
-          <w:tcPr>
-            <w:tcW w:w="5282" w:type="dxa"/>
-          </w:tcPr>
-          <w:p>
-            <w:pPr>
-              <w:rPr>
-                <w:lang w:val="af-ZA"/>
-              </w:rPr>
-            </w:pPr>
-            <w:r>
-              <w:rPr>
-                <w:lang w:val="af-ZA"/>
-              </w:rPr>
-              <w:t xml:space="preserve">Text to link to next </w:t>
-            </w:r>
-          </w:p>
-        </w:tc>
-        <w:tc>
-          <w:tcPr>
-            <w:tcW w:w="2182" w:type="dxa"/>
-          </w:tcPr>
-          <w:p>
-            <w:pPr>
-              <w:rPr>
-                <w:lang w:val="af-ZA"/>
-              </w:rPr>
-            </w:pPr>
-            <w:r>
-              <w:rPr>
-                <w:lang w:val="af-ZA"/>
-              </w:rPr>
-              <w:t>Original Data source</w:t>
+            <w:tcW w:w="2689" w:type="dxa"/>
+          </w:tcPr>
+          <w:p>
+            <w:r>
+              <w:lastRenderedPageBreak/>
+              <w:t>The Big Picture: How Active Is Australia?</w:t>
+            </w:r>
+          </w:p>
+        </w:tc>
+        <w:tc>
+          <w:tcPr>
+            <w:tcW w:w="3118" w:type="dxa"/>
+          </w:tcPr>
+          <w:p>
+            <w:r>
+              <w:t>Opening · Establish the question and create curiosity</w:t>
+            </w:r>
+          </w:p>
+        </w:tc>
+        <w:tc>
+          <w:tcPr>
+            <w:tcW w:w="3827" w:type="dxa"/>
+          </w:tcPr>
+          <w:p>
+            <w:r>
+              <w:t>Are Australians participating in recreation, and which activities attract the most people?</w:t>
+            </w:r>
+          </w:p>
+        </w:tc>
+        <w:tc>
+          <w:tcPr>
+            <w:tcW w:w="4314" w:type="dxa"/>
+          </w:tcPr>
+          <w:p>
+            <w:r>
+              <w:t xml:space="preserve">- </w:t>
+            </w:r>
+            <w:r>
+              <w:t>Waffle chart: Overall participation rate.</w:t>
+            </w:r>
+          </w:p>
+          <w:p>
+            <w:r>
+              <w:t xml:space="preserve">- </w:t>
+            </w:r>
+            <w:r>
+              <w:t>Ranked bar chart: Overall activity ranking.</w:t>
             </w:r>
           </w:p>
         </w:tc>
@@ -9033,90 +8964,60 @@
       <w:tr>
         <w:tc>
           <w:tcPr>
-            <w:tcW w:w="1129" w:type="dxa"/>
-          </w:tcPr>
-          <w:p>
-            <w:pPr>
-              <w:rPr>
-                <w:lang w:val="af-ZA"/>
-              </w:rPr>
-            </w:pPr>
-            <w:r>
-              <w:rPr>
-                <w:lang w:val="af-ZA"/>
-              </w:rPr>
-              <w:t>1.1</w:t>
-            </w:r>
-          </w:p>
-        </w:tc>
-        <w:tc>
-          <w:tcPr>
-            <w:tcW w:w="1843" w:type="dxa"/>
-          </w:tcPr>
-          <w:p>
-            <w:r>
-              <w:t>Participation Activeness</w:t>
-            </w:r>
-          </w:p>
-        </w:tc>
-        <w:tc>
-          <w:tcPr>
-            <w:tcW w:w="1843" w:type="dxa"/>
-          </w:tcPr>
-          <w:p>
-            <w:pPr>
-              <w:rPr>
-                <w:lang w:val="af-ZA"/>
-              </w:rPr>
-            </w:pPr>
-            <w:r>
-              <w:t>How active are Australians?</w:t>
-            </w:r>
-          </w:p>
-        </w:tc>
-        <w:tc>
-          <w:tcPr>
-            <w:tcW w:w="1701" w:type="dxa"/>
-          </w:tcPr>
-          <w:p>
-            <w:r>
-              <w:t>Donut Chart</w:t>
-            </w:r>
-          </w:p>
-        </w:tc>
-        <w:tc>
-          <w:tcPr>
-            <w:tcW w:w="5282" w:type="dxa"/>
-          </w:tcPr>
-          <w:p>
-            <w:pPr>
-              <w:rPr>
-                <w:lang w:val="af-ZA"/>
-              </w:rPr>
-            </w:pPr>
-            <w:r>
-              <w:t>[X%] of Australian adults took part in physical activity in 2025, so participation is widespread. But "active" covers everything from a gym class to a coastal hike. What are people actually doing?</w:t>
-            </w:r>
-            <w:r>
-              <w:t xml:space="preserve"> </w:t>
-            </w:r>
-          </w:p>
-        </w:tc>
-        <w:tc>
-          <w:tcPr>
-            <w:tcW w:w="2182" w:type="dxa"/>
-          </w:tcPr>
-          <w:p>
-            <w:pPr>
-              <w:rPr>
-                <w:lang w:val="af-ZA"/>
-              </w:rPr>
-            </w:pPr>
-            <w:r>
-              <w:rPr>
-                <w:lang w:val="af-ZA"/>
-              </w:rPr>
-              <w:t>AusPlay-National Data 30 April 2026, Table 1</w:t>
+            <w:tcW w:w="2689" w:type="dxa"/>
+          </w:tcPr>
+          <w:p>
+            <w:r>
+              <w:t>Different People, Different Activities</w:t>
+            </w:r>
+          </w:p>
+        </w:tc>
+        <w:tc>
+          <w:tcPr>
+            <w:tcW w:w="3118" w:type="dxa"/>
+          </w:tcPr>
+          <w:p>
+            <w:r>
+              <w:t>Explore participation patterns across demographics</w:t>
+            </w:r>
+          </w:p>
+        </w:tc>
+        <w:tc>
+          <w:tcPr>
+            <w:tcW w:w="3827" w:type="dxa"/>
+          </w:tcPr>
+          <w:p>
+            <w:r>
+              <w:t>Central question: Do activity preferences change with age?</w:t>
+            </w:r>
+          </w:p>
+        </w:tc>
+        <w:tc>
+          <w:tcPr>
+            <w:tcW w:w="4314" w:type="dxa"/>
+          </w:tcPr>
+          <w:p>
+            <w:r>
+              <w:t xml:space="preserve">- </w:t>
+            </w:r>
+            <w:r>
+              <w:t>Normalised stacked bar: Sport vs non-sport preferences by age group.</w:t>
+            </w:r>
+          </w:p>
+          <w:p>
+            <w:r>
+              <w:t xml:space="preserve">- </w:t>
+            </w:r>
+            <w:r>
+              <w:t>Population pyramid: Adults active at least once a year, by age and sex.</w:t>
+            </w:r>
+          </w:p>
+          <w:p>
+            <w:r>
+              <w:t xml:space="preserve">- </w:t>
+            </w:r>
+            <w:r>
+              <w:t>Heatmap: Age group × core activity.</w:t>
             </w:r>
           </w:p>
         </w:tc>
@@ -9124,82 +9025,52 @@
       <w:tr>
         <w:tc>
           <w:tcPr>
-            <w:tcW w:w="1129" w:type="dxa"/>
-          </w:tcPr>
-          <w:p>
-            <w:pPr>
-              <w:rPr>
-                <w:lang w:val="af-ZA"/>
-              </w:rPr>
-            </w:pPr>
-            <w:r>
-              <w:rPr>
-                <w:lang w:val="af-ZA"/>
-              </w:rPr>
-              <w:t>1.2</w:t>
-            </w:r>
-          </w:p>
-        </w:tc>
-        <w:tc>
-          <w:tcPr>
-            <w:tcW w:w="1843" w:type="dxa"/>
-          </w:tcPr>
-          <w:p>
-            <w:r>
-              <w:t>Top 20 Activities</w:t>
-            </w:r>
-          </w:p>
-        </w:tc>
-        <w:tc>
-          <w:tcPr>
-            <w:tcW w:w="1843" w:type="dxa"/>
-          </w:tcPr>
-          <w:p>
-            <w:r>
-              <w:t>What do Australians actually do?</w:t>
-            </w:r>
-          </w:p>
-        </w:tc>
-        <w:tc>
-          <w:tcPr>
-            <w:tcW w:w="1701" w:type="dxa"/>
-          </w:tcPr>
-          <w:p>
-            <w:r>
-              <w:t>Rank Bar Chart</w:t>
-            </w:r>
-          </w:p>
-        </w:tc>
-        <w:tc>
-          <w:tcPr>
-            <w:tcW w:w="5282" w:type="dxa"/>
-          </w:tcPr>
-          <w:p>
-            <w:pPr>
-              <w:rPr>
-                <w:lang w:val="af-ZA"/>
-              </w:rPr>
-            </w:pPr>
-            <w:r>
-              <w:t>Walking leads at 50.2%, with fitness/gym second at 34.1% and bush walking third at 17.5%. Outdoor activities fill much of the top of the ranking. Taking the gym and court sports out leaves what outdoor recreation in Australia actually looks like.</w:t>
-            </w:r>
-          </w:p>
-        </w:tc>
-        <w:tc>
-          <w:tcPr>
-            <w:tcW w:w="2182" w:type="dxa"/>
-          </w:tcPr>
-          <w:p>
-            <w:pPr>
-              <w:rPr>
-                <w:lang w:val="af-ZA"/>
-              </w:rPr>
-            </w:pPr>
-            <w:r>
-              <w:rPr>
-                <w:lang w:val="af-ZA"/>
-              </w:rPr>
-              <w:t>AusPlay-By Sport Data 30 April 2026, Table 6</w:t>
+            <w:tcW w:w="2689" w:type="dxa"/>
+          </w:tcPr>
+          <w:p>
+            <w:r>
+              <w:t>Why and How Do People Participate?</w:t>
+            </w:r>
+          </w:p>
+        </w:tc>
+        <w:tc>
+          <w:tcPr>
+            <w:tcW w:w="3118" w:type="dxa"/>
+          </w:tcPr>
+          <w:p>
+            <w:r>
+              <w:t>Explain motivations and participation structures</w:t>
+            </w:r>
+          </w:p>
+        </w:tc>
+        <w:tc>
+          <w:tcPr>
+            <w:tcW w:w="3827" w:type="dxa"/>
+          </w:tcPr>
+          <w:p>
+            <w:r>
+              <w:t>What reasons and organising arrangements are associated with participation?</w:t>
+            </w:r>
+          </w:p>
+        </w:tc>
+        <w:tc>
+          <w:tcPr>
+            <w:tcW w:w="4314" w:type="dxa"/>
+          </w:tcPr>
+          <w:p>
+            <w:r>
+              <w:t xml:space="preserve">- </w:t>
+            </w:r>
+            <w:r>
+              <w:t>Heatmap: Motivation × age group.</w:t>
+            </w:r>
+          </w:p>
+          <w:p>
+            <w:r>
+              <w:t xml:space="preserve">- </w:t>
+            </w:r>
+            <w:r>
+              <w:t>Alluvial chart: Organising entity by age group.</w:t>
             </w:r>
           </w:p>
         </w:tc>
@@ -9207,93 +9078,52 @@
       <w:tr>
         <w:tc>
           <w:tcPr>
-            <w:tcW w:w="1129" w:type="dxa"/>
-            <w:shd w:val="clear" w:color="auto" w:fill="F2F2F2" w:themeFill="background1" w:themeFillShade="F2"/>
-          </w:tcPr>
-          <w:p>
-            <w:pPr>
-              <w:rPr>
-                <w:lang w:val="af-ZA"/>
-              </w:rPr>
-            </w:pPr>
-            <w:r>
-              <w:rPr>
-                <w:lang w:val="af-ZA"/>
-              </w:rPr>
-              <w:t>1.3</w:t>
-            </w:r>
-          </w:p>
-        </w:tc>
-        <w:tc>
-          <w:tcPr>
-            <w:tcW w:w="1843" w:type="dxa"/>
-            <w:shd w:val="clear" w:color="auto" w:fill="F2F2F2" w:themeFill="background1" w:themeFillShade="F2"/>
-          </w:tcPr>
-          <w:p>
-            <w:r>
-              <w:t>Top Outdoor Activities</w:t>
-            </w:r>
-          </w:p>
-        </w:tc>
-        <w:tc>
-          <w:tcPr>
-            <w:tcW w:w="1843" w:type="dxa"/>
-            <w:shd w:val="clear" w:color="auto" w:fill="F2F2F2" w:themeFill="background1" w:themeFillShade="F2"/>
-          </w:tcPr>
-          <w:p>
-            <w:pPr>
-              <w:rPr>
-                <w:lang w:val="af-ZA"/>
-              </w:rPr>
-            </w:pPr>
-            <w:r>
-              <w:t>What does Australia's outdoor lifestyle look like?</w:t>
-            </w:r>
-          </w:p>
-        </w:tc>
-        <w:tc>
-          <w:tcPr>
-            <w:tcW w:w="1701" w:type="dxa"/>
-            <w:shd w:val="clear" w:color="auto" w:fill="F2F2F2" w:themeFill="background1" w:themeFillShade="F2"/>
-          </w:tcPr>
-          <w:p>
-            <w:r>
-              <w:t>Rank Bar Chart</w:t>
-            </w:r>
-          </w:p>
-        </w:tc>
-        <w:tc>
-          <w:tcPr>
-            <w:tcW w:w="5282" w:type="dxa"/>
-            <w:shd w:val="clear" w:color="auto" w:fill="F2F2F2" w:themeFill="background1" w:themeFillShade="F2"/>
-          </w:tcPr>
-          <w:p>
-            <w:pPr>
-              <w:rPr>
-                <w:lang w:val="af-ZA"/>
-              </w:rPr>
-            </w:pPr>
-            <w:r>
-              <w:t>A few outdoor activities dominate and a long tail trails behind them. That raises the next question: does "going outdoors" mean the same thing for everyone? Section 2 asks how structured it is and who does what.</w:t>
-            </w:r>
-          </w:p>
-        </w:tc>
-        <w:tc>
-          <w:tcPr>
-            <w:tcW w:w="2182" w:type="dxa"/>
-            <w:shd w:val="clear" w:color="auto" w:fill="F2F2F2" w:themeFill="background1" w:themeFillShade="F2"/>
-          </w:tcPr>
-          <w:p>
-            <w:pPr>
-              <w:rPr>
-                <w:lang w:val="af-ZA"/>
-              </w:rPr>
-            </w:pPr>
-            <w:r>
-              <w:rPr>
-                <w:lang w:val="af-ZA"/>
-              </w:rPr>
-              <w:t>AusPlay-By Sport Data 30 April 2026, Table 6</w:t>
+            <w:tcW w:w="2689" w:type="dxa"/>
+          </w:tcPr>
+          <w:p>
+            <w:r>
+              <w:t>From Activity Settings to Geographic Differences</w:t>
+            </w:r>
+          </w:p>
+        </w:tc>
+        <w:tc>
+          <w:tcPr>
+            <w:tcW w:w="3118" w:type="dxa"/>
+          </w:tcPr>
+          <w:p>
+            <w:r>
+              <w:t>Bridge the human story to the spatial story</w:t>
+            </w:r>
+          </w:p>
+        </w:tc>
+        <w:tc>
+          <w:tcPr>
+            <w:tcW w:w="3827" w:type="dxa"/>
+          </w:tcPr>
+          <w:p>
+            <w:r>
+              <w:t>Where do adults take part in activities, and how does participation differ across Australia?</w:t>
+            </w:r>
+          </w:p>
+        </w:tc>
+        <w:tc>
+          <w:tcPr>
+            <w:tcW w:w="4314" w:type="dxa"/>
+          </w:tcPr>
+          <w:p>
+            <w:r>
+              <w:t xml:space="preserve">- </w:t>
+            </w:r>
+            <w:r>
+              <w:t>Bump chart: Places where adults' activities took place, if comparable rankings are available across multiple years.</w:t>
+            </w:r>
+          </w:p>
+          <w:p>
+            <w:r>
+              <w:t xml:space="preserve">- </w:t>
+            </w:r>
+            <w:r>
+              <w:t>Multiple choropleth map: Adult participation rates by state and territory, showing annual, weekly and more frequent participation.</w:t>
             </w:r>
           </w:p>
         </w:tc>
@@ -9301,112 +9131,52 @@
       <w:tr>
         <w:tc>
           <w:tcPr>
-            <w:tcW w:w="1129" w:type="dxa"/>
-          </w:tcPr>
-          <w:p>
-            <w:pPr>
-              <w:rPr>
-                <w:lang w:val="af-ZA"/>
-              </w:rPr>
-            </w:pPr>
-            <w:r>
-              <w:rPr>
-                <w:lang w:val="af-ZA"/>
-              </w:rPr>
-              <w:t>2.1</w:t>
-            </w:r>
-          </w:p>
-          <w:p>
-            <w:pPr>
-              <w:rPr>
-                <w:lang w:val="af-ZA"/>
-              </w:rPr>
-            </w:pPr>
-          </w:p>
-        </w:tc>
-        <w:tc>
-          <w:tcPr>
-            <w:tcW w:w="1843" w:type="dxa"/>
-          </w:tcPr>
-          <w:p>
-            <w:r>
-              <w:t>Structured Channels in Top 10 Outdoor Recreational Activities</w:t>
-            </w:r>
-          </w:p>
-        </w:tc>
-        <w:tc>
-          <w:tcPr>
-            <w:tcW w:w="1843" w:type="dxa"/>
-          </w:tcPr>
-          <w:p>
-            <w:pPr>
-              <w:rPr>
-                <w:lang w:val="af-ZA"/>
-              </w:rPr>
-            </w:pPr>
-            <w:r>
-              <w:t>Is outdoor recreation structured or casual?</w:t>
-            </w:r>
-          </w:p>
-        </w:tc>
-        <w:tc>
-          <w:tcPr>
-            <w:tcW w:w="1701" w:type="dxa"/>
-          </w:tcPr>
-          <w:p>
-            <w:pPr>
-              <w:rPr>
-                <w:lang w:val="af-ZA"/>
-              </w:rPr>
-            </w:pPr>
-            <w:r>
-              <w:rPr>
-                <w:lang w:val="af-ZA"/>
-              </w:rPr>
-              <w:t>Group Bar Chart</w:t>
-            </w:r>
-          </w:p>
-        </w:tc>
-        <w:tc>
-          <w:tcPr>
-            <w:tcW w:w="5282" w:type="dxa"/>
-          </w:tcPr>
-          <w:p>
-            <w:pPr>
-              <w:rPr>
-                <w:lang w:val="af-ZA"/>
-              </w:rPr>
-            </w:pPr>
-          </w:p>
-        </w:tc>
-        <w:tc>
-          <w:tcPr>
-            <w:tcW w:w="2182" w:type="dxa"/>
-          </w:tcPr>
-          <w:p>
-            <w:pPr>
-              <w:rPr>
-                <w:lang w:val="af-ZA"/>
-              </w:rPr>
-            </w:pPr>
-            <w:r>
-              <w:rPr>
-                <w:lang w:val="af-ZA"/>
-              </w:rPr>
-              <w:t xml:space="preserve">AusPlay-By Sport Data 30 April 2026, </w:t>
-            </w:r>
-          </w:p>
-          <w:p>
-            <w:pPr>
-              <w:rPr>
-                <w:lang w:val="af-ZA"/>
-              </w:rPr>
-            </w:pPr>
-            <w:r>
-              <w:rPr>
-                <w:lang w:val="af-ZA"/>
-              </w:rPr>
-              <w:t>Table 4</w:t>
+            <w:tcW w:w="2689" w:type="dxa"/>
+          </w:tcPr>
+          <w:p>
+            <w:r>
+              <w:t>Zooming In: The Northern Territory's Park Landscape</w:t>
+            </w:r>
+          </w:p>
+        </w:tc>
+        <w:tc>
+          <w:tcPr>
+            <w:tcW w:w="3118" w:type="dxa"/>
+          </w:tcPr>
+          <w:p>
+            <w:r>
+              <w:t>Geographic case study · The centrepiece of your spatial narrative</w:t>
+            </w:r>
+          </w:p>
+        </w:tc>
+        <w:tc>
+          <w:tcPr>
+            <w:tcW w:w="3827" w:type="dxa"/>
+          </w:tcPr>
+          <w:p>
+            <w:r>
+              <w:t>What does the NT's park network look like, and which NT Government-managed parks record the most visits?</w:t>
+            </w:r>
+          </w:p>
+        </w:tc>
+        <w:tc>
+          <w:tcPr>
+            <w:tcW w:w="4314" w:type="dxa"/>
+          </w:tcPr>
+          <w:p>
+            <w:r>
+              <w:t xml:space="preserve">- </w:t>
+            </w:r>
+            <w:r>
+              <w:t>Dot map: Distribution of NT parks, distinguishing NT Government-managed sites from Commonwealth-managed Kakadu and Uluṟu-Kata Tjuṯa.</w:t>
+            </w:r>
+          </w:p>
+          <w:p>
+            <w:r>
+              <w:t xml:space="preserve">- </w:t>
+            </w:r>
+            <w:r>
+              <w:t>Proportional symbol map: Top 11 NT Government-managed parks by reported visitation.</w:t>
             </w:r>
           </w:p>
         </w:tc>
@@ -9414,343 +9184,833 @@
       <w:tr>
         <w:tc>
           <w:tcPr>
-            <w:tcW w:w="1129" w:type="dxa"/>
-          </w:tcPr>
-          <w:p>
-            <w:pPr>
-              <w:rPr>
-                <w:lang w:val="af-ZA"/>
-              </w:rPr>
-            </w:pPr>
-            <w:r>
-              <w:rPr>
-                <w:lang w:val="af-ZA"/>
-              </w:rPr>
-              <w:t>2.2</w:t>
-            </w:r>
-          </w:p>
-        </w:tc>
-        <w:tc>
-          <w:tcPr>
-            <w:tcW w:w="1843" w:type="dxa"/>
-          </w:tcPr>
-          <w:p>
-            <w:r>
-              <w:t xml:space="preserve">Participation in Outdoor </w:t>
-            </w:r>
-            <w:r>
-              <w:lastRenderedPageBreak/>
-              <w:t>Recreational Activities by Age Group</w:t>
-            </w:r>
-          </w:p>
-          <w:p>
-            <w:pPr>
-              <w:rPr>
-                <w:lang w:val="af-ZA"/>
-              </w:rPr>
-            </w:pPr>
-          </w:p>
-        </w:tc>
-        <w:tc>
-          <w:tcPr>
-            <w:tcW w:w="1843" w:type="dxa"/>
-          </w:tcPr>
-          <w:p>
-            <w:pPr>
-              <w:rPr>
-                <w:lang w:val="af-ZA"/>
-              </w:rPr>
-            </w:pPr>
-            <w:r>
-              <w:lastRenderedPageBreak/>
-              <w:t xml:space="preserve">Which outdoor activities attract </w:t>
-            </w:r>
-            <w:r>
-              <w:lastRenderedPageBreak/>
-              <w:t>different generations?</w:t>
-            </w:r>
-          </w:p>
-        </w:tc>
-        <w:tc>
-          <w:tcPr>
-            <w:tcW w:w="1701" w:type="dxa"/>
-          </w:tcPr>
-          <w:p>
-            <w:pPr>
-              <w:rPr>
-                <w:lang w:val="af-ZA"/>
-              </w:rPr>
-            </w:pPr>
-          </w:p>
-        </w:tc>
-        <w:tc>
-          <w:tcPr>
-            <w:tcW w:w="5282" w:type="dxa"/>
-          </w:tcPr>
-          <w:p>
-            <w:pPr>
-              <w:rPr>
-                <w:lang w:val="af-ZA"/>
-              </w:rPr>
-            </w:pPr>
-          </w:p>
-        </w:tc>
-        <w:tc>
-          <w:tcPr>
-            <w:tcW w:w="2182" w:type="dxa"/>
-          </w:tcPr>
-          <w:p>
-            <w:pPr>
-              <w:rPr>
-                <w:lang w:val="af-ZA"/>
-              </w:rPr>
-            </w:pPr>
-            <w:r>
-              <w:rPr>
-                <w:lang w:val="af-ZA"/>
-              </w:rPr>
-              <w:t xml:space="preserve">AusPlay-By Sport Data 30 April 2026, </w:t>
-            </w:r>
-          </w:p>
-          <w:p>
-            <w:pPr>
-              <w:rPr>
-                <w:lang w:val="af-ZA"/>
-              </w:rPr>
-            </w:pPr>
-            <w:r>
-              <w:rPr>
-                <w:lang w:val="af-ZA"/>
-              </w:rPr>
-              <w:lastRenderedPageBreak/>
-              <w:t>Table 3</w:t>
-            </w:r>
-          </w:p>
-        </w:tc>
-      </w:tr>
-      <w:tr>
-        <w:tc>
-          <w:tcPr>
-            <w:tcW w:w="1129" w:type="dxa"/>
-          </w:tcPr>
-          <w:p>
-            <w:pPr>
-              <w:rPr>
-                <w:lang w:val="af-ZA"/>
-              </w:rPr>
-            </w:pPr>
-          </w:p>
-        </w:tc>
-        <w:tc>
-          <w:tcPr>
-            <w:tcW w:w="1843" w:type="dxa"/>
-          </w:tcPr>
-          <w:p>
-            <w:pPr>
-              <w:rPr>
-                <w:lang w:val="af-ZA"/>
-              </w:rPr>
-            </w:pPr>
-          </w:p>
-        </w:tc>
-        <w:tc>
-          <w:tcPr>
-            <w:tcW w:w="1843" w:type="dxa"/>
-          </w:tcPr>
-          <w:p>
-            <w:pPr>
-              <w:rPr>
-                <w:lang w:val="af-ZA"/>
-              </w:rPr>
-            </w:pPr>
-          </w:p>
-        </w:tc>
-        <w:tc>
-          <w:tcPr>
-            <w:tcW w:w="1701" w:type="dxa"/>
-          </w:tcPr>
-          <w:p>
-            <w:pPr>
-              <w:rPr>
-                <w:lang w:val="af-ZA"/>
-              </w:rPr>
-            </w:pPr>
-          </w:p>
-        </w:tc>
-        <w:tc>
-          <w:tcPr>
-            <w:tcW w:w="5282" w:type="dxa"/>
-          </w:tcPr>
-          <w:p>
-            <w:pPr>
-              <w:rPr>
-                <w:lang w:val="af-ZA"/>
-              </w:rPr>
-            </w:pPr>
-          </w:p>
-        </w:tc>
-        <w:tc>
-          <w:tcPr>
-            <w:tcW w:w="2182" w:type="dxa"/>
-          </w:tcPr>
-          <w:p>
-            <w:pPr>
-              <w:rPr>
-                <w:lang w:val="af-ZA"/>
-              </w:rPr>
-            </w:pPr>
-          </w:p>
-        </w:tc>
-      </w:tr>
-      <w:tr>
-        <w:tc>
-          <w:tcPr>
-            <w:tcW w:w="1129" w:type="dxa"/>
-          </w:tcPr>
-          <w:p>
-            <w:pPr>
-              <w:rPr>
-                <w:lang w:val="af-ZA"/>
-              </w:rPr>
-            </w:pPr>
-          </w:p>
-        </w:tc>
-        <w:tc>
-          <w:tcPr>
-            <w:tcW w:w="1843" w:type="dxa"/>
-          </w:tcPr>
-          <w:p>
-            <w:pPr>
-              <w:rPr>
-                <w:lang w:val="af-ZA"/>
-              </w:rPr>
-            </w:pPr>
-          </w:p>
-        </w:tc>
-        <w:tc>
-          <w:tcPr>
-            <w:tcW w:w="1843" w:type="dxa"/>
-          </w:tcPr>
-          <w:p>
-            <w:pPr>
-              <w:rPr>
-                <w:lang w:val="af-ZA"/>
-              </w:rPr>
-            </w:pPr>
-          </w:p>
-        </w:tc>
-        <w:tc>
-          <w:tcPr>
-            <w:tcW w:w="1701" w:type="dxa"/>
-          </w:tcPr>
-          <w:p>
-            <w:pPr>
-              <w:rPr>
-                <w:lang w:val="af-ZA"/>
-              </w:rPr>
-            </w:pPr>
-          </w:p>
-        </w:tc>
-        <w:tc>
-          <w:tcPr>
-            <w:tcW w:w="5282" w:type="dxa"/>
-          </w:tcPr>
-          <w:p>
-            <w:pPr>
-              <w:rPr>
-                <w:lang w:val="af-ZA"/>
-              </w:rPr>
-            </w:pPr>
-          </w:p>
-        </w:tc>
-        <w:tc>
-          <w:tcPr>
-            <w:tcW w:w="2182" w:type="dxa"/>
-          </w:tcPr>
-          <w:p>
-            <w:pPr>
-              <w:rPr>
-                <w:lang w:val="af-ZA"/>
-              </w:rPr>
-            </w:pPr>
-          </w:p>
-        </w:tc>
-      </w:tr>
-      <w:tr>
-        <w:tc>
-          <w:tcPr>
-            <w:tcW w:w="1129" w:type="dxa"/>
-          </w:tcPr>
-          <w:p>
-            <w:pPr>
-              <w:rPr>
-                <w:lang w:val="af-ZA"/>
-              </w:rPr>
-            </w:pPr>
-          </w:p>
-        </w:tc>
-        <w:tc>
-          <w:tcPr>
-            <w:tcW w:w="1843" w:type="dxa"/>
-          </w:tcPr>
-          <w:p>
-            <w:pPr>
-              <w:rPr>
-                <w:lang w:val="af-ZA"/>
-              </w:rPr>
-            </w:pPr>
-          </w:p>
-        </w:tc>
-        <w:tc>
-          <w:tcPr>
-            <w:tcW w:w="1843" w:type="dxa"/>
-          </w:tcPr>
-          <w:p>
-            <w:pPr>
-              <w:rPr>
-                <w:lang w:val="af-ZA"/>
-              </w:rPr>
-            </w:pPr>
-          </w:p>
-        </w:tc>
-        <w:tc>
-          <w:tcPr>
-            <w:tcW w:w="1701" w:type="dxa"/>
-          </w:tcPr>
-          <w:p>
-            <w:pPr>
-              <w:rPr>
-                <w:lang w:val="af-ZA"/>
-              </w:rPr>
-            </w:pPr>
-          </w:p>
-        </w:tc>
-        <w:tc>
-          <w:tcPr>
-            <w:tcW w:w="5282" w:type="dxa"/>
-          </w:tcPr>
-          <w:p>
-            <w:pPr>
-              <w:rPr>
-                <w:lang w:val="af-ZA"/>
-              </w:rPr>
-            </w:pPr>
-          </w:p>
-        </w:tc>
-        <w:tc>
-          <w:tcPr>
-            <w:tcW w:w="2182" w:type="dxa"/>
-          </w:tcPr>
-          <w:p>
-            <w:pPr>
-              <w:rPr>
-                <w:lang w:val="af-ZA"/>
-              </w:rPr>
-            </w:pPr>
+            <w:tcW w:w="2689" w:type="dxa"/>
+          </w:tcPr>
+          <w:p>
+            <w:r>
+              <w:t>B</w:t>
+            </w:r>
+            <w:r>
+              <w:t>eyond Participation: Social and Economic Context</w:t>
+            </w:r>
+          </w:p>
+        </w:tc>
+        <w:tc>
+          <w:tcPr>
+            <w:tcW w:w="3118" w:type="dxa"/>
+          </w:tcPr>
+          <w:p>
+            <w:r>
+              <w:t>Closing · Return to the bigger picture</w:t>
+            </w:r>
+          </w:p>
+        </w:tc>
+        <w:tc>
+          <w:tcPr>
+            <w:tcW w:w="3827" w:type="dxa"/>
+          </w:tcPr>
+          <w:p>
+            <w:r>
+              <w:t>How does participation vary by employment status, and what is the broader economic significance of sport and recreation tourism?</w:t>
+            </w:r>
+          </w:p>
+        </w:tc>
+        <w:tc>
+          <w:tcPr>
+            <w:tcW w:w="4314" w:type="dxa"/>
+          </w:tcPr>
+          <w:p>
+            <w:r>
+              <w:t xml:space="preserve">- </w:t>
+            </w:r>
+            <w:r>
+              <w:t>Mosaic chart: Participation activeness by employment status.</w:t>
+            </w:r>
+          </w:p>
+          <w:p>
+            <w:r>
+              <w:t xml:space="preserve">- </w:t>
+            </w:r>
+            <w:r>
+              <w:t>Area chart: Sport and recreation tourism output over time.</w:t>
+            </w:r>
           </w:p>
         </w:tc>
       </w:tr>
     </w:tbl>
+    <w:p>
+      <w:r>
+        <w:lastRenderedPageBreak/>
+        <w:t>Australia sells itself as an outdoor nation, with beaches, bush and a "no worries" weekend. But how much of that picture is true in everyday life? This story tests the claim against national survey data, asking what Australians actually do, who does it, where, and how it is changing.</w:t>
+      </w:r>
+    </w:p>
+    <w:p>
+      <w:r>
+        <w:t>Outdoor recreation is one part of Australia's broader sport and physical activity landscape. Before examining specific activities and destinations, we first need to understand how widespread participation is and which activities attract the most Australians.</w:t>
+      </w:r>
+    </w:p>
+    <w:p>
+      <w:pPr>
+        <w:rPr>
+          <w:b/>
+          <w:bCs/>
+        </w:rPr>
+      </w:pPr>
+      <w:r>
+        <w:rPr>
+          <w:b/>
+          <w:bCs/>
+        </w:rPr>
+        <w:t>Section 1 — The Big Picture: How Active Is Australia?</w:t>
+      </w:r>
+    </w:p>
+    <w:p>
+      <w:r>
+        <w:t>Purpose: Introduce participation and establish why outdoor recreation deserves further exploration.</w:t>
+      </w:r>
+    </w:p>
+    <w:p>
+      <w:r>
+        <w:t>Section introduction</w:t>
+      </w:r>
+    </w:p>
+    <w:p>
+      <w:r>
+        <w:t>Outdoor recreation is one part of Australia's broader sport and physical activity landscape. Before examining specific activities and destinations, we first need to understand how widespread participation is and which activities attract the most Australians.</w:t>
+      </w:r>
+    </w:p>
+    <w:p>
+      <w:pPr>
+        <w:rPr>
+          <w:b/>
+          <w:bCs/>
+        </w:rPr>
+      </w:pPr>
+      <w:r>
+        <w:rPr>
+          <w:b/>
+          <w:bCs/>
+        </w:rPr>
+        <w:t>Chart 1. Waffle chart — Overall participation rate</w:t>
+      </w:r>
+    </w:p>
+    <w:p>
+      <w:r>
+        <w:t>Text before the chart</w:t>
+      </w:r>
+    </w:p>
+    <w:p>
+      <w:r>
+        <w:t>How widespread is participation in Australia? This chart establishes the proportion of Australians who participate at least once a year, providing a starting point for understanding the country's activity landscape.</w:t>
+      </w:r>
+    </w:p>
+    <w:p>
+      <w:r>
+        <w:t>Text after the chart / link to Chart 2</w:t>
+      </w:r>
+    </w:p>
+    <w:p>
+      <w:r>
+        <w:t>Overall participation tells us how many people are active, but not what they choose to do. To understand the activities contributing to this landscape, we next compare participation across different activities.</w:t>
+      </w:r>
+    </w:p>
+    <w:p>
+      <w:r>
+        <w:t>Important: If this waffle chart measures general sport and physical activity participation, do not label the percentage as an outdoor recreation participation rate. It is the broader context for your outdoor recreation investigation.</w:t>
+      </w:r>
+    </w:p>
+    <w:p>
+      <w:pPr>
+        <w:rPr>
+          <w:b/>
+          <w:bCs/>
+        </w:rPr>
+      </w:pPr>
+      <w:r>
+        <w:rPr>
+          <w:b/>
+          <w:bCs/>
+        </w:rPr>
+        <w:t>Chart 2. Ranked bar chart — Overall activity ranking</w:t>
+      </w:r>
+    </w:p>
+    <w:p>
+      <w:r>
+        <w:t>Text before the chart</w:t>
+      </w:r>
+    </w:p>
+    <w:p>
+      <w:r>
+        <w:lastRenderedPageBreak/>
+        <w:t>Participation encompasses a wide range of activities, from recreational walking to organised sports. Ranking these activities helps identify which attract the greatest participation and which outdoor-associated activities deserve closer examination.</w:t>
+      </w:r>
+    </w:p>
+    <w:p>
+      <w:r>
+        <w:t>Text after the chart / link to Section 2</w:t>
+      </w:r>
+    </w:p>
+    <w:p>
+      <w:r>
+        <w:t>The ranking reveals which activities are popular overall, but national rankings can conceal differences between demographic groups. We therefore turn to age and sex to investigate how participation patterns vary across the population.</w:t>
+      </w:r>
+    </w:p>
+    <w:p>
+      <w:pPr>
+        <w:rPr>
+          <w:b/>
+          <w:bCs/>
+        </w:rPr>
+      </w:pPr>
+      <w:r>
+        <w:rPr>
+          <w:b/>
+          <w:bCs/>
+        </w:rPr>
+        <w:t>Section 2 — Different People, Different Activities</w:t>
+      </w:r>
+    </w:p>
+    <w:p>
+      <w:r>
+        <w:t>Purpose: Explain who participates and how activity preferences differ across demographic groups.</w:t>
+      </w:r>
+    </w:p>
+    <w:p>
+      <w:r>
+        <w:t>Section introduction</w:t>
+      </w:r>
+    </w:p>
+    <w:p>
+      <w:r>
+        <w:t>Participation is not uniform across Australia. Age and sex can be associated with different activity preferences and participation patterns. Examining these differences helps us understand whose participation is represented in the national picture.</w:t>
+      </w:r>
+    </w:p>
+    <w:p>
+      <w:pPr>
+        <w:rPr>
+          <w:b/>
+          <w:bCs/>
+        </w:rPr>
+      </w:pPr>
+      <w:r>
+        <w:rPr>
+          <w:b/>
+          <w:bCs/>
+        </w:rPr>
+        <w:t>Chart 3. Normalised stacked bar chart — Sport vs non-sport preferences by age group</w:t>
+      </w:r>
+    </w:p>
+    <w:p>
+      <w:r>
+        <w:t>Text before the chart</w:t>
+      </w:r>
+    </w:p>
+    <w:p>
+      <w:r>
+        <w:t>Do younger and older Australians favour different types of activity? This chart compares the relative distribution of sport and non-sport participation across age groups, revealing whether preferences vary throughout life.</w:t>
+      </w:r>
+    </w:p>
+    <w:p>
+      <w:r>
+        <w:t>Text after the chart / link to Chart 4</w:t>
+      </w:r>
+    </w:p>
+    <w:p>
+      <w:r>
+        <w:t>Differences in sport and non-sport preferences provide an initial view of demographic variation. However, these broad categories do not reveal how participation is distributed across individual age and sex groups.</w:t>
+      </w:r>
+    </w:p>
+    <w:p>
+      <w:pPr>
+        <w:rPr>
+          <w:b/>
+          <w:bCs/>
+        </w:rPr>
+      </w:pPr>
+      <w:r>
+        <w:rPr>
+          <w:b/>
+          <w:bCs/>
+        </w:rPr>
+        <w:t>Chart 4. Population pyramid — Adults active at least once a year</w:t>
+      </w:r>
+    </w:p>
+    <w:p>
+      <w:r>
+        <w:t>Text before the chart</w:t>
+      </w:r>
+    </w:p>
+    <w:p>
+      <w:r>
+        <w:lastRenderedPageBreak/>
+        <w:t>To examine participation more closely, this population pyramid compares adults who are active at least once a year across age and sex groups. It helps identify demographic patterns that may be hidden by an overall participation rate.</w:t>
+      </w:r>
+    </w:p>
+    <w:p>
+      <w:r>
+        <w:t>Text after the chart / link to Chart 5</w:t>
+      </w:r>
+    </w:p>
+    <w:p>
+      <w:r>
+        <w:t>While the population pyramid reveals who participates, it does not tell us which activities are associated with different age groups. The next chart examines these activity-specific patterns.</w:t>
+      </w:r>
+    </w:p>
+    <w:p>
+      <w:r>
+        <w:t>Method note: If the pyramid displays counts of active adults rather than age-specific participation rates, larger bars may reflect differences in population size. Explain the measure in the caption.</w:t>
+      </w:r>
+    </w:p>
+    <w:p>
+      <w:pPr>
+        <w:rPr>
+          <w:b/>
+          <w:bCs/>
+        </w:rPr>
+      </w:pPr>
+      <w:r>
+        <w:rPr>
+          <w:b/>
+          <w:bCs/>
+        </w:rPr>
+        <w:t>Chart 5. Heatmap — Age group × core activity</w:t>
+      </w:r>
+    </w:p>
+    <w:p>
+      <w:r>
+        <w:t>Text before the chart</w:t>
+      </w:r>
+    </w:p>
+    <w:p>
+      <w:r>
+        <w:t>Different age groups may favour different activities. This heatmap compares participation across age groups and core activities, helping identify activities that are relatively more or less common within particular age groups.</w:t>
+      </w:r>
+    </w:p>
+    <w:p>
+      <w:r>
+        <w:t>Text after the chart / link to Section 3</w:t>
+      </w:r>
+    </w:p>
+    <w:p>
+      <w:r>
+        <w:t>The heatmap shows what people participate in, and the earlier charts show who participates. The next question is what motivates participation and how people organise their activities.</w:t>
+      </w:r>
+    </w:p>
+    <w:p>
+      <w:pPr>
+        <w:rPr>
+          <w:b/>
+          <w:bCs/>
+        </w:rPr>
+      </w:pPr>
+      <w:r>
+        <w:rPr>
+          <w:b/>
+          <w:bCs/>
+        </w:rPr>
+        <w:t>Section 3 — Why and How Do People Participate?</w:t>
+      </w:r>
+    </w:p>
+    <w:p>
+      <w:r>
+        <w:t>Purpose: Move beyond participation rates to explore reported motivations and organising arrangements.</w:t>
+      </w:r>
+    </w:p>
+    <w:p>
+      <w:r>
+        <w:t>Section introduction</w:t>
+      </w:r>
+    </w:p>
+    <w:p>
+      <w:r>
+        <w:t>Understanding participation requires more than identifying popular activities or demographic differences. People's reported motivations and the ways activities are organised provide additional context for interpreting participation patterns.</w:t>
+      </w:r>
+    </w:p>
+    <w:p>
+      <w:pPr>
+        <w:rPr>
+          <w:b/>
+          <w:bCs/>
+        </w:rPr>
+      </w:pPr>
+      <w:r>
+        <w:rPr>
+          <w:b/>
+          <w:bCs/>
+        </w:rPr>
+        <w:t>Chart 6. Heatmap — Motivation × age group</w:t>
+      </w:r>
+    </w:p>
+    <w:p>
+      <w:r>
+        <w:lastRenderedPageBreak/>
+        <w:t>Text before the chart</w:t>
+      </w:r>
+    </w:p>
+    <w:p>
+      <w:r>
+        <w:t>What motivates people to participate, and do these motivations vary with age? This heatmap compares reported motivations across age groups to identify similarities and differences in the reasons people give for taking part.</w:t>
+      </w:r>
+    </w:p>
+    <w:p>
+      <w:r>
+        <w:t>Text after the chart / link to Chart 7</w:t>
+      </w:r>
+    </w:p>
+    <w:p>
+      <w:r>
+        <w:t>Motivations help explain participants' reported reasons for taking part, but they do not describe how activities are arranged. We next examine the organising entities associated with participation across age groups.</w:t>
+      </w:r>
+    </w:p>
+    <w:p>
+      <w:pPr>
+        <w:rPr>
+          <w:b/>
+          <w:bCs/>
+        </w:rPr>
+      </w:pPr>
+      <w:r>
+        <w:rPr>
+          <w:b/>
+          <w:bCs/>
+        </w:rPr>
+        <w:t>Chart 7. Alluvial chart — Organising entity by age group</w:t>
+      </w:r>
+    </w:p>
+    <w:p>
+      <w:r>
+        <w:t>Text before the chart</w:t>
+      </w:r>
+    </w:p>
+    <w:p>
+      <w:r>
+        <w:t>Participation can take place through different organising arrangements, such as clubs, schools, fitness centres or informal groups, depending on the available categories. This alluvial chart explores how organising entities are represented across age groups.</w:t>
+      </w:r>
+    </w:p>
+    <w:p>
+      <w:r>
+        <w:t>Text after the chart / link to Section 4</w:t>
+      </w:r>
+    </w:p>
+    <w:p>
+      <w:r>
+        <w:t>Together, the motivation and organising-entity charts provide a broader picture of participation. Yet participation is not only a matter of individual preferences and arrangements; it also has a geographic dimension. We now examine where activities take place and how participation varies across Australia.</w:t>
+      </w:r>
+    </w:p>
+    <w:p>
+      <w:r>
+        <w:t>Method note: An alluvial chart implies a meaningful relationship between its axes. If the data records separate age-group and organising-entity categories rather than individual-level flows, make sure the chart is constructed from a valid joint distribution. Avoid implying that participants move between entities if the data does not record such movement.</w:t>
+      </w:r>
+    </w:p>
+    <w:p>
+      <w:pPr>
+        <w:rPr>
+          <w:b/>
+          <w:bCs/>
+        </w:rPr>
+      </w:pPr>
+      <w:r>
+        <w:rPr>
+          <w:b/>
+          <w:bCs/>
+        </w:rPr>
+        <w:t>Section 4 — From Activity Settings to Geographic Differences</w:t>
+      </w:r>
+    </w:p>
+    <w:p>
+      <w:r>
+        <w:t>Purpose: Bridge the participation analysis to the geographic investigation and justify the NT case study.</w:t>
+      </w:r>
+    </w:p>
+    <w:p>
+      <w:r>
+        <w:t>Section introduction</w:t>
+      </w:r>
+    </w:p>
+    <w:p>
+      <w:r>
+        <w:lastRenderedPageBreak/>
+        <w:t>Outdoor recreation depends partly on the settings in which activities can take place. Examining reported activity locations alongside geographic participation rates provides two complementary perspectives: where people say they participate and how participation varies between jurisdictions.</w:t>
+      </w:r>
+    </w:p>
+    <w:p>
+      <w:pPr>
+        <w:rPr>
+          <w:b/>
+          <w:bCs/>
+        </w:rPr>
+      </w:pPr>
+      <w:r>
+        <w:rPr>
+          <w:b/>
+          <w:bCs/>
+        </w:rPr>
+        <w:t>Chart 8. Bump chart — Places where adults' activities took place</w:t>
+      </w:r>
+    </w:p>
+    <w:p>
+      <w:r>
+        <w:t>Text before the chart</w:t>
+      </w:r>
+    </w:p>
+    <w:p>
+      <w:r>
+        <w:t>Outdoor recreation can occur in a variety of settings, including parks, streets, trails, beaches and other locations. This chart examines the reported places where adults take part in activities, helping establish the role of different settings in the wider participation landscape.</w:t>
+      </w:r>
+    </w:p>
+    <w:p>
+      <w:r>
+        <w:t>Text after the chart / link to Chart 9</w:t>
+      </w:r>
+    </w:p>
+    <w:p>
+      <w:r>
+        <w:t>These settings provide context for understanding where recreation occurs. We next examine whether participation itself varies geographically across Australia's states and territories.</w:t>
+      </w:r>
+    </w:p>
+    <w:p>
+      <w:r>
+        <w:t>Important: Keep the bump chart only if your data contains rankings across multiple comparable time points. If it only compares locations in one year, use a ranked bar chart instead.</w:t>
+      </w:r>
+    </w:p>
+    <w:p>
+      <w:pPr>
+        <w:rPr>
+          <w:b/>
+          <w:bCs/>
+        </w:rPr>
+      </w:pPr>
+      <w:r>
+        <w:rPr>
+          <w:b/>
+          <w:bCs/>
+        </w:rPr>
+        <w:t>Chart 9. Multiple choropleth map — Adult participation rate by state/territory</w:t>
+      </w:r>
+    </w:p>
+    <w:p>
+      <w:r>
+        <w:t>Text before the map</w:t>
+      </w:r>
+    </w:p>
+    <w:p>
+      <w:r>
+        <w:t>Reported activity settings provide one perspective on recreation, while state and territory participation rates provide another. This map compares adult participation across Australian jurisdictions at different frequency thresholds, from occasional to more regular participation.</w:t>
+      </w:r>
+    </w:p>
+    <w:p>
+      <w:r>
+        <w:t>Text after the map / link to Section 5</w:t>
+      </w:r>
+    </w:p>
+    <w:p>
+      <w:r>
+        <w:t>The map reveals geographic differences in participation rates, but state-level patterns do not tell us how individual parks are distributed or how frequently they are visited. To explore the destination side of outdoor recreation, we zoom into the Northern Territory as a case study.</w:t>
+      </w:r>
+    </w:p>
+    <w:p>
+      <w:pPr>
+        <w:rPr>
+          <w:b/>
+          <w:bCs/>
+        </w:rPr>
+      </w:pPr>
+      <w:r>
+        <w:rPr>
+          <w:b/>
+          <w:bCs/>
+        </w:rPr>
+        <w:t>How to justify choosing the NT</w:t>
+      </w:r>
+    </w:p>
+    <w:p>
+      <w:r>
+        <w:lastRenderedPageBreak/>
+        <w:t>I recommend a short explanatory note between the choropleth and the NT maps:</w:t>
+      </w:r>
+    </w:p>
+    <w:p>
+      <w:r>
+        <w:t>In our selected participation measure, the ACT and Tasmania rank among the highest-ranking jurisdictions, while the Northern Territory ranks third. Although the ACT and Tasmania provide important examples of high participation, the NT offers a geographically extensive case study for examining the distribution of parks and reported visitation. This zoom-in allows us to investigate outdoor recreation destinations at a more detailed spatial scale.</w:t>
+      </w:r>
+    </w:p>
+    <w:p>
+      <w:r>
+        <w:t>Use this only if your actual participation measure supports that ranking. If the differences are small or estimates are uncertain, describe the NT as one of the higher-ranking jurisdictions rather than asserting a meaningful difference.</w:t>
+      </w:r>
+    </w:p>
+    <w:p>
+      <w:r>
+        <w:t>Also, the NT's larger size is a reason for selecting a different geographic case study, not evidence that it has more recreation or better access to parks.</w:t>
+      </w:r>
+    </w:p>
+    <w:p>
+      <w:pPr>
+        <w:rPr>
+          <w:b/>
+          <w:bCs/>
+        </w:rPr>
+      </w:pPr>
+      <w:r>
+        <w:rPr>
+          <w:b/>
+          <w:bCs/>
+        </w:rPr>
+        <w:t>Section 5 — Zooming In: The Northern Territory's Park Landscape</w:t>
+      </w:r>
+    </w:p>
+    <w:p>
+      <w:r>
+        <w:t>Purpose: Explore the geographic distribution of park destinations and the reported visitation of NT Government-managed parks.</w:t>
+      </w:r>
+    </w:p>
+    <w:p>
+      <w:r>
+        <w:t>Section introduction</w:t>
+      </w:r>
+    </w:p>
+    <w:p>
+      <w:r>
+        <w:t>State-level participation patterns provide a broad geographic overview, but they cannot show the distribution of individual recreation destinations. The Northern Territory offers an opportunity to examine this destination landscape in more detail, including parks managed by both the NT Government and the Commonwealth.</w:t>
+      </w:r>
+    </w:p>
+    <w:p>
+      <w:pPr>
+        <w:rPr>
+          <w:b/>
+          <w:bCs/>
+        </w:rPr>
+      </w:pPr>
+      <w:r>
+        <w:rPr>
+          <w:b/>
+          <w:bCs/>
+        </w:rPr>
+        <w:t>Chart 10. Dot map — Distribution of parks across the NT</w:t>
+      </w:r>
+    </w:p>
+    <w:p>
+      <w:r>
+        <w:t>Text before the map</w:t>
+      </w:r>
+    </w:p>
+    <w:p>
+      <w:r>
+        <w:t>Where are the NT's parks located, and which authorities manage them? This map shows the distribution of selected parks and reserves, distinguishing NT Government-managed sites from Commonwealth-managed Kakadu and Uluṟu-Kata Tjuṯa National Parks.</w:t>
+      </w:r>
+    </w:p>
+    <w:p>
+      <w:r>
+        <w:t>Text after the map / link to Chart 11</w:t>
+      </w:r>
+    </w:p>
+    <w:p>
+      <w:r>
+        <w:lastRenderedPageBreak/>
+        <w:t>The dot map establishes the geographic distribution of the parks, but location alone does not reveal differences in visitation. We next focus on the NT Government-managed parks for which comparable visitor estimates are available.</w:t>
+      </w:r>
+    </w:p>
+    <w:p>
+      <w:pPr>
+        <w:rPr>
+          <w:b/>
+          <w:bCs/>
+        </w:rPr>
+      </w:pPr>
+      <w:r>
+        <w:rPr>
+          <w:b/>
+          <w:bCs/>
+        </w:rPr>
+        <w:t>Chart 11. Proportional symbol map — Top 11 NT Government-managed parks by visitation</w:t>
+      </w:r>
+    </w:p>
+    <w:p>
+      <w:r>
+        <w:t>Text before the map</w:t>
+      </w:r>
+    </w:p>
+    <w:p>
+      <w:r>
+        <w:t>Which NT Government-managed parks record the highest estimated visitation? Proportional symbols highlight differences in reported visitor numbers, allowing readers to compare the relative scale of visitation across the selected destinations.</w:t>
+      </w:r>
+    </w:p>
+    <w:p>
+      <w:r>
+        <w:t>Text after the map / link to Section 6</w:t>
+      </w:r>
+    </w:p>
+    <w:p>
+      <w:r>
+        <w:t>The two maps reveal where parks are located and which selected NT Government-managed destinations record the most visits. However, park visitation and population participation measure different things. To complete the wider picture, we return to the social and economic context surrounding recreation.</w:t>
+      </w:r>
+    </w:p>
+    <w:p>
+      <w:r>
+        <w:t>Essential caption for this map</w:t>
+      </w:r>
+    </w:p>
+    <w:p>
+      <w:r>
+        <w:t>Visitor estimates cover the reporting period specified by the NT Government. The ranking includes only parks and reserves with comparable reported visitation data; it should not be interpreted as a ranking of every park in the Northern Territory.</w:t>
+      </w:r>
+    </w:p>
+    <w:p>
+      <w:r>
+        <w:t>Keep Kakadu and Uluṟu-Kata Tjuṯa on the distribution map, but do not include their Commonwealth-reported visitor counts in the NT Government top-11 ranking unless you have obtained figures for a comparable period and clearly explain the differences in counting methods.</w:t>
+      </w:r>
+    </w:p>
+    <w:p>
+      <w:pPr>
+        <w:rPr>
+          <w:b/>
+          <w:bCs/>
+        </w:rPr>
+      </w:pPr>
+      <w:r>
+        <w:rPr>
+          <w:b/>
+          <w:bCs/>
+        </w:rPr>
+        <w:t>Section 6 — Beyond Participation: Social and Economic Context</w:t>
+      </w:r>
+    </w:p>
+    <w:p>
+      <w:r>
+        <w:t>Purpose: Close by returning to individual participation patterns and placing recreation in a broader economic context.</w:t>
+      </w:r>
+    </w:p>
+    <w:p>
+      <w:r>
+        <w:t>Section introduction</w:t>
+      </w:r>
+    </w:p>
+    <w:p>
+      <w:r>
+        <w:t>The preceding sections examined participation patterns, demographic differences, activity settings and recreation destinations. We now consider two broader dimensions: how participation is associated with employment status and how sport and recreation tourism contributes to the wider economy.</w:t>
+      </w:r>
+    </w:p>
+    <w:p>
+      <w:pPr>
+        <w:rPr>
+          <w:b/>
+          <w:bCs/>
+        </w:rPr>
+      </w:pPr>
+      <w:r>
+        <w:rPr>
+          <w:b/>
+          <w:bCs/>
+        </w:rPr>
+        <w:lastRenderedPageBreak/>
+        <w:t>Chart 12. Mosaic chart — Participation activeness by employment status</w:t>
+      </w:r>
+    </w:p>
+    <w:p>
+      <w:r>
+        <w:t>Text before the chart</w:t>
+      </w:r>
+    </w:p>
+    <w:p>
+      <w:r>
+        <w:t>Participation may differ across employment groups because people have different schedules, circumstances and opportunities. This mosaic chart examines the association between employment status and participation activeness, providing a final demographic perspective on the participation patterns explored throughout the analysis.</w:t>
+      </w:r>
+    </w:p>
+    <w:p>
+      <w:r>
+        <w:t>Text after the chart / link to Chart 13</w:t>
+      </w:r>
+    </w:p>
+    <w:p>
+      <w:r>
+        <w:t>Employment status provides one perspective on how participation varies across groups, but the story extends beyond individual participation. Sport and recreation tourism also represents a broader economic context in which recreational activities take place.</w:t>
+      </w:r>
+    </w:p>
+    <w:p>
+      <w:r>
+        <w:t>Avoid claiming that employment status causes participation differences. A mosaic chart can show an association, not establish why it occurs.</w:t>
+      </w:r>
+    </w:p>
+    <w:p>
+      <w:pPr>
+        <w:rPr>
+          <w:b/>
+          <w:bCs/>
+        </w:rPr>
+      </w:pPr>
+      <w:r>
+        <w:rPr>
+          <w:b/>
+          <w:bCs/>
+        </w:rPr>
+        <w:t>Chart 13. Area chart — Sport and recreation tourism output</w:t>
+      </w:r>
+    </w:p>
+    <w:p>
+      <w:r>
+        <w:t>Text before the chart</w:t>
+      </w:r>
+    </w:p>
+    <w:p>
+      <w:r>
+        <w:t>Beyond individual participation and destination visitation, sport and recreation tourism output provides an economic perspective on the broader recreation landscape. This chart shows how the reported output changes over time, adding context to the significance of sport and recreation-related activity.</w:t>
+      </w:r>
+    </w:p>
+    <w:p>
+      <w:r>
+        <w:t>Final closing statement</w:t>
+      </w:r>
+    </w:p>
+    <w:p>
+      <w:r>
+        <w:t>Overall, outdoor recreation participation in Australia can be understood through several connected dimensions: how widespread participation is, which activities people choose, how participation differs across demographic groups, where activities take place, and how recreation destinations are distributed. The Northern Territory case study adds a destination-level perspective, while the employment and tourism charts provide broader context. Together, these views offer a more complete picture of Australia's recreation landscape, while recognising that participation surveys, park visitation and tourism output measure different aspects of that landscape.</w:t>
+      </w:r>
+    </w:p>
+    <w:p/>
+    <w:p>
+      <w:pPr>
+        <w:rPr>
+          <w:lang w:val="af-ZA"/>
+        </w:rPr>
+      </w:pPr>
+      <w:hyperlink r:id="rId19" w:history="1">
+        <w:r>
+          <w:rPr>
+            <w:rStyle w:val="Hyperlink"/>
+            <w:lang w:val="af-ZA"/>
+          </w:rPr>
+          <w:t>https://www.dcceew.gov.au/sites/default/files/documents/dnp-annual-report-2024-25.pdf</w:t>
+        </w:r>
+      </w:hyperlink>
+      <w:r>
+        <w:rPr>
+          <w:lang w:val="af-ZA"/>
+        </w:rPr>
+        <w:t xml:space="preserve"> (Table 9)</w:t>
+      </w:r>
+    </w:p>
+    <w:p>
+      <w:pPr>
+        <w:rPr>
+          <w:lang w:val="af-ZA"/>
+        </w:rPr>
+      </w:pPr>
+      <w:hyperlink r:id="rId20" w:history="1">
+        <w:r>
+          <w:rPr>
+            <w:rStyle w:val="Hyperlink"/>
+            <w:lang w:val="af-ZA"/>
+          </w:rPr>
+          <w:t>https://dth.nt.gov.au/parks-and-wildlife/parks-and-wildlife-statistics-and-research/park-visitor-data</w:t>
+        </w:r>
+      </w:hyperlink>
+      <w:r>
+        <w:rPr>
+          <w:lang w:val="af-ZA"/>
+        </w:rPr>
+        <w:t xml:space="preserve"> </w:t>
+      </w:r>
+    </w:p>
     <w:p>
       <w:pPr>
         <w:rPr>
@@ -11368,7 +11628,6 @@
   <w:style w:type="character" w:default="1" w:styleId="DefaultParagraphFont">
     <w:name w:val="Default Paragraph Font"/>
     <w:uiPriority w:val="1"/>
-    <w:semiHidden/>
     <w:unhideWhenUsed/>
   </w:style>
   <w:style w:type="table" w:default="1" w:styleId="TableNormal">

</xml_diff>